<commit_message>
feat: Add Detailed Utilisation Report (DUR) functionality
- Introduced new DUR tab in the Annual Account Review component with associated data structures and API endpoints.
- Implemented loading, approval, and return functionalities for DUR submissions.
- Enhanced the ULB submissions service to handle DUR-specific queries and bulk reviews.
- Updated the UI components to support DUR document uploads and status displays.
- Added new templates for DUR reporting, including financial summaries and project details.
- Improved error handling and user notifications for DUR-related actions.
</commit_message>
<xml_diff>
--- a/src/assets/files/revised-Annexure-VI_Tied_Grant_DUR_Template.docx
+++ b/src/assets/files/revised-Annexure-VI_Tied_Grant_DUR_Template.docx
@@ -2,21 +2,6 @@
 <file path=word/document.xml><?xml version="1.0" encoding="utf-8"?>
 <w:document xmlns:wpc="http://schemas.microsoft.com/office/word/2010/wordprocessingCanvas" xmlns:cx="http://schemas.microsoft.com/office/drawing/2014/chartex" xmlns:cx1="http://schemas.microsoft.com/office/drawing/2015/9/8/chartex" xmlns:cx2="http://schemas.microsoft.com/office/drawing/2015/10/21/chartex" xmlns:cx3="http://schemas.microsoft.com/office/drawing/2016/5/9/chartex" xmlns:cx4="http://schemas.microsoft.com/office/drawing/2016/5/10/chartex" xmlns:cx5="http://schemas.microsoft.com/office/drawing/2016/5/11/chartex" xmlns:cx6="http://schemas.microsoft.com/office/drawing/2016/5/12/chartex" xmlns:cx7="http://schemas.microsoft.com/office/drawing/2016/5/13/chartex" xmlns:cx8="http://schemas.microsoft.com/office/drawing/2016/5/14/chartex" xmlns:mc="http://schemas.openxmlformats.org/markup-compatibility/2006" xmlns:m="http://schemas.openxmlformats.org/officeDocument/2006/math" xmlns:aink="http://schemas.microsoft.com/office/drawing/2016/ink" xmlns:am3d="http://schemas.microsoft.com/office/drawing/2017/model3d" xmlns:oel="http://schemas.microsoft.com/office/2019/extlst" xmlns:r="http://schemas.openxmlformats.org/officeDocument/2006/relationships" xmlns:wp14="http://schemas.microsoft.com/office/word/2010/wordprocessingDrawing" xmlns:wp="http://schemas.openxmlformats.org/drawingml/2006/wordprocessingDrawing" xmlns:wpg="http://schemas.microsoft.com/office/word/2010/wordprocessingGroup" xmlns:wpi="http://schemas.microsoft.com/office/word/2010/wordprocessingInk" xmlns:wps="http://schemas.microsoft.com/office/word/2010/wordprocessingShape" xmlns:o="urn:schemas-microsoft-com:office:office" xmlns:v="urn:schemas-microsoft-com:vml" xmlns:w10="urn:schemas-microsoft-com:office:word" xmlns:w="http://schemas.openxmlformats.org/wordprocessingml/2006/main" xmlns:w14="http://schemas.microsoft.com/office/word/2010/wordml" xmlns:w15="http://schemas.microsoft.com/office/word/2012/wordml" xmlns:w16cex="http://schemas.microsoft.com/office/word/2018/wordml/cex" xmlns:w16cid="http://schemas.microsoft.com/office/word/2016/wordml/cid" xmlns:w16="http://schemas.microsoft.com/office/word/2018/wordml" xmlns:w16sdtdh="http://schemas.microsoft.com/office/word/2020/wordml/sdtdatahash" xmlns:w16sdtfl="http://schemas.microsoft.com/office/word/2024/wordml/sdtformatlock" xmlns:w16se="http://schemas.microsoft.com/office/word/2015/wordml/symex" xmlns:w16du="http://schemas.microsoft.com/office/word/2023/wordml/word16du" xmlns:wne="http://schemas.microsoft.com/office/word/2006/wordml" mc:Ignorable="w14 w15 w16se w16cid w16 w16cex w16sdtdh w16sdtfl w16du wp14">
   <w:body>
-    <w:p>
-      <w:pPr>
-        <w:spacing w:after="160"/>
-        <w:jc w:val="right"/>
-      </w:pPr>
-      <w:r>
-        <w:rPr>
-          <w:b/>
-          <w:bCs/>
-          <w:sz w:val="24"/>
-          <w:szCs w:val="24"/>
-        </w:rPr>
-        <w:t>Annexure-VI</w:t>
-      </w:r>
-    </w:p>
     <w:p>
       <w:pPr>
         <w:spacing w:after="240"/>
@@ -43,6 +28,15 @@
           <w:szCs w:val="24"/>
         </w:rPr>
         <w:br/>
+      </w:r>
+      <w:r>
+        <w:rPr>
+          <w:b/>
+          <w:bCs/>
+          <w:color w:val="000000" w:themeColor="text1"/>
+          <w:sz w:val="24"/>
+          <w:szCs w:val="24"/>
+        </w:rPr>
         <w:t>DUR for tied grants received in FY 2025-26 - the final year of the 15th Finance Commission award period</w:t>
       </w:r>
     </w:p>
@@ -50,12 +44,12 @@
       <w:tblPr>
         <w:tblW w:w="10466" w:type="dxa"/>
         <w:tblBorders>
-          <w:top w:val="single" w:sz="4" w:space="0" w:color="auto"/>
-          <w:left w:val="single" w:sz="4" w:space="0" w:color="auto"/>
-          <w:bottom w:val="single" w:sz="4" w:space="0" w:color="auto"/>
-          <w:right w:val="single" w:sz="4" w:space="0" w:color="auto"/>
-          <w:insideH w:val="single" w:sz="4" w:space="0" w:color="auto"/>
-          <w:insideV w:val="single" w:sz="4" w:space="0" w:color="auto"/>
+          <w:top w:val="single" w:color="auto" w:sz="4" w:space="0"/>
+          <w:left w:val="single" w:color="auto" w:sz="4" w:space="0"/>
+          <w:bottom w:val="single" w:color="auto" w:sz="4" w:space="0"/>
+          <w:right w:val="single" w:color="auto" w:sz="4" w:space="0"/>
+          <w:insideH w:val="single" w:color="auto" w:sz="4" w:space="0"/>
+          <w:insideV w:val="single" w:color="auto" w:sz="4" w:space="0"/>
         </w:tblBorders>
         <w:tblLayout w:type="fixed"/>
         <w:tblCellMar>
@@ -99,7 +93,7 @@
           <w:tcPr>
             <w:tcW w:w="8266" w:type="dxa"/>
             <w:tcBorders>
-              <w:bottom w:val="single" w:sz="4" w:space="0" w:color="000000"/>
+              <w:bottom w:val="single" w:color="000000" w:sz="4" w:space="0"/>
             </w:tcBorders>
             <w:tcMar>
               <w:top w:w="40" w:type="dxa"/>
@@ -121,12 +115,12 @@
       <w:tblPr>
         <w:tblW w:w="10466" w:type="dxa"/>
         <w:tblBorders>
-          <w:top w:val="single" w:sz="4" w:space="0" w:color="auto"/>
-          <w:left w:val="single" w:sz="4" w:space="0" w:color="auto"/>
-          <w:bottom w:val="single" w:sz="4" w:space="0" w:color="auto"/>
-          <w:right w:val="single" w:sz="4" w:space="0" w:color="auto"/>
-          <w:insideH w:val="single" w:sz="4" w:space="0" w:color="auto"/>
-          <w:insideV w:val="single" w:sz="4" w:space="0" w:color="auto"/>
+          <w:top w:val="single" w:color="auto" w:sz="4" w:space="0"/>
+          <w:left w:val="single" w:color="auto" w:sz="4" w:space="0"/>
+          <w:bottom w:val="single" w:color="auto" w:sz="4" w:space="0"/>
+          <w:right w:val="single" w:color="auto" w:sz="4" w:space="0"/>
+          <w:insideH w:val="single" w:color="auto" w:sz="4" w:space="0"/>
+          <w:insideV w:val="single" w:color="auto" w:sz="4" w:space="0"/>
         </w:tblBorders>
         <w:tblLayout w:type="fixed"/>
         <w:tblCellMar>
@@ -170,7 +164,7 @@
           <w:tcPr>
             <w:tcW w:w="8266" w:type="dxa"/>
             <w:tcBorders>
-              <w:bottom w:val="single" w:sz="4" w:space="0" w:color="000000"/>
+              <w:bottom w:val="single" w:color="000000" w:sz="4" w:space="0"/>
             </w:tcBorders>
             <w:tcMar>
               <w:top w:w="40" w:type="dxa"/>
@@ -207,12 +201,12 @@
       <w:tblPr>
         <w:tblW w:w="10466" w:type="dxa"/>
         <w:tblBorders>
-          <w:top w:val="single" w:sz="4" w:space="0" w:color="auto"/>
-          <w:left w:val="single" w:sz="4" w:space="0" w:color="auto"/>
-          <w:bottom w:val="single" w:sz="4" w:space="0" w:color="auto"/>
-          <w:right w:val="single" w:sz="4" w:space="0" w:color="auto"/>
-          <w:insideH w:val="single" w:sz="4" w:space="0" w:color="auto"/>
-          <w:insideV w:val="single" w:sz="4" w:space="0" w:color="auto"/>
+          <w:top w:val="single" w:color="auto" w:sz="4" w:space="0"/>
+          <w:left w:val="single" w:color="auto" w:sz="4" w:space="0"/>
+          <w:bottom w:val="single" w:color="auto" w:sz="4" w:space="0"/>
+          <w:right w:val="single" w:color="auto" w:sz="4" w:space="0"/>
+          <w:insideH w:val="single" w:color="auto" w:sz="4" w:space="0"/>
+          <w:insideV w:val="single" w:color="auto" w:sz="4" w:space="0"/>
         </w:tblBorders>
         <w:tblLayout w:type="fixed"/>
         <w:tblCellMar>
@@ -242,10 +236,10 @@
           <w:tcPr>
             <w:tcW w:w="700" w:type="dxa"/>
             <w:tcBorders>
-              <w:top w:val="single" w:sz="4" w:space="0" w:color="808080"/>
-              <w:left w:val="single" w:sz="4" w:space="0" w:color="808080"/>
-              <w:bottom w:val="single" w:sz="4" w:space="0" w:color="808080"/>
-              <w:right w:val="single" w:sz="4" w:space="0" w:color="808080"/>
+              <w:top w:val="single" w:color="808080" w:themeColor="background1" w:themeShade="80" w:sz="4" w:space="0"/>
+              <w:left w:val="single" w:color="808080" w:themeColor="background1" w:themeShade="80" w:sz="4" w:space="0"/>
+              <w:bottom w:val="single" w:color="808080" w:themeColor="background1" w:themeShade="80" w:sz="4" w:space="0"/>
+              <w:right w:val="single" w:color="808080" w:themeColor="background1" w:themeShade="80" w:sz="4" w:space="0"/>
             </w:tcBorders>
             <w:shd w:val="clear" w:color="auto" w:fill="DDEBF7"/>
             <w:tcMar>
@@ -275,10 +269,10 @@
           <w:tcPr>
             <w:tcW w:w="3800" w:type="dxa"/>
             <w:tcBorders>
-              <w:top w:val="single" w:sz="4" w:space="0" w:color="808080"/>
-              <w:left w:val="single" w:sz="4" w:space="0" w:color="808080"/>
-              <w:bottom w:val="single" w:sz="4" w:space="0" w:color="808080"/>
-              <w:right w:val="single" w:sz="4" w:space="0" w:color="808080"/>
+              <w:top w:val="single" w:color="808080" w:themeColor="background1" w:themeShade="80" w:sz="4" w:space="0"/>
+              <w:left w:val="single" w:color="808080" w:themeColor="background1" w:themeShade="80" w:sz="4" w:space="0"/>
+              <w:bottom w:val="single" w:color="808080" w:themeColor="background1" w:themeShade="80" w:sz="4" w:space="0"/>
+              <w:right w:val="single" w:color="808080" w:themeColor="background1" w:themeShade="80" w:sz="4" w:space="0"/>
             </w:tcBorders>
             <w:shd w:val="clear" w:color="auto" w:fill="DDEBF7"/>
             <w:tcMar>
@@ -305,10 +299,10 @@
           <w:tcPr>
             <w:tcW w:w="2000" w:type="dxa"/>
             <w:tcBorders>
-              <w:top w:val="single" w:sz="4" w:space="0" w:color="808080"/>
-              <w:left w:val="single" w:sz="4" w:space="0" w:color="808080"/>
-              <w:bottom w:val="single" w:sz="4" w:space="0" w:color="808080"/>
-              <w:right w:val="single" w:sz="4" w:space="0" w:color="808080"/>
+              <w:top w:val="single" w:color="808080" w:themeColor="background1" w:themeShade="80" w:sz="4" w:space="0"/>
+              <w:left w:val="single" w:color="808080" w:themeColor="background1" w:themeShade="80" w:sz="4" w:space="0"/>
+              <w:bottom w:val="single" w:color="808080" w:themeColor="background1" w:themeShade="80" w:sz="4" w:space="0"/>
+              <w:right w:val="single" w:color="808080" w:themeColor="background1" w:themeShade="80" w:sz="4" w:space="0"/>
             </w:tcBorders>
             <w:shd w:val="clear" w:color="auto" w:fill="DDEBF7"/>
             <w:tcMar>
@@ -338,10 +332,10 @@
           <w:tcPr>
             <w:tcW w:w="1900" w:type="dxa"/>
             <w:tcBorders>
-              <w:top w:val="single" w:sz="4" w:space="0" w:color="808080"/>
-              <w:left w:val="single" w:sz="4" w:space="0" w:color="808080"/>
-              <w:bottom w:val="single" w:sz="4" w:space="0" w:color="808080"/>
-              <w:right w:val="single" w:sz="4" w:space="0" w:color="808080"/>
+              <w:top w:val="single" w:color="808080" w:themeColor="background1" w:themeShade="80" w:sz="4" w:space="0"/>
+              <w:left w:val="single" w:color="808080" w:themeColor="background1" w:themeShade="80" w:sz="4" w:space="0"/>
+              <w:bottom w:val="single" w:color="808080" w:themeColor="background1" w:themeShade="80" w:sz="4" w:space="0"/>
+              <w:right w:val="single" w:color="808080" w:themeColor="background1" w:themeShade="80" w:sz="4" w:space="0"/>
             </w:tcBorders>
             <w:shd w:val="clear" w:color="auto" w:fill="DDEBF7"/>
             <w:tcMar>
@@ -371,10 +365,10 @@
           <w:tcPr>
             <w:tcW w:w="2066" w:type="dxa"/>
             <w:tcBorders>
-              <w:top w:val="single" w:sz="4" w:space="0" w:color="808080"/>
-              <w:left w:val="single" w:sz="4" w:space="0" w:color="808080"/>
-              <w:bottom w:val="single" w:sz="4" w:space="0" w:color="808080"/>
-              <w:right w:val="single" w:sz="4" w:space="0" w:color="808080"/>
+              <w:top w:val="single" w:color="808080" w:themeColor="background1" w:themeShade="80" w:sz="4" w:space="0"/>
+              <w:left w:val="single" w:color="808080" w:themeColor="background1" w:themeShade="80" w:sz="4" w:space="0"/>
+              <w:bottom w:val="single" w:color="808080" w:themeColor="background1" w:themeShade="80" w:sz="4" w:space="0"/>
+              <w:right w:val="single" w:color="808080" w:themeColor="background1" w:themeShade="80" w:sz="4" w:space="0"/>
             </w:tcBorders>
             <w:shd w:val="clear" w:color="auto" w:fill="DDEBF7"/>
             <w:tcMar>
@@ -412,10 +406,10 @@
           <w:tcPr>
             <w:tcW w:w="700" w:type="dxa"/>
             <w:tcBorders>
-              <w:top w:val="single" w:sz="4" w:space="0" w:color="808080"/>
-              <w:left w:val="single" w:sz="4" w:space="0" w:color="808080"/>
-              <w:bottom w:val="single" w:sz="4" w:space="0" w:color="808080"/>
-              <w:right w:val="single" w:sz="4" w:space="0" w:color="808080"/>
+              <w:top w:val="single" w:color="808080" w:themeColor="background1" w:themeShade="80" w:sz="4" w:space="0"/>
+              <w:left w:val="single" w:color="808080" w:themeColor="background1" w:themeShade="80" w:sz="4" w:space="0"/>
+              <w:bottom w:val="single" w:color="808080" w:themeColor="background1" w:themeShade="80" w:sz="4" w:space="0"/>
+              <w:right w:val="single" w:color="808080" w:themeColor="background1" w:themeShade="80" w:sz="4" w:space="0"/>
             </w:tcBorders>
             <w:tcMar>
               <w:top w:w="60" w:type="dxa"/>
@@ -442,10 +436,10 @@
           <w:tcPr>
             <w:tcW w:w="3800" w:type="dxa"/>
             <w:tcBorders>
-              <w:top w:val="single" w:sz="4" w:space="0" w:color="808080"/>
-              <w:left w:val="single" w:sz="4" w:space="0" w:color="808080"/>
-              <w:bottom w:val="single" w:sz="4" w:space="0" w:color="808080"/>
-              <w:right w:val="single" w:sz="4" w:space="0" w:color="808080"/>
+              <w:top w:val="single" w:color="808080" w:themeColor="background1" w:themeShade="80" w:sz="4" w:space="0"/>
+              <w:left w:val="single" w:color="808080" w:themeColor="background1" w:themeShade="80" w:sz="4" w:space="0"/>
+              <w:bottom w:val="single" w:color="808080" w:themeColor="background1" w:themeShade="80" w:sz="4" w:space="0"/>
+              <w:right w:val="single" w:color="808080" w:themeColor="background1" w:themeShade="80" w:sz="4" w:space="0"/>
             </w:tcBorders>
             <w:tcMar>
               <w:top w:w="60" w:type="dxa"/>
@@ -485,10 +479,10 @@
           <w:tcPr>
             <w:tcW w:w="2000" w:type="dxa"/>
             <w:tcBorders>
-              <w:top w:val="single" w:sz="4" w:space="0" w:color="808080"/>
-              <w:left w:val="single" w:sz="4" w:space="0" w:color="808080"/>
-              <w:bottom w:val="single" w:sz="4" w:space="0" w:color="808080"/>
-              <w:right w:val="single" w:sz="4" w:space="0" w:color="808080"/>
+              <w:top w:val="single" w:color="808080" w:themeColor="background1" w:themeShade="80" w:sz="4" w:space="0"/>
+              <w:left w:val="single" w:color="808080" w:themeColor="background1" w:themeShade="80" w:sz="4" w:space="0"/>
+              <w:bottom w:val="single" w:color="808080" w:themeColor="background1" w:themeShade="80" w:sz="4" w:space="0"/>
+              <w:right w:val="single" w:color="808080" w:themeColor="background1" w:themeShade="80" w:sz="4" w:space="0"/>
             </w:tcBorders>
             <w:tcMar>
               <w:top w:w="60" w:type="dxa"/>
@@ -508,10 +502,10 @@
           <w:tcPr>
             <w:tcW w:w="1900" w:type="dxa"/>
             <w:tcBorders>
-              <w:top w:val="single" w:sz="4" w:space="0" w:color="808080"/>
-              <w:left w:val="single" w:sz="4" w:space="0" w:color="808080"/>
-              <w:bottom w:val="single" w:sz="4" w:space="0" w:color="808080"/>
-              <w:right w:val="single" w:sz="4" w:space="0" w:color="808080"/>
+              <w:top w:val="single" w:color="808080" w:themeColor="background1" w:themeShade="80" w:sz="4" w:space="0"/>
+              <w:left w:val="single" w:color="808080" w:themeColor="background1" w:themeShade="80" w:sz="4" w:space="0"/>
+              <w:bottom w:val="single" w:color="808080" w:themeColor="background1" w:themeShade="80" w:sz="4" w:space="0"/>
+              <w:right w:val="single" w:color="808080" w:themeColor="background1" w:themeShade="80" w:sz="4" w:space="0"/>
             </w:tcBorders>
             <w:tcMar>
               <w:top w:w="60" w:type="dxa"/>
@@ -538,10 +532,10 @@
           <w:tcPr>
             <w:tcW w:w="2066" w:type="dxa"/>
             <w:tcBorders>
-              <w:top w:val="single" w:sz="4" w:space="0" w:color="808080"/>
-              <w:left w:val="single" w:sz="4" w:space="0" w:color="808080"/>
-              <w:bottom w:val="single" w:sz="4" w:space="0" w:color="808080"/>
-              <w:right w:val="single" w:sz="4" w:space="0" w:color="808080"/>
+              <w:top w:val="single" w:color="808080" w:themeColor="background1" w:themeShade="80" w:sz="4" w:space="0"/>
+              <w:left w:val="single" w:color="808080" w:themeColor="background1" w:themeShade="80" w:sz="4" w:space="0"/>
+              <w:bottom w:val="single" w:color="808080" w:themeColor="background1" w:themeShade="80" w:sz="4" w:space="0"/>
+              <w:right w:val="single" w:color="808080" w:themeColor="background1" w:themeShade="80" w:sz="4" w:space="0"/>
             </w:tcBorders>
             <w:tcMar>
               <w:top w:w="60" w:type="dxa"/>
@@ -576,10 +570,10 @@
           <w:tcPr>
             <w:tcW w:w="700" w:type="dxa"/>
             <w:tcBorders>
-              <w:top w:val="single" w:sz="4" w:space="0" w:color="808080"/>
-              <w:left w:val="single" w:sz="4" w:space="0" w:color="808080"/>
-              <w:bottom w:val="single" w:sz="4" w:space="0" w:color="808080"/>
-              <w:right w:val="single" w:sz="4" w:space="0" w:color="808080"/>
+              <w:top w:val="single" w:color="808080" w:themeColor="background1" w:themeShade="80" w:sz="4" w:space="0"/>
+              <w:left w:val="single" w:color="808080" w:themeColor="background1" w:themeShade="80" w:sz="4" w:space="0"/>
+              <w:bottom w:val="single" w:color="808080" w:themeColor="background1" w:themeShade="80" w:sz="4" w:space="0"/>
+              <w:right w:val="single" w:color="808080" w:themeColor="background1" w:themeShade="80" w:sz="4" w:space="0"/>
             </w:tcBorders>
             <w:tcMar>
               <w:top w:w="60" w:type="dxa"/>
@@ -606,10 +600,10 @@
           <w:tcPr>
             <w:tcW w:w="3800" w:type="dxa"/>
             <w:tcBorders>
-              <w:top w:val="single" w:sz="4" w:space="0" w:color="808080"/>
-              <w:left w:val="single" w:sz="4" w:space="0" w:color="808080"/>
-              <w:bottom w:val="single" w:sz="4" w:space="0" w:color="808080"/>
-              <w:right w:val="single" w:sz="4" w:space="0" w:color="808080"/>
+              <w:top w:val="single" w:color="808080" w:themeColor="background1" w:themeShade="80" w:sz="4" w:space="0"/>
+              <w:left w:val="single" w:color="808080" w:themeColor="background1" w:themeShade="80" w:sz="4" w:space="0"/>
+              <w:bottom w:val="single" w:color="808080" w:themeColor="background1" w:themeShade="80" w:sz="4" w:space="0"/>
+              <w:right w:val="single" w:color="808080" w:themeColor="background1" w:themeShade="80" w:sz="4" w:space="0"/>
             </w:tcBorders>
             <w:tcMar>
               <w:top w:w="60" w:type="dxa"/>
@@ -633,10 +627,10 @@
           <w:tcPr>
             <w:tcW w:w="2000" w:type="dxa"/>
             <w:tcBorders>
-              <w:top w:val="single" w:sz="4" w:space="0" w:color="808080"/>
-              <w:left w:val="single" w:sz="4" w:space="0" w:color="808080"/>
-              <w:bottom w:val="single" w:sz="4" w:space="0" w:color="808080"/>
-              <w:right w:val="single" w:sz="4" w:space="0" w:color="808080"/>
+              <w:top w:val="single" w:color="808080" w:themeColor="background1" w:themeShade="80" w:sz="4" w:space="0"/>
+              <w:left w:val="single" w:color="808080" w:themeColor="background1" w:themeShade="80" w:sz="4" w:space="0"/>
+              <w:bottom w:val="single" w:color="808080" w:themeColor="background1" w:themeShade="80" w:sz="4" w:space="0"/>
+              <w:right w:val="single" w:color="808080" w:themeColor="background1" w:themeShade="80" w:sz="4" w:space="0"/>
             </w:tcBorders>
             <w:tcMar>
               <w:top w:w="60" w:type="dxa"/>
@@ -656,10 +650,10 @@
           <w:tcPr>
             <w:tcW w:w="1900" w:type="dxa"/>
             <w:tcBorders>
-              <w:top w:val="single" w:sz="4" w:space="0" w:color="808080"/>
-              <w:left w:val="single" w:sz="4" w:space="0" w:color="808080"/>
-              <w:bottom w:val="single" w:sz="4" w:space="0" w:color="808080"/>
-              <w:right w:val="single" w:sz="4" w:space="0" w:color="808080"/>
+              <w:top w:val="single" w:color="808080" w:themeColor="background1" w:themeShade="80" w:sz="4" w:space="0"/>
+              <w:left w:val="single" w:color="808080" w:themeColor="background1" w:themeShade="80" w:sz="4" w:space="0"/>
+              <w:bottom w:val="single" w:color="808080" w:themeColor="background1" w:themeShade="80" w:sz="4" w:space="0"/>
+              <w:right w:val="single" w:color="808080" w:themeColor="background1" w:themeShade="80" w:sz="4" w:space="0"/>
             </w:tcBorders>
             <w:tcMar>
               <w:top w:w="60" w:type="dxa"/>
@@ -686,10 +680,10 @@
           <w:tcPr>
             <w:tcW w:w="2066" w:type="dxa"/>
             <w:tcBorders>
-              <w:top w:val="single" w:sz="4" w:space="0" w:color="808080"/>
-              <w:left w:val="single" w:sz="4" w:space="0" w:color="808080"/>
-              <w:bottom w:val="single" w:sz="4" w:space="0" w:color="808080"/>
-              <w:right w:val="single" w:sz="4" w:space="0" w:color="808080"/>
+              <w:top w:val="single" w:color="808080" w:themeColor="background1" w:themeShade="80" w:sz="4" w:space="0"/>
+              <w:left w:val="single" w:color="808080" w:themeColor="background1" w:themeShade="80" w:sz="4" w:space="0"/>
+              <w:bottom w:val="single" w:color="808080" w:themeColor="background1" w:themeShade="80" w:sz="4" w:space="0"/>
+              <w:right w:val="single" w:color="808080" w:themeColor="background1" w:themeShade="80" w:sz="4" w:space="0"/>
             </w:tcBorders>
             <w:tcMar>
               <w:top w:w="60" w:type="dxa"/>
@@ -724,10 +718,10 @@
           <w:tcPr>
             <w:tcW w:w="700" w:type="dxa"/>
             <w:tcBorders>
-              <w:top w:val="single" w:sz="4" w:space="0" w:color="808080"/>
-              <w:left w:val="single" w:sz="4" w:space="0" w:color="808080"/>
-              <w:bottom w:val="single" w:sz="4" w:space="0" w:color="808080"/>
-              <w:right w:val="single" w:sz="4" w:space="0" w:color="808080"/>
+              <w:top w:val="single" w:color="808080" w:themeColor="background1" w:themeShade="80" w:sz="4" w:space="0"/>
+              <w:left w:val="single" w:color="808080" w:themeColor="background1" w:themeShade="80" w:sz="4" w:space="0"/>
+              <w:bottom w:val="single" w:color="808080" w:themeColor="background1" w:themeShade="80" w:sz="4" w:space="0"/>
+              <w:right w:val="single" w:color="808080" w:themeColor="background1" w:themeShade="80" w:sz="4" w:space="0"/>
             </w:tcBorders>
             <w:tcMar>
               <w:top w:w="60" w:type="dxa"/>
@@ -754,10 +748,10 @@
           <w:tcPr>
             <w:tcW w:w="3800" w:type="dxa"/>
             <w:tcBorders>
-              <w:top w:val="single" w:sz="4" w:space="0" w:color="808080"/>
-              <w:left w:val="single" w:sz="4" w:space="0" w:color="808080"/>
-              <w:bottom w:val="single" w:sz="4" w:space="0" w:color="808080"/>
-              <w:right w:val="single" w:sz="4" w:space="0" w:color="808080"/>
+              <w:top w:val="single" w:color="808080" w:themeColor="background1" w:themeShade="80" w:sz="4" w:space="0"/>
+              <w:left w:val="single" w:color="808080" w:themeColor="background1" w:themeShade="80" w:sz="4" w:space="0"/>
+              <w:bottom w:val="single" w:color="808080" w:themeColor="background1" w:themeShade="80" w:sz="4" w:space="0"/>
+              <w:right w:val="single" w:color="808080" w:themeColor="background1" w:themeShade="80" w:sz="4" w:space="0"/>
             </w:tcBorders>
             <w:tcMar>
               <w:top w:w="60" w:type="dxa"/>
@@ -781,10 +775,10 @@
           <w:tcPr>
             <w:tcW w:w="2000" w:type="dxa"/>
             <w:tcBorders>
-              <w:top w:val="single" w:sz="4" w:space="0" w:color="808080"/>
-              <w:left w:val="single" w:sz="4" w:space="0" w:color="808080"/>
-              <w:bottom w:val="single" w:sz="4" w:space="0" w:color="808080"/>
-              <w:right w:val="single" w:sz="4" w:space="0" w:color="808080"/>
+              <w:top w:val="single" w:color="808080" w:themeColor="background1" w:themeShade="80" w:sz="4" w:space="0"/>
+              <w:left w:val="single" w:color="808080" w:themeColor="background1" w:themeShade="80" w:sz="4" w:space="0"/>
+              <w:bottom w:val="single" w:color="808080" w:themeColor="background1" w:themeShade="80" w:sz="4" w:space="0"/>
+              <w:right w:val="single" w:color="808080" w:themeColor="background1" w:themeShade="80" w:sz="4" w:space="0"/>
             </w:tcBorders>
             <w:tcMar>
               <w:top w:w="60" w:type="dxa"/>
@@ -804,10 +798,10 @@
           <w:tcPr>
             <w:tcW w:w="1900" w:type="dxa"/>
             <w:tcBorders>
-              <w:top w:val="single" w:sz="4" w:space="0" w:color="808080"/>
-              <w:left w:val="single" w:sz="4" w:space="0" w:color="808080"/>
-              <w:bottom w:val="single" w:sz="4" w:space="0" w:color="808080"/>
-              <w:right w:val="single" w:sz="4" w:space="0" w:color="808080"/>
+              <w:top w:val="single" w:color="808080" w:themeColor="background1" w:themeShade="80" w:sz="4" w:space="0"/>
+              <w:left w:val="single" w:color="808080" w:themeColor="background1" w:themeShade="80" w:sz="4" w:space="0"/>
+              <w:bottom w:val="single" w:color="808080" w:themeColor="background1" w:themeShade="80" w:sz="4" w:space="0"/>
+              <w:right w:val="single" w:color="808080" w:themeColor="background1" w:themeShade="80" w:sz="4" w:space="0"/>
             </w:tcBorders>
             <w:tcMar>
               <w:top w:w="60" w:type="dxa"/>
@@ -834,10 +828,10 @@
           <w:tcPr>
             <w:tcW w:w="2066" w:type="dxa"/>
             <w:tcBorders>
-              <w:top w:val="single" w:sz="4" w:space="0" w:color="808080"/>
-              <w:left w:val="single" w:sz="4" w:space="0" w:color="808080"/>
-              <w:bottom w:val="single" w:sz="4" w:space="0" w:color="808080"/>
-              <w:right w:val="single" w:sz="4" w:space="0" w:color="808080"/>
+              <w:top w:val="single" w:color="808080" w:themeColor="background1" w:themeShade="80" w:sz="4" w:space="0"/>
+              <w:left w:val="single" w:color="808080" w:themeColor="background1" w:themeShade="80" w:sz="4" w:space="0"/>
+              <w:bottom w:val="single" w:color="808080" w:themeColor="background1" w:themeShade="80" w:sz="4" w:space="0"/>
+              <w:right w:val="single" w:color="808080" w:themeColor="background1" w:themeShade="80" w:sz="4" w:space="0"/>
             </w:tcBorders>
             <w:tcMar>
               <w:top w:w="60" w:type="dxa"/>
@@ -872,10 +866,10 @@
           <w:tcPr>
             <w:tcW w:w="700" w:type="dxa"/>
             <w:tcBorders>
-              <w:top w:val="single" w:sz="4" w:space="0" w:color="808080"/>
-              <w:left w:val="single" w:sz="4" w:space="0" w:color="808080"/>
-              <w:bottom w:val="single" w:sz="4" w:space="0" w:color="808080"/>
-              <w:right w:val="single" w:sz="4" w:space="0" w:color="808080"/>
+              <w:top w:val="single" w:color="808080" w:themeColor="background1" w:themeShade="80" w:sz="4" w:space="0"/>
+              <w:left w:val="single" w:color="808080" w:themeColor="background1" w:themeShade="80" w:sz="4" w:space="0"/>
+              <w:bottom w:val="single" w:color="808080" w:themeColor="background1" w:themeShade="80" w:sz="4" w:space="0"/>
+              <w:right w:val="single" w:color="808080" w:themeColor="background1" w:themeShade="80" w:sz="4" w:space="0"/>
             </w:tcBorders>
             <w:tcMar>
               <w:top w:w="60" w:type="dxa"/>
@@ -902,10 +896,10 @@
           <w:tcPr>
             <w:tcW w:w="3800" w:type="dxa"/>
             <w:tcBorders>
-              <w:top w:val="single" w:sz="4" w:space="0" w:color="808080"/>
-              <w:left w:val="single" w:sz="4" w:space="0" w:color="808080"/>
-              <w:bottom w:val="single" w:sz="4" w:space="0" w:color="808080"/>
-              <w:right w:val="single" w:sz="4" w:space="0" w:color="808080"/>
+              <w:top w:val="single" w:color="808080" w:themeColor="background1" w:themeShade="80" w:sz="4" w:space="0"/>
+              <w:left w:val="single" w:color="808080" w:themeColor="background1" w:themeShade="80" w:sz="4" w:space="0"/>
+              <w:bottom w:val="single" w:color="808080" w:themeColor="background1" w:themeShade="80" w:sz="4" w:space="0"/>
+              <w:right w:val="single" w:color="808080" w:themeColor="background1" w:themeShade="80" w:sz="4" w:space="0"/>
             </w:tcBorders>
             <w:tcMar>
               <w:top w:w="60" w:type="dxa"/>
@@ -929,10 +923,10 @@
           <w:tcPr>
             <w:tcW w:w="2000" w:type="dxa"/>
             <w:tcBorders>
-              <w:top w:val="single" w:sz="4" w:space="0" w:color="808080"/>
-              <w:left w:val="single" w:sz="4" w:space="0" w:color="808080"/>
-              <w:bottom w:val="single" w:sz="4" w:space="0" w:color="808080"/>
-              <w:right w:val="single" w:sz="4" w:space="0" w:color="808080"/>
+              <w:top w:val="single" w:color="808080" w:themeColor="background1" w:themeShade="80" w:sz="4" w:space="0"/>
+              <w:left w:val="single" w:color="808080" w:themeColor="background1" w:themeShade="80" w:sz="4" w:space="0"/>
+              <w:bottom w:val="single" w:color="808080" w:themeColor="background1" w:themeShade="80" w:sz="4" w:space="0"/>
+              <w:right w:val="single" w:color="808080" w:themeColor="background1" w:themeShade="80" w:sz="4" w:space="0"/>
             </w:tcBorders>
             <w:tcMar>
               <w:top w:w="60" w:type="dxa"/>
@@ -952,10 +946,10 @@
           <w:tcPr>
             <w:tcW w:w="1900" w:type="dxa"/>
             <w:tcBorders>
-              <w:top w:val="single" w:sz="4" w:space="0" w:color="808080"/>
-              <w:left w:val="single" w:sz="4" w:space="0" w:color="808080"/>
-              <w:bottom w:val="single" w:sz="4" w:space="0" w:color="808080"/>
-              <w:right w:val="single" w:sz="4" w:space="0" w:color="808080"/>
+              <w:top w:val="single" w:color="808080" w:themeColor="background1" w:themeShade="80" w:sz="4" w:space="0"/>
+              <w:left w:val="single" w:color="808080" w:themeColor="background1" w:themeShade="80" w:sz="4" w:space="0"/>
+              <w:bottom w:val="single" w:color="808080" w:themeColor="background1" w:themeShade="80" w:sz="4" w:space="0"/>
+              <w:right w:val="single" w:color="808080" w:themeColor="background1" w:themeShade="80" w:sz="4" w:space="0"/>
             </w:tcBorders>
             <w:tcMar>
               <w:top w:w="60" w:type="dxa"/>
@@ -982,10 +976,10 @@
           <w:tcPr>
             <w:tcW w:w="2066" w:type="dxa"/>
             <w:tcBorders>
-              <w:top w:val="single" w:sz="4" w:space="0" w:color="808080"/>
-              <w:left w:val="single" w:sz="4" w:space="0" w:color="808080"/>
-              <w:bottom w:val="single" w:sz="4" w:space="0" w:color="808080"/>
-              <w:right w:val="single" w:sz="4" w:space="0" w:color="808080"/>
+              <w:top w:val="single" w:color="808080" w:themeColor="background1" w:themeShade="80" w:sz="4" w:space="0"/>
+              <w:left w:val="single" w:color="808080" w:themeColor="background1" w:themeShade="80" w:sz="4" w:space="0"/>
+              <w:bottom w:val="single" w:color="808080" w:themeColor="background1" w:themeShade="80" w:sz="4" w:space="0"/>
+              <w:right w:val="single" w:color="808080" w:themeColor="background1" w:themeShade="80" w:sz="4" w:space="0"/>
             </w:tcBorders>
             <w:tcMar>
               <w:top w:w="60" w:type="dxa"/>
@@ -1020,12 +1014,12 @@
           <w:tcPr>
             <w:tcW w:w="700" w:type="dxa"/>
             <w:tcBorders>
-              <w:top w:val="single" w:sz="4" w:space="0" w:color="808080"/>
-              <w:left w:val="single" w:sz="4" w:space="0" w:color="808080"/>
-              <w:bottom w:val="single" w:sz="4" w:space="0" w:color="808080"/>
-              <w:right w:val="single" w:sz="4" w:space="0" w:color="808080"/>
-            </w:tcBorders>
-            <w:shd w:val="clear" w:color="auto" w:fill="F2F2F2"/>
+              <w:top w:val="single" w:color="808080" w:themeColor="background1" w:themeShade="80" w:sz="4" w:space="0"/>
+              <w:left w:val="single" w:color="808080" w:themeColor="background1" w:themeShade="80" w:sz="4" w:space="0"/>
+              <w:bottom w:val="single" w:color="808080" w:themeColor="background1" w:themeShade="80" w:sz="4" w:space="0"/>
+              <w:right w:val="single" w:color="808080" w:themeColor="background1" w:themeShade="80" w:sz="4" w:space="0"/>
+            </w:tcBorders>
+            <w:shd w:val="clear" w:color="auto" w:fill="F2F2F2" w:themeFill="background1" w:themeFillShade="F2"/>
             <w:tcMar>
               <w:top w:w="60" w:type="dxa"/>
               <w:left w:w="80" w:type="dxa"/>
@@ -1053,12 +1047,12 @@
           <w:tcPr>
             <w:tcW w:w="3800" w:type="dxa"/>
             <w:tcBorders>
-              <w:top w:val="single" w:sz="4" w:space="0" w:color="808080"/>
-              <w:left w:val="single" w:sz="4" w:space="0" w:color="808080"/>
-              <w:bottom w:val="single" w:sz="4" w:space="0" w:color="808080"/>
-              <w:right w:val="single" w:sz="4" w:space="0" w:color="808080"/>
-            </w:tcBorders>
-            <w:shd w:val="clear" w:color="auto" w:fill="F2F2F2"/>
+              <w:top w:val="single" w:color="808080" w:themeColor="background1" w:themeShade="80" w:sz="4" w:space="0"/>
+              <w:left w:val="single" w:color="808080" w:themeColor="background1" w:themeShade="80" w:sz="4" w:space="0"/>
+              <w:bottom w:val="single" w:color="808080" w:themeColor="background1" w:themeShade="80" w:sz="4" w:space="0"/>
+              <w:right w:val="single" w:color="808080" w:themeColor="background1" w:themeShade="80" w:sz="4" w:space="0"/>
+            </w:tcBorders>
+            <w:shd w:val="clear" w:color="auto" w:fill="F2F2F2" w:themeFill="background1" w:themeFillShade="F2"/>
             <w:tcMar>
               <w:top w:w="60" w:type="dxa"/>
               <w:left w:w="80" w:type="dxa"/>
@@ -1083,12 +1077,12 @@
           <w:tcPr>
             <w:tcW w:w="2000" w:type="dxa"/>
             <w:tcBorders>
-              <w:top w:val="single" w:sz="4" w:space="0" w:color="808080"/>
-              <w:left w:val="single" w:sz="4" w:space="0" w:color="808080"/>
-              <w:bottom w:val="single" w:sz="4" w:space="0" w:color="808080"/>
-              <w:right w:val="single" w:sz="4" w:space="0" w:color="808080"/>
-            </w:tcBorders>
-            <w:shd w:val="clear" w:color="auto" w:fill="F2F2F2"/>
+              <w:top w:val="single" w:color="808080" w:themeColor="background1" w:themeShade="80" w:sz="4" w:space="0"/>
+              <w:left w:val="single" w:color="808080" w:themeColor="background1" w:themeShade="80" w:sz="4" w:space="0"/>
+              <w:bottom w:val="single" w:color="808080" w:themeColor="background1" w:themeShade="80" w:sz="4" w:space="0"/>
+              <w:right w:val="single" w:color="808080" w:themeColor="background1" w:themeShade="80" w:sz="4" w:space="0"/>
+            </w:tcBorders>
+            <w:shd w:val="clear" w:color="auto" w:fill="F2F2F2" w:themeFill="background1" w:themeFillShade="F2"/>
             <w:tcMar>
               <w:top w:w="60" w:type="dxa"/>
               <w:left w:w="80" w:type="dxa"/>
@@ -1116,12 +1110,12 @@
           <w:tcPr>
             <w:tcW w:w="1900" w:type="dxa"/>
             <w:tcBorders>
-              <w:top w:val="single" w:sz="4" w:space="0" w:color="808080"/>
-              <w:left w:val="single" w:sz="4" w:space="0" w:color="808080"/>
-              <w:bottom w:val="single" w:sz="4" w:space="0" w:color="808080"/>
-              <w:right w:val="single" w:sz="4" w:space="0" w:color="808080"/>
-            </w:tcBorders>
-            <w:shd w:val="clear" w:color="auto" w:fill="F2F2F2"/>
+              <w:top w:val="single" w:color="808080" w:themeColor="background1" w:themeShade="80" w:sz="4" w:space="0"/>
+              <w:left w:val="single" w:color="808080" w:themeColor="background1" w:themeShade="80" w:sz="4" w:space="0"/>
+              <w:bottom w:val="single" w:color="808080" w:themeColor="background1" w:themeShade="80" w:sz="4" w:space="0"/>
+              <w:right w:val="single" w:color="808080" w:themeColor="background1" w:themeShade="80" w:sz="4" w:space="0"/>
+            </w:tcBorders>
+            <w:shd w:val="clear" w:color="auto" w:fill="F2F2F2" w:themeFill="background1" w:themeFillShade="F2"/>
             <w:tcMar>
               <w:top w:w="60" w:type="dxa"/>
               <w:left w:w="80" w:type="dxa"/>
@@ -1149,12 +1143,12 @@
           <w:tcPr>
             <w:tcW w:w="2066" w:type="dxa"/>
             <w:tcBorders>
-              <w:top w:val="single" w:sz="4" w:space="0" w:color="808080"/>
-              <w:left w:val="single" w:sz="4" w:space="0" w:color="808080"/>
-              <w:bottom w:val="single" w:sz="4" w:space="0" w:color="808080"/>
-              <w:right w:val="single" w:sz="4" w:space="0" w:color="808080"/>
-            </w:tcBorders>
-            <w:shd w:val="clear" w:color="auto" w:fill="F2F2F2"/>
+              <w:top w:val="single" w:color="808080" w:themeColor="background1" w:themeShade="80" w:sz="4" w:space="0"/>
+              <w:left w:val="single" w:color="808080" w:themeColor="background1" w:themeShade="80" w:sz="4" w:space="0"/>
+              <w:bottom w:val="single" w:color="808080" w:themeColor="background1" w:themeShade="80" w:sz="4" w:space="0"/>
+              <w:right w:val="single" w:color="808080" w:themeColor="background1" w:themeShade="80" w:sz="4" w:space="0"/>
+            </w:tcBorders>
+            <w:shd w:val="clear" w:color="auto" w:fill="F2F2F2" w:themeFill="background1" w:themeFillShade="F2"/>
             <w:tcMar>
               <w:top w:w="60" w:type="dxa"/>
               <w:left w:w="80" w:type="dxa"/>
@@ -1190,10 +1184,10 @@
           <w:tcPr>
             <w:tcW w:w="700" w:type="dxa"/>
             <w:tcBorders>
-              <w:top w:val="single" w:sz="4" w:space="0" w:color="808080"/>
-              <w:left w:val="single" w:sz="4" w:space="0" w:color="808080"/>
-              <w:bottom w:val="single" w:sz="4" w:space="0" w:color="808080"/>
-              <w:right w:val="single" w:sz="4" w:space="0" w:color="808080"/>
+              <w:top w:val="single" w:color="808080" w:themeColor="background1" w:themeShade="80" w:sz="4" w:space="0"/>
+              <w:left w:val="single" w:color="808080" w:themeColor="background1" w:themeShade="80" w:sz="4" w:space="0"/>
+              <w:bottom w:val="single" w:color="808080" w:themeColor="background1" w:themeShade="80" w:sz="4" w:space="0"/>
+              <w:right w:val="single" w:color="808080" w:themeColor="background1" w:themeShade="80" w:sz="4" w:space="0"/>
             </w:tcBorders>
             <w:shd w:val="clear" w:color="auto" w:fill="DDEBF7"/>
             <w:tcMar>
@@ -1214,10 +1208,10 @@
           <w:tcPr>
             <w:tcW w:w="3800" w:type="dxa"/>
             <w:tcBorders>
-              <w:top w:val="single" w:sz="4" w:space="0" w:color="808080"/>
-              <w:left w:val="single" w:sz="4" w:space="0" w:color="808080"/>
-              <w:bottom w:val="single" w:sz="4" w:space="0" w:color="808080"/>
-              <w:right w:val="single" w:sz="4" w:space="0" w:color="808080"/>
+              <w:top w:val="single" w:color="808080" w:themeColor="background1" w:themeShade="80" w:sz="4" w:space="0"/>
+              <w:left w:val="single" w:color="808080" w:themeColor="background1" w:themeShade="80" w:sz="4" w:space="0"/>
+              <w:bottom w:val="single" w:color="808080" w:themeColor="background1" w:themeShade="80" w:sz="4" w:space="0"/>
+              <w:right w:val="single" w:color="808080" w:themeColor="background1" w:themeShade="80" w:sz="4" w:space="0"/>
             </w:tcBorders>
             <w:shd w:val="clear" w:color="auto" w:fill="DDEBF7"/>
             <w:tcMar>
@@ -1244,10 +1238,10 @@
           <w:tcPr>
             <w:tcW w:w="2000" w:type="dxa"/>
             <w:tcBorders>
-              <w:top w:val="single" w:sz="4" w:space="0" w:color="808080"/>
-              <w:left w:val="single" w:sz="4" w:space="0" w:color="808080"/>
-              <w:bottom w:val="single" w:sz="4" w:space="0" w:color="808080"/>
-              <w:right w:val="single" w:sz="4" w:space="0" w:color="808080"/>
+              <w:top w:val="single" w:color="808080" w:themeColor="background1" w:themeShade="80" w:sz="4" w:space="0"/>
+              <w:left w:val="single" w:color="808080" w:themeColor="background1" w:themeShade="80" w:sz="4" w:space="0"/>
+              <w:bottom w:val="single" w:color="808080" w:themeColor="background1" w:themeShade="80" w:sz="4" w:space="0"/>
+              <w:right w:val="single" w:color="808080" w:themeColor="background1" w:themeShade="80" w:sz="4" w:space="0"/>
             </w:tcBorders>
             <w:shd w:val="clear" w:color="auto" w:fill="DDEBF7"/>
             <w:tcMar>
@@ -1277,10 +1271,10 @@
           <w:tcPr>
             <w:tcW w:w="1900" w:type="dxa"/>
             <w:tcBorders>
-              <w:top w:val="single" w:sz="4" w:space="0" w:color="808080"/>
-              <w:left w:val="single" w:sz="4" w:space="0" w:color="808080"/>
-              <w:bottom w:val="single" w:sz="4" w:space="0" w:color="808080"/>
-              <w:right w:val="single" w:sz="4" w:space="0" w:color="808080"/>
+              <w:top w:val="single" w:color="808080" w:themeColor="background1" w:themeShade="80" w:sz="4" w:space="0"/>
+              <w:left w:val="single" w:color="808080" w:themeColor="background1" w:themeShade="80" w:sz="4" w:space="0"/>
+              <w:bottom w:val="single" w:color="808080" w:themeColor="background1" w:themeShade="80" w:sz="4" w:space="0"/>
+              <w:right w:val="single" w:color="808080" w:themeColor="background1" w:themeShade="80" w:sz="4" w:space="0"/>
             </w:tcBorders>
             <w:shd w:val="clear" w:color="auto" w:fill="DDEBF7"/>
             <w:tcMar>
@@ -1295,16 +1289,25 @@
             <w:pPr>
               <w:jc w:val="center"/>
             </w:pPr>
+            <w:r>
+              <w:rPr>
+                <w:b w:val="1"/>
+                <w:bCs w:val="1"/>
+                <w:sz w:val="18"/>
+                <w:szCs w:val="18"/>
+              </w:rPr>
+              <w:t>No. of projects undertaken</w:t>
+            </w:r>
           </w:p>
         </w:tc>
         <w:tc>
           <w:tcPr>
             <w:tcW w:w="2066" w:type="dxa"/>
             <w:tcBorders>
-              <w:top w:val="single" w:sz="4" w:space="0" w:color="808080"/>
-              <w:left w:val="single" w:sz="4" w:space="0" w:color="808080"/>
-              <w:bottom w:val="single" w:sz="4" w:space="0" w:color="808080"/>
-              <w:right w:val="single" w:sz="4" w:space="0" w:color="808080"/>
+              <w:top w:val="single" w:color="808080" w:themeColor="background1" w:themeShade="80" w:sz="4" w:space="0"/>
+              <w:left w:val="single" w:color="808080" w:themeColor="background1" w:themeShade="80" w:sz="4" w:space="0"/>
+              <w:bottom w:val="single" w:color="808080" w:themeColor="background1" w:themeShade="80" w:sz="4" w:space="0"/>
+              <w:right w:val="single" w:color="808080" w:themeColor="background1" w:themeShade="80" w:sz="4" w:space="0"/>
             </w:tcBorders>
             <w:shd w:val="clear" w:color="auto" w:fill="DDEBF7"/>
             <w:tcMar>
@@ -1321,12 +1324,12 @@
             </w:pPr>
             <w:r>
               <w:rPr>
-                <w:b/>
-                <w:bCs/>
-                <w:sz w:val="18"/>
-                <w:szCs w:val="18"/>
-              </w:rPr>
-              <w:t>x</w:t>
+                <w:b w:val="1"/>
+                <w:bCs w:val="1"/>
+                <w:sz w:val="18"/>
+                <w:szCs w:val="18"/>
+              </w:rPr>
+              <w:t>Total project cost involved (Rs. in lakh)</w:t>
             </w:r>
           </w:p>
         </w:tc>
@@ -1342,10 +1345,10 @@
           <w:tcPr>
             <w:tcW w:w="700" w:type="dxa"/>
             <w:tcBorders>
-              <w:top w:val="single" w:sz="4" w:space="0" w:color="808080"/>
-              <w:left w:val="single" w:sz="4" w:space="0" w:color="808080"/>
-              <w:bottom w:val="single" w:sz="4" w:space="0" w:color="808080"/>
-              <w:right w:val="single" w:sz="4" w:space="0" w:color="808080"/>
+              <w:top w:val="single" w:color="808080" w:themeColor="background1" w:themeShade="80" w:sz="4" w:space="0"/>
+              <w:left w:val="single" w:color="808080" w:themeColor="background1" w:themeShade="80" w:sz="4" w:space="0"/>
+              <w:bottom w:val="single" w:color="808080" w:themeColor="background1" w:themeShade="80" w:sz="4" w:space="0"/>
+              <w:right w:val="single" w:color="808080" w:themeColor="background1" w:themeShade="80" w:sz="4" w:space="0"/>
             </w:tcBorders>
             <w:tcMar>
               <w:top w:w="60" w:type="dxa"/>
@@ -1365,10 +1368,10 @@
           <w:tcPr>
             <w:tcW w:w="3800" w:type="dxa"/>
             <w:tcBorders>
-              <w:top w:val="single" w:sz="4" w:space="0" w:color="808080"/>
-              <w:left w:val="single" w:sz="4" w:space="0" w:color="808080"/>
-              <w:bottom w:val="single" w:sz="4" w:space="0" w:color="808080"/>
-              <w:right w:val="single" w:sz="4" w:space="0" w:color="808080"/>
+              <w:top w:val="single" w:color="808080" w:themeColor="background1" w:themeShade="80" w:sz="4" w:space="0"/>
+              <w:left w:val="single" w:color="808080" w:themeColor="background1" w:themeShade="80" w:sz="4" w:space="0"/>
+              <w:bottom w:val="single" w:color="808080" w:themeColor="background1" w:themeShade="80" w:sz="4" w:space="0"/>
+              <w:right w:val="single" w:color="808080" w:themeColor="background1" w:themeShade="80" w:sz="4" w:space="0"/>
             </w:tcBorders>
             <w:tcMar>
               <w:top w:w="60" w:type="dxa"/>
@@ -1404,10 +1407,10 @@
           <w:tcPr>
             <w:tcW w:w="2000" w:type="dxa"/>
             <w:tcBorders>
-              <w:top w:val="single" w:sz="4" w:space="0" w:color="808080"/>
-              <w:left w:val="single" w:sz="4" w:space="0" w:color="808080"/>
-              <w:bottom w:val="single" w:sz="4" w:space="0" w:color="808080"/>
-              <w:right w:val="single" w:sz="4" w:space="0" w:color="808080"/>
+              <w:top w:val="single" w:color="808080" w:themeColor="background1" w:themeShade="80" w:sz="4" w:space="0"/>
+              <w:left w:val="single" w:color="808080" w:themeColor="background1" w:themeShade="80" w:sz="4" w:space="0"/>
+              <w:bottom w:val="single" w:color="808080" w:themeColor="background1" w:themeShade="80" w:sz="4" w:space="0"/>
+              <w:right w:val="single" w:color="808080" w:themeColor="background1" w:themeShade="80" w:sz="4" w:space="0"/>
             </w:tcBorders>
             <w:tcMar>
               <w:top w:w="60" w:type="dxa"/>
@@ -1427,10 +1430,10 @@
           <w:tcPr>
             <w:tcW w:w="1900" w:type="dxa"/>
             <w:tcBorders>
-              <w:top w:val="single" w:sz="4" w:space="0" w:color="808080"/>
-              <w:left w:val="single" w:sz="4" w:space="0" w:color="808080"/>
-              <w:bottom w:val="single" w:sz="4" w:space="0" w:color="808080"/>
-              <w:right w:val="single" w:sz="4" w:space="0" w:color="808080"/>
+              <w:top w:val="single" w:color="808080" w:themeColor="background1" w:themeShade="80" w:sz="4" w:space="0"/>
+              <w:left w:val="single" w:color="808080" w:themeColor="background1" w:themeShade="80" w:sz="4" w:space="0"/>
+              <w:bottom w:val="single" w:color="808080" w:themeColor="background1" w:themeShade="80" w:sz="4" w:space="0"/>
+              <w:right w:val="single" w:color="808080" w:themeColor="background1" w:themeShade="80" w:sz="4" w:space="0"/>
             </w:tcBorders>
             <w:tcMar>
               <w:top w:w="60" w:type="dxa"/>
@@ -1450,10 +1453,10 @@
           <w:tcPr>
             <w:tcW w:w="2066" w:type="dxa"/>
             <w:tcBorders>
-              <w:top w:val="single" w:sz="4" w:space="0" w:color="808080"/>
-              <w:left w:val="single" w:sz="4" w:space="0" w:color="808080"/>
-              <w:bottom w:val="single" w:sz="4" w:space="0" w:color="808080"/>
-              <w:right w:val="single" w:sz="4" w:space="0" w:color="808080"/>
+              <w:top w:val="single" w:color="808080" w:themeColor="background1" w:themeShade="80" w:sz="4" w:space="0"/>
+              <w:left w:val="single" w:color="808080" w:themeColor="background1" w:themeShade="80" w:sz="4" w:space="0"/>
+              <w:bottom w:val="single" w:color="808080" w:themeColor="background1" w:themeShade="80" w:sz="4" w:space="0"/>
+              <w:right w:val="single" w:color="808080" w:themeColor="background1" w:themeShade="80" w:sz="4" w:space="0"/>
             </w:tcBorders>
             <w:tcMar>
               <w:top w:w="60" w:type="dxa"/>
@@ -1481,10 +1484,10 @@
           <w:tcPr>
             <w:tcW w:w="700" w:type="dxa"/>
             <w:tcBorders>
-              <w:top w:val="single" w:sz="4" w:space="0" w:color="808080"/>
-              <w:left w:val="single" w:sz="4" w:space="0" w:color="808080"/>
-              <w:bottom w:val="single" w:sz="4" w:space="0" w:color="808080"/>
-              <w:right w:val="single" w:sz="4" w:space="0" w:color="808080"/>
+              <w:top w:val="single" w:color="808080" w:themeColor="background1" w:themeShade="80" w:sz="4" w:space="0"/>
+              <w:left w:val="single" w:color="808080" w:themeColor="background1" w:themeShade="80" w:sz="4" w:space="0"/>
+              <w:bottom w:val="single" w:color="808080" w:themeColor="background1" w:themeShade="80" w:sz="4" w:space="0"/>
+              <w:right w:val="single" w:color="808080" w:themeColor="background1" w:themeShade="80" w:sz="4" w:space="0"/>
             </w:tcBorders>
             <w:tcMar>
               <w:top w:w="60" w:type="dxa"/>
@@ -1504,10 +1507,10 @@
           <w:tcPr>
             <w:tcW w:w="3800" w:type="dxa"/>
             <w:tcBorders>
-              <w:top w:val="single" w:sz="4" w:space="0" w:color="808080"/>
-              <w:left w:val="single" w:sz="4" w:space="0" w:color="808080"/>
-              <w:bottom w:val="single" w:sz="4" w:space="0" w:color="808080"/>
-              <w:right w:val="single" w:sz="4" w:space="0" w:color="808080"/>
+              <w:top w:val="single" w:color="808080" w:themeColor="background1" w:themeShade="80" w:sz="4" w:space="0"/>
+              <w:left w:val="single" w:color="808080" w:themeColor="background1" w:themeShade="80" w:sz="4" w:space="0"/>
+              <w:bottom w:val="single" w:color="808080" w:themeColor="background1" w:themeShade="80" w:sz="4" w:space="0"/>
+              <w:right w:val="single" w:color="808080" w:themeColor="background1" w:themeShade="80" w:sz="4" w:space="0"/>
             </w:tcBorders>
             <w:tcMar>
               <w:top w:w="60" w:type="dxa"/>
@@ -1526,7 +1529,21 @@
                 <w:sz w:val="18"/>
                 <w:szCs w:val="18"/>
               </w:rPr>
-              <w:t>ii.  Rain water harvesting</w:t>
+              <w:t xml:space="preserve">ii.  </w:t>
+            </w:r>
+            <w:r>
+              <w:rPr>
+                <w:sz w:val="18"/>
+                <w:szCs w:val="18"/>
+              </w:rPr>
+              <w:t>Rainwater</w:t>
+            </w:r>
+            <w:r>
+              <w:rPr>
+                <w:sz w:val="18"/>
+                <w:szCs w:val="18"/>
+              </w:rPr>
+              <w:t xml:space="preserve"> harvesting</w:t>
             </w:r>
           </w:p>
         </w:tc>
@@ -1534,10 +1551,10 @@
           <w:tcPr>
             <w:tcW w:w="2000" w:type="dxa"/>
             <w:tcBorders>
-              <w:top w:val="single" w:sz="4" w:space="0" w:color="808080"/>
-              <w:left w:val="single" w:sz="4" w:space="0" w:color="808080"/>
-              <w:bottom w:val="single" w:sz="4" w:space="0" w:color="808080"/>
-              <w:right w:val="single" w:sz="4" w:space="0" w:color="808080"/>
+              <w:top w:val="single" w:color="808080" w:themeColor="background1" w:themeShade="80" w:sz="4" w:space="0"/>
+              <w:left w:val="single" w:color="808080" w:themeColor="background1" w:themeShade="80" w:sz="4" w:space="0"/>
+              <w:bottom w:val="single" w:color="808080" w:themeColor="background1" w:themeShade="80" w:sz="4" w:space="0"/>
+              <w:right w:val="single" w:color="808080" w:themeColor="background1" w:themeShade="80" w:sz="4" w:space="0"/>
             </w:tcBorders>
             <w:tcMar>
               <w:top w:w="60" w:type="dxa"/>
@@ -1557,10 +1574,10 @@
           <w:tcPr>
             <w:tcW w:w="1900" w:type="dxa"/>
             <w:tcBorders>
-              <w:top w:val="single" w:sz="4" w:space="0" w:color="808080"/>
-              <w:left w:val="single" w:sz="4" w:space="0" w:color="808080"/>
-              <w:bottom w:val="single" w:sz="4" w:space="0" w:color="808080"/>
-              <w:right w:val="single" w:sz="4" w:space="0" w:color="808080"/>
+              <w:top w:val="single" w:color="808080" w:themeColor="background1" w:themeShade="80" w:sz="4" w:space="0"/>
+              <w:left w:val="single" w:color="808080" w:themeColor="background1" w:themeShade="80" w:sz="4" w:space="0"/>
+              <w:bottom w:val="single" w:color="808080" w:themeColor="background1" w:themeShade="80" w:sz="4" w:space="0"/>
+              <w:right w:val="single" w:color="808080" w:themeColor="background1" w:themeShade="80" w:sz="4" w:space="0"/>
             </w:tcBorders>
             <w:tcMar>
               <w:top w:w="60" w:type="dxa"/>
@@ -1580,10 +1597,10 @@
           <w:tcPr>
             <w:tcW w:w="2066" w:type="dxa"/>
             <w:tcBorders>
-              <w:top w:val="single" w:sz="4" w:space="0" w:color="808080"/>
-              <w:left w:val="single" w:sz="4" w:space="0" w:color="808080"/>
-              <w:bottom w:val="single" w:sz="4" w:space="0" w:color="808080"/>
-              <w:right w:val="single" w:sz="4" w:space="0" w:color="808080"/>
+              <w:top w:val="single" w:color="808080" w:themeColor="background1" w:themeShade="80" w:sz="4" w:space="0"/>
+              <w:left w:val="single" w:color="808080" w:themeColor="background1" w:themeShade="80" w:sz="4" w:space="0"/>
+              <w:bottom w:val="single" w:color="808080" w:themeColor="background1" w:themeShade="80" w:sz="4" w:space="0"/>
+              <w:right w:val="single" w:color="808080" w:themeColor="background1" w:themeShade="80" w:sz="4" w:space="0"/>
             </w:tcBorders>
             <w:tcMar>
               <w:top w:w="60" w:type="dxa"/>
@@ -1611,10 +1628,10 @@
           <w:tcPr>
             <w:tcW w:w="700" w:type="dxa"/>
             <w:tcBorders>
-              <w:top w:val="single" w:sz="4" w:space="0" w:color="808080"/>
-              <w:left w:val="single" w:sz="4" w:space="0" w:color="808080"/>
-              <w:bottom w:val="single" w:sz="4" w:space="0" w:color="808080"/>
-              <w:right w:val="single" w:sz="4" w:space="0" w:color="808080"/>
+              <w:top w:val="single" w:color="808080" w:themeColor="background1" w:themeShade="80" w:sz="4" w:space="0"/>
+              <w:left w:val="single" w:color="808080" w:themeColor="background1" w:themeShade="80" w:sz="4" w:space="0"/>
+              <w:bottom w:val="single" w:color="808080" w:themeColor="background1" w:themeShade="80" w:sz="4" w:space="0"/>
+              <w:right w:val="single" w:color="808080" w:themeColor="background1" w:themeShade="80" w:sz="4" w:space="0"/>
             </w:tcBorders>
             <w:tcMar>
               <w:top w:w="60" w:type="dxa"/>
@@ -1634,10 +1651,10 @@
           <w:tcPr>
             <w:tcW w:w="3800" w:type="dxa"/>
             <w:tcBorders>
-              <w:top w:val="single" w:sz="4" w:space="0" w:color="808080"/>
-              <w:left w:val="single" w:sz="4" w:space="0" w:color="808080"/>
-              <w:bottom w:val="single" w:sz="4" w:space="0" w:color="808080"/>
-              <w:right w:val="single" w:sz="4" w:space="0" w:color="808080"/>
+              <w:top w:val="single" w:color="808080" w:themeColor="background1" w:themeShade="80" w:sz="4" w:space="0"/>
+              <w:left w:val="single" w:color="808080" w:themeColor="background1" w:themeShade="80" w:sz="4" w:space="0"/>
+              <w:bottom w:val="single" w:color="808080" w:themeColor="background1" w:themeShade="80" w:sz="4" w:space="0"/>
+              <w:right w:val="single" w:color="808080" w:themeColor="background1" w:themeShade="80" w:sz="4" w:space="0"/>
             </w:tcBorders>
             <w:tcMar>
               <w:top w:w="60" w:type="dxa"/>
@@ -1664,10 +1681,10 @@
           <w:tcPr>
             <w:tcW w:w="2000" w:type="dxa"/>
             <w:tcBorders>
-              <w:top w:val="single" w:sz="4" w:space="0" w:color="808080"/>
-              <w:left w:val="single" w:sz="4" w:space="0" w:color="808080"/>
-              <w:bottom w:val="single" w:sz="4" w:space="0" w:color="808080"/>
-              <w:right w:val="single" w:sz="4" w:space="0" w:color="808080"/>
+              <w:top w:val="single" w:color="808080" w:themeColor="background1" w:themeShade="80" w:sz="4" w:space="0"/>
+              <w:left w:val="single" w:color="808080" w:themeColor="background1" w:themeShade="80" w:sz="4" w:space="0"/>
+              <w:bottom w:val="single" w:color="808080" w:themeColor="background1" w:themeShade="80" w:sz="4" w:space="0"/>
+              <w:right w:val="single" w:color="808080" w:themeColor="background1" w:themeShade="80" w:sz="4" w:space="0"/>
             </w:tcBorders>
             <w:tcMar>
               <w:top w:w="60" w:type="dxa"/>
@@ -1687,10 +1704,10 @@
           <w:tcPr>
             <w:tcW w:w="1900" w:type="dxa"/>
             <w:tcBorders>
-              <w:top w:val="single" w:sz="4" w:space="0" w:color="808080"/>
-              <w:left w:val="single" w:sz="4" w:space="0" w:color="808080"/>
-              <w:bottom w:val="single" w:sz="4" w:space="0" w:color="808080"/>
-              <w:right w:val="single" w:sz="4" w:space="0" w:color="808080"/>
+              <w:top w:val="single" w:color="808080" w:themeColor="background1" w:themeShade="80" w:sz="4" w:space="0"/>
+              <w:left w:val="single" w:color="808080" w:themeColor="background1" w:themeShade="80" w:sz="4" w:space="0"/>
+              <w:bottom w:val="single" w:color="808080" w:themeColor="background1" w:themeShade="80" w:sz="4" w:space="0"/>
+              <w:right w:val="single" w:color="808080" w:themeColor="background1" w:themeShade="80" w:sz="4" w:space="0"/>
             </w:tcBorders>
             <w:tcMar>
               <w:top w:w="60" w:type="dxa"/>
@@ -1710,10 +1727,10 @@
           <w:tcPr>
             <w:tcW w:w="2066" w:type="dxa"/>
             <w:tcBorders>
-              <w:top w:val="single" w:sz="4" w:space="0" w:color="808080"/>
-              <w:left w:val="single" w:sz="4" w:space="0" w:color="808080"/>
-              <w:bottom w:val="single" w:sz="4" w:space="0" w:color="808080"/>
-              <w:right w:val="single" w:sz="4" w:space="0" w:color="808080"/>
+              <w:top w:val="single" w:color="808080" w:themeColor="background1" w:themeShade="80" w:sz="4" w:space="0"/>
+              <w:left w:val="single" w:color="808080" w:themeColor="background1" w:themeShade="80" w:sz="4" w:space="0"/>
+              <w:bottom w:val="single" w:color="808080" w:themeColor="background1" w:themeShade="80" w:sz="4" w:space="0"/>
+              <w:right w:val="single" w:color="808080" w:themeColor="background1" w:themeShade="80" w:sz="4" w:space="0"/>
             </w:tcBorders>
             <w:tcMar>
               <w:top w:w="60" w:type="dxa"/>
@@ -1741,10 +1758,10 @@
           <w:tcPr>
             <w:tcW w:w="700" w:type="dxa"/>
             <w:tcBorders>
-              <w:top w:val="single" w:sz="4" w:space="0" w:color="808080"/>
-              <w:left w:val="single" w:sz="4" w:space="0" w:color="808080"/>
-              <w:bottom w:val="single" w:sz="4" w:space="0" w:color="808080"/>
-              <w:right w:val="single" w:sz="4" w:space="0" w:color="808080"/>
+              <w:top w:val="single" w:color="808080" w:themeColor="background1" w:themeShade="80" w:sz="4" w:space="0"/>
+              <w:left w:val="single" w:color="808080" w:themeColor="background1" w:themeShade="80" w:sz="4" w:space="0"/>
+              <w:bottom w:val="single" w:color="808080" w:themeColor="background1" w:themeShade="80" w:sz="4" w:space="0"/>
+              <w:right w:val="single" w:color="808080" w:themeColor="background1" w:themeShade="80" w:sz="4" w:space="0"/>
             </w:tcBorders>
             <w:tcMar>
               <w:top w:w="60" w:type="dxa"/>
@@ -1764,10 +1781,10 @@
           <w:tcPr>
             <w:tcW w:w="3800" w:type="dxa"/>
             <w:tcBorders>
-              <w:top w:val="single" w:sz="4" w:space="0" w:color="808080"/>
-              <w:left w:val="single" w:sz="4" w:space="0" w:color="808080"/>
-              <w:bottom w:val="single" w:sz="4" w:space="0" w:color="808080"/>
-              <w:right w:val="single" w:sz="4" w:space="0" w:color="808080"/>
+              <w:top w:val="single" w:color="808080" w:themeColor="background1" w:themeShade="80" w:sz="4" w:space="0"/>
+              <w:left w:val="single" w:color="808080" w:themeColor="background1" w:themeShade="80" w:sz="4" w:space="0"/>
+              <w:bottom w:val="single" w:color="808080" w:themeColor="background1" w:themeShade="80" w:sz="4" w:space="0"/>
+              <w:right w:val="single" w:color="808080" w:themeColor="background1" w:themeShade="80" w:sz="4" w:space="0"/>
             </w:tcBorders>
             <w:tcMar>
               <w:top w:w="60" w:type="dxa"/>
@@ -1794,10 +1811,10 @@
           <w:tcPr>
             <w:tcW w:w="2000" w:type="dxa"/>
             <w:tcBorders>
-              <w:top w:val="single" w:sz="4" w:space="0" w:color="808080"/>
-              <w:left w:val="single" w:sz="4" w:space="0" w:color="808080"/>
-              <w:bottom w:val="single" w:sz="4" w:space="0" w:color="808080"/>
-              <w:right w:val="single" w:sz="4" w:space="0" w:color="808080"/>
+              <w:top w:val="single" w:color="808080" w:themeColor="background1" w:themeShade="80" w:sz="4" w:space="0"/>
+              <w:left w:val="single" w:color="808080" w:themeColor="background1" w:themeShade="80" w:sz="4" w:space="0"/>
+              <w:bottom w:val="single" w:color="808080" w:themeColor="background1" w:themeShade="80" w:sz="4" w:space="0"/>
+              <w:right w:val="single" w:color="808080" w:themeColor="background1" w:themeShade="80" w:sz="4" w:space="0"/>
             </w:tcBorders>
             <w:tcMar>
               <w:top w:w="60" w:type="dxa"/>
@@ -1817,10 +1834,10 @@
           <w:tcPr>
             <w:tcW w:w="1900" w:type="dxa"/>
             <w:tcBorders>
-              <w:top w:val="single" w:sz="4" w:space="0" w:color="808080"/>
-              <w:left w:val="single" w:sz="4" w:space="0" w:color="808080"/>
-              <w:bottom w:val="single" w:sz="4" w:space="0" w:color="808080"/>
-              <w:right w:val="single" w:sz="4" w:space="0" w:color="808080"/>
+              <w:top w:val="single" w:color="808080" w:themeColor="background1" w:themeShade="80" w:sz="4" w:space="0"/>
+              <w:left w:val="single" w:color="808080" w:themeColor="background1" w:themeShade="80" w:sz="4" w:space="0"/>
+              <w:bottom w:val="single" w:color="808080" w:themeColor="background1" w:themeShade="80" w:sz="4" w:space="0"/>
+              <w:right w:val="single" w:color="808080" w:themeColor="background1" w:themeShade="80" w:sz="4" w:space="0"/>
             </w:tcBorders>
             <w:tcMar>
               <w:top w:w="60" w:type="dxa"/>
@@ -1840,10 +1857,10 @@
           <w:tcPr>
             <w:tcW w:w="2066" w:type="dxa"/>
             <w:tcBorders>
-              <w:top w:val="single" w:sz="4" w:space="0" w:color="808080"/>
-              <w:left w:val="single" w:sz="4" w:space="0" w:color="808080"/>
-              <w:bottom w:val="single" w:sz="4" w:space="0" w:color="808080"/>
-              <w:right w:val="single" w:sz="4" w:space="0" w:color="808080"/>
+              <w:top w:val="single" w:color="808080" w:themeColor="background1" w:themeShade="80" w:sz="4" w:space="0"/>
+              <w:left w:val="single" w:color="808080" w:themeColor="background1" w:themeShade="80" w:sz="4" w:space="0"/>
+              <w:bottom w:val="single" w:color="808080" w:themeColor="background1" w:themeShade="80" w:sz="4" w:space="0"/>
+              <w:right w:val="single" w:color="808080" w:themeColor="background1" w:themeShade="80" w:sz="4" w:space="0"/>
             </w:tcBorders>
             <w:tcMar>
               <w:top w:w="60" w:type="dxa"/>
@@ -1871,10 +1888,10 @@
           <w:tcPr>
             <w:tcW w:w="700" w:type="dxa"/>
             <w:tcBorders>
-              <w:top w:val="single" w:sz="4" w:space="0" w:color="808080"/>
-              <w:left w:val="single" w:sz="4" w:space="0" w:color="808080"/>
-              <w:bottom w:val="single" w:sz="4" w:space="0" w:color="808080"/>
-              <w:right w:val="single" w:sz="4" w:space="0" w:color="808080"/>
+              <w:top w:val="single" w:color="808080" w:themeColor="background1" w:themeShade="80" w:sz="4" w:space="0"/>
+              <w:left w:val="single" w:color="808080" w:themeColor="background1" w:themeShade="80" w:sz="4" w:space="0"/>
+              <w:bottom w:val="single" w:color="808080" w:themeColor="background1" w:themeShade="80" w:sz="4" w:space="0"/>
+              <w:right w:val="single" w:color="808080" w:themeColor="background1" w:themeShade="80" w:sz="4" w:space="0"/>
             </w:tcBorders>
             <w:tcMar>
               <w:top w:w="60" w:type="dxa"/>
@@ -1894,10 +1911,10 @@
           <w:tcPr>
             <w:tcW w:w="3800" w:type="dxa"/>
             <w:tcBorders>
-              <w:top w:val="single" w:sz="4" w:space="0" w:color="808080"/>
-              <w:left w:val="single" w:sz="4" w:space="0" w:color="808080"/>
-              <w:bottom w:val="single" w:sz="4" w:space="0" w:color="808080"/>
-              <w:right w:val="single" w:sz="4" w:space="0" w:color="808080"/>
+              <w:top w:val="single" w:color="808080" w:themeColor="background1" w:themeShade="80" w:sz="4" w:space="0"/>
+              <w:left w:val="single" w:color="808080" w:themeColor="background1" w:themeShade="80" w:sz="4" w:space="0"/>
+              <w:bottom w:val="single" w:color="808080" w:themeColor="background1" w:themeShade="80" w:sz="4" w:space="0"/>
+              <w:right w:val="single" w:color="808080" w:themeColor="background1" w:themeShade="80" w:sz="4" w:space="0"/>
             </w:tcBorders>
             <w:tcMar>
               <w:top w:w="60" w:type="dxa"/>
@@ -1924,10 +1941,10 @@
           <w:tcPr>
             <w:tcW w:w="2000" w:type="dxa"/>
             <w:tcBorders>
-              <w:top w:val="single" w:sz="4" w:space="0" w:color="808080"/>
-              <w:left w:val="single" w:sz="4" w:space="0" w:color="808080"/>
-              <w:bottom w:val="single" w:sz="4" w:space="0" w:color="808080"/>
-              <w:right w:val="single" w:sz="4" w:space="0" w:color="808080"/>
+              <w:top w:val="single" w:color="808080" w:themeColor="background1" w:themeShade="80" w:sz="4" w:space="0"/>
+              <w:left w:val="single" w:color="808080" w:themeColor="background1" w:themeShade="80" w:sz="4" w:space="0"/>
+              <w:bottom w:val="single" w:color="808080" w:themeColor="background1" w:themeShade="80" w:sz="4" w:space="0"/>
+              <w:right w:val="single" w:color="808080" w:themeColor="background1" w:themeShade="80" w:sz="4" w:space="0"/>
             </w:tcBorders>
             <w:tcMar>
               <w:top w:w="60" w:type="dxa"/>
@@ -1947,10 +1964,10 @@
           <w:tcPr>
             <w:tcW w:w="1900" w:type="dxa"/>
             <w:tcBorders>
-              <w:top w:val="single" w:sz="4" w:space="0" w:color="808080"/>
-              <w:left w:val="single" w:sz="4" w:space="0" w:color="808080"/>
-              <w:bottom w:val="single" w:sz="4" w:space="0" w:color="808080"/>
-              <w:right w:val="single" w:sz="4" w:space="0" w:color="808080"/>
+              <w:top w:val="single" w:color="808080" w:themeColor="background1" w:themeShade="80" w:sz="4" w:space="0"/>
+              <w:left w:val="single" w:color="808080" w:themeColor="background1" w:themeShade="80" w:sz="4" w:space="0"/>
+              <w:bottom w:val="single" w:color="808080" w:themeColor="background1" w:themeShade="80" w:sz="4" w:space="0"/>
+              <w:right w:val="single" w:color="808080" w:themeColor="background1" w:themeShade="80" w:sz="4" w:space="0"/>
             </w:tcBorders>
             <w:tcMar>
               <w:top w:w="60" w:type="dxa"/>
@@ -1970,10 +1987,10 @@
           <w:tcPr>
             <w:tcW w:w="2066" w:type="dxa"/>
             <w:tcBorders>
-              <w:top w:val="single" w:sz="4" w:space="0" w:color="808080"/>
-              <w:left w:val="single" w:sz="4" w:space="0" w:color="808080"/>
-              <w:bottom w:val="single" w:sz="4" w:space="0" w:color="808080"/>
-              <w:right w:val="single" w:sz="4" w:space="0" w:color="808080"/>
+              <w:top w:val="single" w:color="808080" w:themeColor="background1" w:themeShade="80" w:sz="4" w:space="0"/>
+              <w:left w:val="single" w:color="808080" w:themeColor="background1" w:themeShade="80" w:sz="4" w:space="0"/>
+              <w:bottom w:val="single" w:color="808080" w:themeColor="background1" w:themeShade="80" w:sz="4" w:space="0"/>
+              <w:right w:val="single" w:color="808080" w:themeColor="background1" w:themeShade="80" w:sz="4" w:space="0"/>
             </w:tcBorders>
             <w:tcMar>
               <w:top w:w="60" w:type="dxa"/>
@@ -2001,10 +2018,10 @@
           <w:tcPr>
             <w:tcW w:w="700" w:type="dxa"/>
             <w:tcBorders>
-              <w:top w:val="single" w:sz="4" w:space="0" w:color="808080"/>
-              <w:left w:val="single" w:sz="4" w:space="0" w:color="808080"/>
-              <w:bottom w:val="single" w:sz="4" w:space="0" w:color="808080"/>
-              <w:right w:val="single" w:sz="4" w:space="0" w:color="808080"/>
+              <w:top w:val="single" w:color="808080" w:themeColor="background1" w:themeShade="80" w:sz="4" w:space="0"/>
+              <w:left w:val="single" w:color="808080" w:themeColor="background1" w:themeShade="80" w:sz="4" w:space="0"/>
+              <w:bottom w:val="single" w:color="808080" w:themeColor="background1" w:themeShade="80" w:sz="4" w:space="0"/>
+              <w:right w:val="single" w:color="808080" w:themeColor="background1" w:themeShade="80" w:sz="4" w:space="0"/>
             </w:tcBorders>
             <w:shd w:val="clear" w:color="auto" w:fill="DDEBF7"/>
             <w:tcMar>
@@ -2025,10 +2042,10 @@
           <w:tcPr>
             <w:tcW w:w="3800" w:type="dxa"/>
             <w:tcBorders>
-              <w:top w:val="single" w:sz="4" w:space="0" w:color="808080"/>
-              <w:left w:val="single" w:sz="4" w:space="0" w:color="808080"/>
-              <w:bottom w:val="single" w:sz="4" w:space="0" w:color="808080"/>
-              <w:right w:val="single" w:sz="4" w:space="0" w:color="808080"/>
+              <w:top w:val="single" w:color="808080" w:themeColor="background1" w:themeShade="80" w:sz="4" w:space="0"/>
+              <w:left w:val="single" w:color="808080" w:themeColor="background1" w:themeShade="80" w:sz="4" w:space="0"/>
+              <w:bottom w:val="single" w:color="808080" w:themeColor="background1" w:themeShade="80" w:sz="4" w:space="0"/>
+              <w:right w:val="single" w:color="808080" w:themeColor="background1" w:themeShade="80" w:sz="4" w:space="0"/>
             </w:tcBorders>
             <w:shd w:val="clear" w:color="auto" w:fill="DDEBF7"/>
             <w:tcMar>
@@ -2055,10 +2072,10 @@
           <w:tcPr>
             <w:tcW w:w="2000" w:type="dxa"/>
             <w:tcBorders>
-              <w:top w:val="single" w:sz="4" w:space="0" w:color="808080"/>
-              <w:left w:val="single" w:sz="4" w:space="0" w:color="808080"/>
-              <w:bottom w:val="single" w:sz="4" w:space="0" w:color="808080"/>
-              <w:right w:val="single" w:sz="4" w:space="0" w:color="808080"/>
+              <w:top w:val="single" w:color="808080" w:themeColor="background1" w:themeShade="80" w:sz="4" w:space="0"/>
+              <w:left w:val="single" w:color="808080" w:themeColor="background1" w:themeShade="80" w:sz="4" w:space="0"/>
+              <w:bottom w:val="single" w:color="808080" w:themeColor="background1" w:themeShade="80" w:sz="4" w:space="0"/>
+              <w:right w:val="single" w:color="808080" w:themeColor="background1" w:themeShade="80" w:sz="4" w:space="0"/>
             </w:tcBorders>
             <w:shd w:val="clear" w:color="auto" w:fill="DDEBF7"/>
             <w:tcMar>
@@ -2088,10 +2105,10 @@
           <w:tcPr>
             <w:tcW w:w="1900" w:type="dxa"/>
             <w:tcBorders>
-              <w:top w:val="single" w:sz="4" w:space="0" w:color="808080"/>
-              <w:left w:val="single" w:sz="4" w:space="0" w:color="808080"/>
-              <w:bottom w:val="single" w:sz="4" w:space="0" w:color="808080"/>
-              <w:right w:val="single" w:sz="4" w:space="0" w:color="808080"/>
+              <w:top w:val="single" w:color="808080" w:themeColor="background1" w:themeShade="80" w:sz="4" w:space="0"/>
+              <w:left w:val="single" w:color="808080" w:themeColor="background1" w:themeShade="80" w:sz="4" w:space="0"/>
+              <w:bottom w:val="single" w:color="808080" w:themeColor="background1" w:themeShade="80" w:sz="4" w:space="0"/>
+              <w:right w:val="single" w:color="808080" w:themeColor="background1" w:themeShade="80" w:sz="4" w:space="0"/>
             </w:tcBorders>
             <w:shd w:val="clear" w:color="auto" w:fill="DDEBF7"/>
             <w:tcMar>
@@ -2106,16 +2123,25 @@
             <w:pPr>
               <w:jc w:val="center"/>
             </w:pPr>
+            <w:r>
+              <w:rPr>
+                <w:b w:val="1"/>
+                <w:bCs w:val="1"/>
+                <w:sz w:val="18"/>
+                <w:szCs w:val="18"/>
+              </w:rPr>
+              <w:t>No. of projects undertaken</w:t>
+            </w:r>
           </w:p>
         </w:tc>
         <w:tc>
           <w:tcPr>
             <w:tcW w:w="2066" w:type="dxa"/>
             <w:tcBorders>
-              <w:top w:val="single" w:sz="4" w:space="0" w:color="808080"/>
-              <w:left w:val="single" w:sz="4" w:space="0" w:color="808080"/>
-              <w:bottom w:val="single" w:sz="4" w:space="0" w:color="808080"/>
-              <w:right w:val="single" w:sz="4" w:space="0" w:color="808080"/>
+              <w:top w:val="single" w:color="808080" w:themeColor="background1" w:themeShade="80" w:sz="4" w:space="0"/>
+              <w:left w:val="single" w:color="808080" w:themeColor="background1" w:themeShade="80" w:sz="4" w:space="0"/>
+              <w:bottom w:val="single" w:color="808080" w:themeColor="background1" w:themeShade="80" w:sz="4" w:space="0"/>
+              <w:right w:val="single" w:color="808080" w:themeColor="background1" w:themeShade="80" w:sz="4" w:space="0"/>
             </w:tcBorders>
             <w:shd w:val="clear" w:color="auto" w:fill="DDEBF7"/>
             <w:tcMar>
@@ -2132,12 +2158,12 @@
             </w:pPr>
             <w:r>
               <w:rPr>
-                <w:b/>
-                <w:bCs/>
-                <w:sz w:val="18"/>
-                <w:szCs w:val="18"/>
-              </w:rPr>
-              <w:t>x</w:t>
+                <w:b w:val="1"/>
+                <w:bCs w:val="1"/>
+                <w:sz w:val="18"/>
+                <w:szCs w:val="18"/>
+              </w:rPr>
+              <w:t>Total project cost involved (Rs. in lakh)</w:t>
             </w:r>
           </w:p>
         </w:tc>
@@ -2153,10 +2179,10 @@
           <w:tcPr>
             <w:tcW w:w="700" w:type="dxa"/>
             <w:tcBorders>
-              <w:top w:val="single" w:sz="4" w:space="0" w:color="808080"/>
-              <w:left w:val="single" w:sz="4" w:space="0" w:color="808080"/>
-              <w:bottom w:val="single" w:sz="4" w:space="0" w:color="808080"/>
-              <w:right w:val="single" w:sz="4" w:space="0" w:color="808080"/>
+              <w:top w:val="single" w:color="808080" w:themeColor="background1" w:themeShade="80" w:sz="4" w:space="0"/>
+              <w:left w:val="single" w:color="808080" w:themeColor="background1" w:themeShade="80" w:sz="4" w:space="0"/>
+              <w:bottom w:val="single" w:color="808080" w:themeColor="background1" w:themeShade="80" w:sz="4" w:space="0"/>
+              <w:right w:val="single" w:color="808080" w:themeColor="background1" w:themeShade="80" w:sz="4" w:space="0"/>
             </w:tcBorders>
             <w:tcMar>
               <w:top w:w="60" w:type="dxa"/>
@@ -2176,10 +2202,10 @@
           <w:tcPr>
             <w:tcW w:w="3800" w:type="dxa"/>
             <w:tcBorders>
-              <w:top w:val="single" w:sz="4" w:space="0" w:color="808080"/>
-              <w:left w:val="single" w:sz="4" w:space="0" w:color="808080"/>
-              <w:bottom w:val="single" w:sz="4" w:space="0" w:color="808080"/>
-              <w:right w:val="single" w:sz="4" w:space="0" w:color="808080"/>
+              <w:top w:val="single" w:color="808080" w:themeColor="background1" w:themeShade="80" w:sz="4" w:space="0"/>
+              <w:left w:val="single" w:color="808080" w:themeColor="background1" w:themeShade="80" w:sz="4" w:space="0"/>
+              <w:bottom w:val="single" w:color="808080" w:themeColor="background1" w:themeShade="80" w:sz="4" w:space="0"/>
+              <w:right w:val="single" w:color="808080" w:themeColor="background1" w:themeShade="80" w:sz="4" w:space="0"/>
             </w:tcBorders>
             <w:tcMar>
               <w:top w:w="60" w:type="dxa"/>
@@ -2215,10 +2241,10 @@
           <w:tcPr>
             <w:tcW w:w="2000" w:type="dxa"/>
             <w:tcBorders>
-              <w:top w:val="single" w:sz="4" w:space="0" w:color="808080"/>
-              <w:left w:val="single" w:sz="4" w:space="0" w:color="808080"/>
-              <w:bottom w:val="single" w:sz="4" w:space="0" w:color="808080"/>
-              <w:right w:val="single" w:sz="4" w:space="0" w:color="808080"/>
+              <w:top w:val="single" w:color="808080" w:themeColor="background1" w:themeShade="80" w:sz="4" w:space="0"/>
+              <w:left w:val="single" w:color="808080" w:themeColor="background1" w:themeShade="80" w:sz="4" w:space="0"/>
+              <w:bottom w:val="single" w:color="808080" w:themeColor="background1" w:themeShade="80" w:sz="4" w:space="0"/>
+              <w:right w:val="single" w:color="808080" w:themeColor="background1" w:themeShade="80" w:sz="4" w:space="0"/>
             </w:tcBorders>
             <w:tcMar>
               <w:top w:w="60" w:type="dxa"/>
@@ -2238,10 +2264,10 @@
           <w:tcPr>
             <w:tcW w:w="1900" w:type="dxa"/>
             <w:tcBorders>
-              <w:top w:val="single" w:sz="4" w:space="0" w:color="808080"/>
-              <w:left w:val="single" w:sz="4" w:space="0" w:color="808080"/>
-              <w:bottom w:val="single" w:sz="4" w:space="0" w:color="808080"/>
-              <w:right w:val="single" w:sz="4" w:space="0" w:color="808080"/>
+              <w:top w:val="single" w:color="808080" w:themeColor="background1" w:themeShade="80" w:sz="4" w:space="0"/>
+              <w:left w:val="single" w:color="808080" w:themeColor="background1" w:themeShade="80" w:sz="4" w:space="0"/>
+              <w:bottom w:val="single" w:color="808080" w:themeColor="background1" w:themeShade="80" w:sz="4" w:space="0"/>
+              <w:right w:val="single" w:color="808080" w:themeColor="background1" w:themeShade="80" w:sz="4" w:space="0"/>
             </w:tcBorders>
             <w:tcMar>
               <w:top w:w="60" w:type="dxa"/>
@@ -2261,10 +2287,10 @@
           <w:tcPr>
             <w:tcW w:w="2066" w:type="dxa"/>
             <w:tcBorders>
-              <w:top w:val="single" w:sz="4" w:space="0" w:color="808080"/>
-              <w:left w:val="single" w:sz="4" w:space="0" w:color="808080"/>
-              <w:bottom w:val="single" w:sz="4" w:space="0" w:color="808080"/>
-              <w:right w:val="single" w:sz="4" w:space="0" w:color="808080"/>
+              <w:top w:val="single" w:color="808080" w:themeColor="background1" w:themeShade="80" w:sz="4" w:space="0"/>
+              <w:left w:val="single" w:color="808080" w:themeColor="background1" w:themeShade="80" w:sz="4" w:space="0"/>
+              <w:bottom w:val="single" w:color="808080" w:themeColor="background1" w:themeShade="80" w:sz="4" w:space="0"/>
+              <w:right w:val="single" w:color="808080" w:themeColor="background1" w:themeShade="80" w:sz="4" w:space="0"/>
             </w:tcBorders>
             <w:tcMar>
               <w:top w:w="60" w:type="dxa"/>
@@ -2292,10 +2318,10 @@
           <w:tcPr>
             <w:tcW w:w="700" w:type="dxa"/>
             <w:tcBorders>
-              <w:top w:val="single" w:sz="4" w:space="0" w:color="808080"/>
-              <w:left w:val="single" w:sz="4" w:space="0" w:color="808080"/>
-              <w:bottom w:val="single" w:sz="4" w:space="0" w:color="808080"/>
-              <w:right w:val="single" w:sz="4" w:space="0" w:color="808080"/>
+              <w:top w:val="single" w:color="808080" w:themeColor="background1" w:themeShade="80" w:sz="4" w:space="0"/>
+              <w:left w:val="single" w:color="808080" w:themeColor="background1" w:themeShade="80" w:sz="4" w:space="0"/>
+              <w:bottom w:val="single" w:color="808080" w:themeColor="background1" w:themeShade="80" w:sz="4" w:space="0"/>
+              <w:right w:val="single" w:color="808080" w:themeColor="background1" w:themeShade="80" w:sz="4" w:space="0"/>
             </w:tcBorders>
             <w:tcMar>
               <w:top w:w="60" w:type="dxa"/>
@@ -2315,10 +2341,10 @@
           <w:tcPr>
             <w:tcW w:w="3800" w:type="dxa"/>
             <w:tcBorders>
-              <w:top w:val="single" w:sz="4" w:space="0" w:color="808080"/>
-              <w:left w:val="single" w:sz="4" w:space="0" w:color="808080"/>
-              <w:bottom w:val="single" w:sz="4" w:space="0" w:color="808080"/>
-              <w:right w:val="single" w:sz="4" w:space="0" w:color="808080"/>
+              <w:top w:val="single" w:color="808080" w:themeColor="background1" w:themeShade="80" w:sz="4" w:space="0"/>
+              <w:left w:val="single" w:color="808080" w:themeColor="background1" w:themeShade="80" w:sz="4" w:space="0"/>
+              <w:bottom w:val="single" w:color="808080" w:themeColor="background1" w:themeShade="80" w:sz="4" w:space="0"/>
+              <w:right w:val="single" w:color="808080" w:themeColor="background1" w:themeShade="80" w:sz="4" w:space="0"/>
             </w:tcBorders>
             <w:tcMar>
               <w:top w:w="60" w:type="dxa"/>
@@ -2345,10 +2371,10 @@
           <w:tcPr>
             <w:tcW w:w="2000" w:type="dxa"/>
             <w:tcBorders>
-              <w:top w:val="single" w:sz="4" w:space="0" w:color="808080"/>
-              <w:left w:val="single" w:sz="4" w:space="0" w:color="808080"/>
-              <w:bottom w:val="single" w:sz="4" w:space="0" w:color="808080"/>
-              <w:right w:val="single" w:sz="4" w:space="0" w:color="808080"/>
+              <w:top w:val="single" w:color="808080" w:themeColor="background1" w:themeShade="80" w:sz="4" w:space="0"/>
+              <w:left w:val="single" w:color="808080" w:themeColor="background1" w:themeShade="80" w:sz="4" w:space="0"/>
+              <w:bottom w:val="single" w:color="808080" w:themeColor="background1" w:themeShade="80" w:sz="4" w:space="0"/>
+              <w:right w:val="single" w:color="808080" w:themeColor="background1" w:themeShade="80" w:sz="4" w:space="0"/>
             </w:tcBorders>
             <w:tcMar>
               <w:top w:w="60" w:type="dxa"/>
@@ -2368,10 +2394,10 @@
           <w:tcPr>
             <w:tcW w:w="1900" w:type="dxa"/>
             <w:tcBorders>
-              <w:top w:val="single" w:sz="4" w:space="0" w:color="808080"/>
-              <w:left w:val="single" w:sz="4" w:space="0" w:color="808080"/>
-              <w:bottom w:val="single" w:sz="4" w:space="0" w:color="808080"/>
-              <w:right w:val="single" w:sz="4" w:space="0" w:color="808080"/>
+              <w:top w:val="single" w:color="808080" w:themeColor="background1" w:themeShade="80" w:sz="4" w:space="0"/>
+              <w:left w:val="single" w:color="808080" w:themeColor="background1" w:themeShade="80" w:sz="4" w:space="0"/>
+              <w:bottom w:val="single" w:color="808080" w:themeColor="background1" w:themeShade="80" w:sz="4" w:space="0"/>
+              <w:right w:val="single" w:color="808080" w:themeColor="background1" w:themeShade="80" w:sz="4" w:space="0"/>
             </w:tcBorders>
             <w:tcMar>
               <w:top w:w="60" w:type="dxa"/>
@@ -2391,10 +2417,10 @@
           <w:tcPr>
             <w:tcW w:w="2066" w:type="dxa"/>
             <w:tcBorders>
-              <w:top w:val="single" w:sz="4" w:space="0" w:color="808080"/>
-              <w:left w:val="single" w:sz="4" w:space="0" w:color="808080"/>
-              <w:bottom w:val="single" w:sz="4" w:space="0" w:color="808080"/>
-              <w:right w:val="single" w:sz="4" w:space="0" w:color="808080"/>
+              <w:top w:val="single" w:color="808080" w:themeColor="background1" w:themeShade="80" w:sz="4" w:space="0"/>
+              <w:left w:val="single" w:color="808080" w:themeColor="background1" w:themeShade="80" w:sz="4" w:space="0"/>
+              <w:bottom w:val="single" w:color="808080" w:themeColor="background1" w:themeShade="80" w:sz="4" w:space="0"/>
+              <w:right w:val="single" w:color="808080" w:themeColor="background1" w:themeShade="80" w:sz="4" w:space="0"/>
             </w:tcBorders>
             <w:tcMar>
               <w:top w:w="60" w:type="dxa"/>
@@ -2422,10 +2448,10 @@
           <w:tcPr>
             <w:tcW w:w="700" w:type="dxa"/>
             <w:tcBorders>
-              <w:top w:val="single" w:sz="4" w:space="0" w:color="808080"/>
-              <w:left w:val="single" w:sz="4" w:space="0" w:color="808080"/>
-              <w:bottom w:val="single" w:sz="4" w:space="0" w:color="808080"/>
-              <w:right w:val="single" w:sz="4" w:space="0" w:color="808080"/>
+              <w:top w:val="single" w:color="808080" w:themeColor="background1" w:themeShade="80" w:sz="4" w:space="0"/>
+              <w:left w:val="single" w:color="808080" w:themeColor="background1" w:themeShade="80" w:sz="4" w:space="0"/>
+              <w:bottom w:val="single" w:color="808080" w:themeColor="background1" w:themeShade="80" w:sz="4" w:space="0"/>
+              <w:right w:val="single" w:color="808080" w:themeColor="background1" w:themeShade="80" w:sz="4" w:space="0"/>
             </w:tcBorders>
             <w:tcMar>
               <w:top w:w="60" w:type="dxa"/>
@@ -2445,10 +2471,10 @@
           <w:tcPr>
             <w:tcW w:w="3800" w:type="dxa"/>
             <w:tcBorders>
-              <w:top w:val="single" w:sz="4" w:space="0" w:color="808080"/>
-              <w:left w:val="single" w:sz="4" w:space="0" w:color="808080"/>
-              <w:bottom w:val="single" w:sz="4" w:space="0" w:color="808080"/>
-              <w:right w:val="single" w:sz="4" w:space="0" w:color="808080"/>
+              <w:top w:val="single" w:color="808080" w:themeColor="background1" w:themeShade="80" w:sz="4" w:space="0"/>
+              <w:left w:val="single" w:color="808080" w:themeColor="background1" w:themeShade="80" w:sz="4" w:space="0"/>
+              <w:bottom w:val="single" w:color="808080" w:themeColor="background1" w:themeShade="80" w:sz="4" w:space="0"/>
+              <w:right w:val="single" w:color="808080" w:themeColor="background1" w:themeShade="80" w:sz="4" w:space="0"/>
             </w:tcBorders>
             <w:tcMar>
               <w:top w:w="60" w:type="dxa"/>
@@ -2475,10 +2501,10 @@
           <w:tcPr>
             <w:tcW w:w="2000" w:type="dxa"/>
             <w:tcBorders>
-              <w:top w:val="single" w:sz="4" w:space="0" w:color="808080"/>
-              <w:left w:val="single" w:sz="4" w:space="0" w:color="808080"/>
-              <w:bottom w:val="single" w:sz="4" w:space="0" w:color="808080"/>
-              <w:right w:val="single" w:sz="4" w:space="0" w:color="808080"/>
+              <w:top w:val="single" w:color="808080" w:themeColor="background1" w:themeShade="80" w:sz="4" w:space="0"/>
+              <w:left w:val="single" w:color="808080" w:themeColor="background1" w:themeShade="80" w:sz="4" w:space="0"/>
+              <w:bottom w:val="single" w:color="808080" w:themeColor="background1" w:themeShade="80" w:sz="4" w:space="0"/>
+              <w:right w:val="single" w:color="808080" w:themeColor="background1" w:themeShade="80" w:sz="4" w:space="0"/>
             </w:tcBorders>
             <w:tcMar>
               <w:top w:w="60" w:type="dxa"/>
@@ -2498,10 +2524,10 @@
           <w:tcPr>
             <w:tcW w:w="1900" w:type="dxa"/>
             <w:tcBorders>
-              <w:top w:val="single" w:sz="4" w:space="0" w:color="808080"/>
-              <w:left w:val="single" w:sz="4" w:space="0" w:color="808080"/>
-              <w:bottom w:val="single" w:sz="4" w:space="0" w:color="808080"/>
-              <w:right w:val="single" w:sz="4" w:space="0" w:color="808080"/>
+              <w:top w:val="single" w:color="808080" w:themeColor="background1" w:themeShade="80" w:sz="4" w:space="0"/>
+              <w:left w:val="single" w:color="808080" w:themeColor="background1" w:themeShade="80" w:sz="4" w:space="0"/>
+              <w:bottom w:val="single" w:color="808080" w:themeColor="background1" w:themeShade="80" w:sz="4" w:space="0"/>
+              <w:right w:val="single" w:color="808080" w:themeColor="background1" w:themeShade="80" w:sz="4" w:space="0"/>
             </w:tcBorders>
             <w:tcMar>
               <w:top w:w="60" w:type="dxa"/>
@@ -2521,10 +2547,10 @@
           <w:tcPr>
             <w:tcW w:w="2066" w:type="dxa"/>
             <w:tcBorders>
-              <w:top w:val="single" w:sz="4" w:space="0" w:color="808080"/>
-              <w:left w:val="single" w:sz="4" w:space="0" w:color="808080"/>
-              <w:bottom w:val="single" w:sz="4" w:space="0" w:color="808080"/>
-              <w:right w:val="single" w:sz="4" w:space="0" w:color="808080"/>
+              <w:top w:val="single" w:color="808080" w:themeColor="background1" w:themeShade="80" w:sz="4" w:space="0"/>
+              <w:left w:val="single" w:color="808080" w:themeColor="background1" w:themeShade="80" w:sz="4" w:space="0"/>
+              <w:bottom w:val="single" w:color="808080" w:themeColor="background1" w:themeShade="80" w:sz="4" w:space="0"/>
+              <w:right w:val="single" w:color="808080" w:themeColor="background1" w:themeShade="80" w:sz="4" w:space="0"/>
             </w:tcBorders>
             <w:tcMar>
               <w:top w:w="60" w:type="dxa"/>
@@ -2564,14 +2590,14 @@
     </w:p>
     <w:tbl>
       <w:tblPr>
-        <w:tblW w:w="10466" w:type="dxa"/>
+        <w:tblW w:w="9472" w:type="dxa"/>
         <w:tblBorders>
-          <w:top w:val="single" w:sz="4" w:space="0" w:color="auto"/>
-          <w:left w:val="single" w:sz="4" w:space="0" w:color="auto"/>
-          <w:bottom w:val="single" w:sz="4" w:space="0" w:color="auto"/>
-          <w:right w:val="single" w:sz="4" w:space="0" w:color="auto"/>
-          <w:insideH w:val="single" w:sz="4" w:space="0" w:color="auto"/>
-          <w:insideV w:val="single" w:sz="4" w:space="0" w:color="auto"/>
+          <w:top w:val="single" w:color="auto" w:sz="4" w:space="0"/>
+          <w:left w:val="single" w:color="auto" w:sz="4" w:space="0"/>
+          <w:bottom w:val="single" w:color="auto" w:sz="4" w:space="0"/>
+          <w:right w:val="single" w:color="auto" w:sz="4" w:space="0"/>
+          <w:insideH w:val="single" w:color="auto" w:sz="4" w:space="0"/>
+          <w:insideV w:val="single" w:color="auto" w:sz="4" w:space="0"/>
         </w:tblBorders>
         <w:tblLayout w:type="fixed"/>
         <w:tblCellMar>
@@ -2581,15 +2607,15 @@
         <w:tblLook w:val="04A0" w:firstRow="1" w:lastRow="0" w:firstColumn="1" w:lastColumn="0" w:noHBand="0" w:noVBand="1"/>
       </w:tblPr>
       <w:tblGrid>
-        <w:gridCol w:w="500"/>
-        <w:gridCol w:w="1300"/>
-        <w:gridCol w:w="1400"/>
-        <w:gridCol w:w="1000"/>
-        <w:gridCol w:w="1000"/>
-        <w:gridCol w:w="1000"/>
-        <w:gridCol w:w="1266"/>
-        <w:gridCol w:w="1150"/>
-        <w:gridCol w:w="1850"/>
+        <w:gridCol w:w="456"/>
+        <w:gridCol w:w="1187"/>
+        <w:gridCol w:w="1278"/>
+        <w:gridCol w:w="1020"/>
+        <w:gridCol w:w="806"/>
+        <w:gridCol w:w="1140"/>
+        <w:gridCol w:w="1095"/>
+        <w:gridCol w:w="1110"/>
+        <w:gridCol w:w="1380"/>
       </w:tblGrid>
       <w:tr>
         <w:tblPrEx>
@@ -2600,15 +2626,16 @@
         </w:tblPrEx>
         <w:trPr>
           <w:tblHeader/>
+          <w:trHeight w:val="300"/>
         </w:trPr>
         <w:tc>
           <w:tcPr>
-            <w:tcW w:w="500" w:type="dxa"/>
-            <w:tcBorders>
-              <w:top w:val="single" w:sz="4" w:space="0" w:color="808080"/>
-              <w:left w:val="single" w:sz="4" w:space="0" w:color="808080"/>
-              <w:bottom w:val="single" w:sz="4" w:space="0" w:color="808080"/>
-              <w:right w:val="single" w:sz="4" w:space="0" w:color="808080"/>
+            <w:tcW w:w="456" w:type="dxa"/>
+            <w:tcBorders>
+              <w:top w:val="single" w:color="808080" w:themeColor="background1" w:themeShade="80" w:sz="4" w:space="0"/>
+              <w:left w:val="single" w:color="808080" w:themeColor="background1" w:themeShade="80" w:sz="4" w:space="0"/>
+              <w:bottom w:val="single" w:color="808080" w:themeColor="background1" w:themeShade="80" w:sz="4" w:space="0"/>
+              <w:right w:val="single" w:color="808080" w:themeColor="background1" w:themeShade="80" w:sz="4" w:space="0"/>
             </w:tcBorders>
             <w:shd w:val="clear" w:color="auto" w:fill="DDEBF7"/>
             <w:tcMar>
@@ -2636,12 +2663,12 @@
         </w:tc>
         <w:tc>
           <w:tcPr>
-            <w:tcW w:w="1300" w:type="dxa"/>
-            <w:tcBorders>
-              <w:top w:val="single" w:sz="4" w:space="0" w:color="808080"/>
-              <w:left w:val="single" w:sz="4" w:space="0" w:color="808080"/>
-              <w:bottom w:val="single" w:sz="4" w:space="0" w:color="808080"/>
-              <w:right w:val="single" w:sz="4" w:space="0" w:color="808080"/>
+            <w:tcW w:w="1187" w:type="dxa"/>
+            <w:tcBorders>
+              <w:top w:val="single" w:color="808080" w:themeColor="background1" w:themeShade="80" w:sz="4" w:space="0"/>
+              <w:left w:val="single" w:color="808080" w:themeColor="background1" w:themeShade="80" w:sz="4" w:space="0"/>
+              <w:bottom w:val="single" w:color="808080" w:themeColor="background1" w:themeShade="80" w:sz="4" w:space="0"/>
+              <w:right w:val="single" w:color="808080" w:themeColor="background1" w:themeShade="80" w:sz="4" w:space="0"/>
             </w:tcBorders>
             <w:shd w:val="clear" w:color="auto" w:fill="DDEBF7"/>
             <w:tcMar>
@@ -2666,12 +2693,12 @@
         </w:tc>
         <w:tc>
           <w:tcPr>
-            <w:tcW w:w="1400" w:type="dxa"/>
-            <w:tcBorders>
-              <w:top w:val="single" w:sz="4" w:space="0" w:color="808080"/>
-              <w:left w:val="single" w:sz="4" w:space="0" w:color="808080"/>
-              <w:bottom w:val="single" w:sz="4" w:space="0" w:color="808080"/>
-              <w:right w:val="single" w:sz="4" w:space="0" w:color="808080"/>
+            <w:tcW w:w="1278" w:type="dxa"/>
+            <w:tcBorders>
+              <w:top w:val="single" w:color="808080" w:themeColor="background1" w:themeShade="80" w:sz="4" w:space="0"/>
+              <w:left w:val="single" w:color="808080" w:themeColor="background1" w:themeShade="80" w:sz="4" w:space="0"/>
+              <w:bottom w:val="single" w:color="808080" w:themeColor="background1" w:themeShade="80" w:sz="4" w:space="0"/>
+              <w:right w:val="single" w:color="808080" w:themeColor="background1" w:themeShade="80" w:sz="4" w:space="0"/>
             </w:tcBorders>
             <w:shd w:val="clear" w:color="auto" w:fill="DDEBF7"/>
             <w:tcMar>
@@ -2699,12 +2726,54 @@
         </w:tc>
         <w:tc>
           <w:tcPr>
-            <w:tcW w:w="1000" w:type="dxa"/>
-            <w:tcBorders>
-              <w:top w:val="single" w:sz="4" w:space="0" w:color="808080"/>
-              <w:left w:val="single" w:sz="4" w:space="0" w:color="808080"/>
-              <w:bottom w:val="single" w:sz="4" w:space="0" w:color="808080"/>
-              <w:right w:val="single" w:sz="4" w:space="0" w:color="808080"/>
+            <w:tcW w:w="1020" w:type="dxa"/>
+            <w:tcBorders>
+              <w:top w:val="single" w:color="808080" w:themeColor="background1" w:themeShade="80" w:sz="4" w:space="0"/>
+              <w:left w:val="single" w:color="808080" w:themeColor="background1" w:themeShade="80" w:sz="4" w:space="0"/>
+              <w:bottom w:val="single" w:color="808080" w:themeColor="background1" w:themeShade="80" w:sz="4" w:space="0"/>
+              <w:right w:val="single" w:color="808080" w:themeColor="background1" w:themeShade="80" w:sz="4" w:space="0"/>
+            </w:tcBorders>
+            <w:shd w:val="clear" w:color="auto" w:fill="DDEBF7"/>
+            <w:tcMar>
+              <w:top w:w="60" w:type="dxa"/>
+              <w:left w:w="80" w:type="dxa"/>
+              <w:bottom w:w="60" w:type="dxa"/>
+              <w:right w:w="80" w:type="dxa"/>
+            </w:tcMar>
+            <w:vAlign w:val="center"/>
+          </w:tcPr>
+          <w:p>
+            <w:pPr>
+              <w:jc w:val="center"/>
+            </w:pPr>
+            <w:r>
+              <w:rPr>
+                <w:b w:val="1"/>
+                <w:bCs w:val="1"/>
+                <w:sz w:val="18"/>
+                <w:szCs w:val="18"/>
+              </w:rPr>
+              <w:t>Is DPR prepared?</w:t>
+            </w:r>
+            <w:r>
+              <w:rPr>
+                <w:b w:val="1"/>
+                <w:bCs w:val="1"/>
+                <w:sz w:val="18"/>
+                <w:szCs w:val="18"/>
+              </w:rPr>
+              <w:t xml:space="preserve"> (Yes/No)</w:t>
+            </w:r>
+          </w:p>
+        </w:tc>
+        <w:tc>
+          <w:tcPr>
+            <w:tcW w:w="806" w:type="dxa"/>
+            <w:tcBorders>
+              <w:top w:val="single" w:color="808080" w:themeColor="background1" w:themeShade="80" w:sz="4" w:space="0"/>
+              <w:left w:val="single" w:color="808080" w:themeColor="background1" w:themeShade="80" w:sz="4" w:space="0"/>
+              <w:bottom w:val="single" w:color="808080" w:themeColor="background1" w:themeShade="80" w:sz="4" w:space="0"/>
+              <w:right w:val="single" w:color="808080" w:themeColor="background1" w:themeShade="80" w:sz="4" w:space="0"/>
             </w:tcBorders>
             <w:shd w:val="clear" w:color="auto" w:fill="DDEBF7"/>
             <w:tcMar>
@@ -2726,18 +2795,84 @@
                 <w:sz w:val="18"/>
                 <w:szCs w:val="18"/>
               </w:rPr>
-              <w:t>Is DPR prepared?</w:t>
-            </w:r>
-          </w:p>
-        </w:tc>
-        <w:tc>
-          <w:tcPr>
-            <w:tcW w:w="1000" w:type="dxa"/>
-            <w:tcBorders>
-              <w:top w:val="single" w:sz="4" w:space="0" w:color="808080"/>
-              <w:left w:val="single" w:sz="4" w:space="0" w:color="808080"/>
-              <w:bottom w:val="single" w:sz="4" w:space="0" w:color="808080"/>
-              <w:right w:val="single" w:sz="4" w:space="0" w:color="808080"/>
+              <w:t>Total Project Cost</w:t>
+            </w:r>
+          </w:p>
+        </w:tc>
+        <w:tc>
+          <w:tcPr>
+            <w:tcW w:w="1140" w:type="dxa"/>
+            <w:tcBorders>
+              <w:top w:val="single" w:color="808080" w:themeColor="background1" w:themeShade="80" w:sz="4" w:space="0"/>
+              <w:left w:val="single" w:color="808080" w:themeColor="background1" w:themeShade="80" w:sz="4" w:space="0"/>
+              <w:bottom w:val="single" w:color="808080" w:themeColor="background1" w:themeShade="80" w:sz="4" w:space="0"/>
+              <w:right w:val="single" w:color="808080" w:themeColor="background1" w:themeShade="80" w:sz="4" w:space="0"/>
+            </w:tcBorders>
+            <w:shd w:val="clear" w:color="auto" w:fill="DDEBF7"/>
+            <w:tcMar>
+              <w:top w:w="60" w:type="dxa"/>
+              <w:left w:w="80" w:type="dxa"/>
+              <w:bottom w:w="60" w:type="dxa"/>
+              <w:right w:w="80" w:type="dxa"/>
+            </w:tcMar>
+            <w:vAlign w:val="center"/>
+          </w:tcPr>
+          <w:p>
+            <w:pPr>
+              <w:jc w:val="center"/>
+            </w:pPr>
+            <w:r>
+              <w:rPr>
+                <w:b w:val="1"/>
+                <w:bCs w:val="1"/>
+                <w:sz w:val="18"/>
+                <w:szCs w:val="18"/>
+              </w:rPr>
+              <w:t>Expenditure incurred out of total FC Grant</w:t>
+            </w:r>
+          </w:p>
+        </w:tc>
+        <w:tc>
+          <w:tcPr>
+            <w:tcW w:w="1095" w:type="dxa"/>
+            <w:tcBorders>
+              <w:top w:val="single" w:color="808080" w:themeColor="background1" w:themeShade="80" w:sz="4"/>
+              <w:left w:val="single" w:color="808080" w:themeColor="background1" w:themeShade="80" w:sz="4"/>
+              <w:bottom w:val="single" w:color="808080" w:themeColor="background1" w:themeShade="80" w:sz="4"/>
+              <w:right w:val="single" w:color="808080" w:themeColor="background1" w:themeShade="80" w:sz="4"/>
+            </w:tcBorders>
+            <w:shd w:val="clear" w:color="auto" w:fill="DDEBF7"/>
+            <w:tcMar>
+              <w:top w:w="60" w:type="dxa"/>
+              <w:left w:w="80" w:type="dxa"/>
+              <w:bottom w:w="60" w:type="dxa"/>
+              <w:right w:w="80" w:type="dxa"/>
+            </w:tcMar>
+            <w:vAlign w:val="center"/>
+          </w:tcPr>
+          <w:p>
+            <w:pPr>
+              <w:jc w:val="center"/>
+            </w:pPr>
+            <w:r>
+              <w:rPr>
+                <w:b w:val="1"/>
+                <w:bCs w:val="1"/>
+                <w:sz w:val="18"/>
+                <w:szCs w:val="18"/>
+              </w:rPr>
+              <w:t>% of FC grants in the total project cost</w:t>
+            </w:r>
+          </w:p>
+        </w:tc>
+        <w:tc>
+          <w:tcPr>
+            <w:tcW w:w="1110" w:type="dxa"/>
+            <w:tcBorders>
+              <w:top w:val="single" w:color="808080" w:themeColor="background1" w:themeShade="80" w:sz="4" w:space="0"/>
+              <w:left w:val="single" w:color="808080" w:themeColor="background1" w:themeShade="80" w:sz="4" w:space="0"/>
+              <w:bottom w:val="single" w:color="808080" w:themeColor="background1" w:themeShade="80" w:sz="4" w:space="0"/>
+              <w:right w:val="single" w:color="808080" w:themeColor="background1" w:themeShade="80" w:sz="4" w:space="0"/>
             </w:tcBorders>
             <w:shd w:val="clear" w:color="auto" w:fill="DDEBF7"/>
             <w:tcMar>
@@ -2759,18 +2894,18 @@
                 <w:sz w:val="18"/>
                 <w:szCs w:val="18"/>
               </w:rPr>
-              <w:t>Total Project Cost</w:t>
-            </w:r>
-          </w:p>
-        </w:tc>
-        <w:tc>
-          <w:tcPr>
-            <w:tcW w:w="1000" w:type="dxa"/>
-            <w:tcBorders>
-              <w:top w:val="single" w:sz="4" w:space="0" w:color="808080"/>
-              <w:left w:val="single" w:sz="4" w:space="0" w:color="808080"/>
-              <w:bottom w:val="single" w:sz="4" w:space="0" w:color="808080"/>
-              <w:right w:val="single" w:sz="4" w:space="0" w:color="808080"/>
+              <w:t>% of Physical Completion</w:t>
+            </w:r>
+          </w:p>
+        </w:tc>
+        <w:tc>
+          <w:tcPr>
+            <w:tcW w:w="1380" w:type="dxa"/>
+            <w:tcBorders>
+              <w:top w:val="single" w:color="808080" w:themeColor="background1" w:themeShade="80" w:sz="4" w:space="0"/>
+              <w:left w:val="single" w:color="808080" w:themeColor="background1" w:themeShade="80" w:sz="4" w:space="0"/>
+              <w:bottom w:val="single" w:color="808080" w:themeColor="background1" w:themeShade="80" w:sz="4" w:space="0"/>
+              <w:right w:val="single" w:color="808080" w:themeColor="background1" w:themeShade="80" w:sz="4" w:space="0"/>
             </w:tcBorders>
             <w:shd w:val="clear" w:color="auto" w:fill="DDEBF7"/>
             <w:tcMar>
@@ -2782,113 +2917,32 @@
             <w:vAlign w:val="center"/>
           </w:tcPr>
           <w:p>
-            <w:pPr>
-              <w:jc w:val="center"/>
-            </w:pPr>
-            <w:r>
-              <w:rPr>
-                <w:b/>
-                <w:bCs/>
-                <w:sz w:val="18"/>
-                <w:szCs w:val="18"/>
-              </w:rPr>
-              <w:t>% of FC grants in the total project cost</w:t>
-            </w:r>
-          </w:p>
-        </w:tc>
-        <w:tc>
-          <w:tcPr>
-            <w:tcW w:w="1266" w:type="dxa"/>
-            <w:tcBorders>
-              <w:top w:val="single" w:sz="4" w:space="0" w:color="808080"/>
-              <w:left w:val="single" w:sz="4" w:space="0" w:color="808080"/>
-              <w:bottom w:val="single" w:sz="4" w:space="0" w:color="808080"/>
-              <w:right w:val="single" w:sz="4" w:space="0" w:color="808080"/>
-            </w:tcBorders>
-            <w:shd w:val="clear" w:color="auto" w:fill="DDEBF7"/>
-            <w:tcMar>
-              <w:top w:w="60" w:type="dxa"/>
-              <w:left w:w="80" w:type="dxa"/>
-              <w:bottom w:w="60" w:type="dxa"/>
-              <w:right w:w="80" w:type="dxa"/>
-            </w:tcMar>
-            <w:vAlign w:val="center"/>
-          </w:tcPr>
-          <w:p>
-            <w:pPr>
-              <w:jc w:val="center"/>
-            </w:pPr>
-            <w:r>
-              <w:rPr>
-                <w:b/>
-                <w:bCs/>
-                <w:sz w:val="18"/>
-                <w:szCs w:val="18"/>
-              </w:rPr>
-              <w:t>Expenditure incurred out of total FC Grant</w:t>
-            </w:r>
-          </w:p>
-        </w:tc>
-        <w:tc>
-          <w:tcPr>
-            <w:tcW w:w="1150" w:type="dxa"/>
-            <w:tcBorders>
-              <w:top w:val="single" w:sz="4" w:space="0" w:color="808080"/>
-              <w:left w:val="single" w:sz="4" w:space="0" w:color="808080"/>
-              <w:bottom w:val="single" w:sz="4" w:space="0" w:color="808080"/>
-              <w:right w:val="single" w:sz="4" w:space="0" w:color="808080"/>
-            </w:tcBorders>
-            <w:shd w:val="clear" w:color="auto" w:fill="DDEBF7"/>
-            <w:tcMar>
-              <w:top w:w="60" w:type="dxa"/>
-              <w:left w:w="80" w:type="dxa"/>
-              <w:bottom w:w="60" w:type="dxa"/>
-              <w:right w:w="80" w:type="dxa"/>
-            </w:tcMar>
-            <w:vAlign w:val="center"/>
-          </w:tcPr>
-          <w:p>
-            <w:pPr>
-              <w:jc w:val="center"/>
-            </w:pPr>
-            <w:r>
-              <w:rPr>
-                <w:b/>
-                <w:bCs/>
-                <w:sz w:val="18"/>
-                <w:szCs w:val="18"/>
-              </w:rPr>
-              <w:t>% of Physical Completion</w:t>
-            </w:r>
-          </w:p>
-        </w:tc>
-        <w:tc>
-          <w:tcPr>
-            <w:tcW w:w="1850" w:type="dxa"/>
-            <w:tcBorders>
-              <w:top w:val="single" w:sz="4" w:space="0" w:color="808080"/>
-              <w:left w:val="single" w:sz="4" w:space="0" w:color="808080"/>
-              <w:bottom w:val="single" w:sz="4" w:space="0" w:color="808080"/>
-              <w:right w:val="single" w:sz="4" w:space="0" w:color="808080"/>
-            </w:tcBorders>
-            <w:shd w:val="clear" w:color="auto" w:fill="DDEBF7"/>
-            <w:tcMar>
-              <w:top w:w="60" w:type="dxa"/>
-              <w:left w:w="80" w:type="dxa"/>
-              <w:bottom w:w="60" w:type="dxa"/>
-              <w:right w:w="80" w:type="dxa"/>
-            </w:tcMar>
-            <w:vAlign w:val="center"/>
-          </w:tcPr>
-          <w:p>
-            <w:r>
-              <w:rPr>
-                <w:b/>
-                <w:bCs/>
-                <w:sz w:val="18"/>
-                <w:szCs w:val="18"/>
-              </w:rPr>
-              <w:t>Location [Geo-fencing &amp; Geo-tagging of the project with pictures]</w:t>
+            <w:r>
+              <w:rPr>
+                <w:b w:val="1"/>
+                <w:bCs w:val="1"/>
+                <w:sz w:val="18"/>
+                <w:szCs w:val="18"/>
+              </w:rPr>
+              <w:t xml:space="preserve">Project </w:t>
+            </w:r>
+            <w:r>
+              <w:rPr>
+                <w:b w:val="1"/>
+                <w:bCs w:val="1"/>
+                <w:sz w:val="18"/>
+                <w:szCs w:val="18"/>
+              </w:rPr>
+              <w:t>Location [</w:t>
+            </w:r>
+            <w:r>
+              <w:rPr>
+                <w:b w:val="1"/>
+                <w:bCs w:val="1"/>
+                <w:sz w:val="18"/>
+                <w:szCs w:val="18"/>
+              </w:rPr>
+              <w:t>Latitude &amp; Longitude]</w:t>
             </w:r>
           </w:p>
         </w:tc>
@@ -2900,14 +2954,17 @@
             <w:bottom w:w="0" w:type="dxa"/>
           </w:tblCellMar>
         </w:tblPrEx>
-        <w:tc>
-          <w:tcPr>
-            <w:tcW w:w="500" w:type="dxa"/>
-            <w:tcBorders>
-              <w:top w:val="single" w:sz="4" w:space="0" w:color="808080"/>
-              <w:left w:val="single" w:sz="4" w:space="0" w:color="808080"/>
-              <w:bottom w:val="single" w:sz="4" w:space="0" w:color="808080"/>
-              <w:right w:val="single" w:sz="4" w:space="0" w:color="808080"/>
+        <w:trPr>
+          <w:trHeight w:val="300"/>
+        </w:trPr>
+        <w:tc>
+          <w:tcPr>
+            <w:tcW w:w="456" w:type="dxa"/>
+            <w:tcBorders>
+              <w:top w:val="single" w:color="808080" w:themeColor="background1" w:themeShade="80" w:sz="4" w:space="0"/>
+              <w:left w:val="single" w:color="808080" w:themeColor="background1" w:themeShade="80" w:sz="4" w:space="0"/>
+              <w:bottom w:val="single" w:color="808080" w:themeColor="background1" w:themeShade="80" w:sz="4" w:space="0"/>
+              <w:right w:val="single" w:color="808080" w:themeColor="background1" w:themeShade="80" w:sz="4" w:space="0"/>
             </w:tcBorders>
             <w:tcMar>
               <w:top w:w="60" w:type="dxa"/>
@@ -2932,12 +2989,12 @@
         </w:tc>
         <w:tc>
           <w:tcPr>
-            <w:tcW w:w="1300" w:type="dxa"/>
-            <w:tcBorders>
-              <w:top w:val="single" w:sz="4" w:space="0" w:color="808080"/>
-              <w:left w:val="single" w:sz="4" w:space="0" w:color="808080"/>
-              <w:bottom w:val="single" w:sz="4" w:space="0" w:color="808080"/>
-              <w:right w:val="single" w:sz="4" w:space="0" w:color="808080"/>
+            <w:tcW w:w="1187" w:type="dxa"/>
+            <w:tcBorders>
+              <w:top w:val="single" w:color="808080" w:themeColor="background1" w:themeShade="80" w:sz="4" w:space="0"/>
+              <w:left w:val="single" w:color="808080" w:themeColor="background1" w:themeShade="80" w:sz="4" w:space="0"/>
+              <w:bottom w:val="single" w:color="808080" w:themeColor="background1" w:themeShade="80" w:sz="4" w:space="0"/>
+              <w:right w:val="single" w:color="808080" w:themeColor="background1" w:themeShade="80" w:sz="4" w:space="0"/>
             </w:tcBorders>
             <w:tcMar>
               <w:top w:w="60" w:type="dxa"/>
@@ -2951,12 +3008,12 @@
         </w:tc>
         <w:tc>
           <w:tcPr>
-            <w:tcW w:w="1400" w:type="dxa"/>
-            <w:tcBorders>
-              <w:top w:val="single" w:sz="4" w:space="0" w:color="808080"/>
-              <w:left w:val="single" w:sz="4" w:space="0" w:color="808080"/>
-              <w:bottom w:val="single" w:sz="4" w:space="0" w:color="808080"/>
-              <w:right w:val="single" w:sz="4" w:space="0" w:color="808080"/>
+            <w:tcW w:w="1278" w:type="dxa"/>
+            <w:tcBorders>
+              <w:top w:val="single" w:color="808080" w:themeColor="background1" w:themeShade="80" w:sz="4" w:space="0"/>
+              <w:left w:val="single" w:color="808080" w:themeColor="background1" w:themeShade="80" w:sz="4" w:space="0"/>
+              <w:bottom w:val="single" w:color="808080" w:themeColor="background1" w:themeShade="80" w:sz="4" w:space="0"/>
+              <w:right w:val="single" w:color="808080" w:themeColor="background1" w:themeShade="80" w:sz="4" w:space="0"/>
             </w:tcBorders>
             <w:tcMar>
               <w:top w:w="60" w:type="dxa"/>
@@ -2970,12 +3027,12 @@
         </w:tc>
         <w:tc>
           <w:tcPr>
-            <w:tcW w:w="1000" w:type="dxa"/>
-            <w:tcBorders>
-              <w:top w:val="single" w:sz="4" w:space="0" w:color="808080"/>
-              <w:left w:val="single" w:sz="4" w:space="0" w:color="808080"/>
-              <w:bottom w:val="single" w:sz="4" w:space="0" w:color="808080"/>
-              <w:right w:val="single" w:sz="4" w:space="0" w:color="808080"/>
+            <w:tcW w:w="1020" w:type="dxa"/>
+            <w:tcBorders>
+              <w:top w:val="single" w:color="808080" w:themeColor="background1" w:themeShade="80" w:sz="4" w:space="0"/>
+              <w:left w:val="single" w:color="808080" w:themeColor="background1" w:themeShade="80" w:sz="4" w:space="0"/>
+              <w:bottom w:val="single" w:color="808080" w:themeColor="background1" w:themeShade="80" w:sz="4" w:space="0"/>
+              <w:right w:val="single" w:color="808080" w:themeColor="background1" w:themeShade="80" w:sz="4" w:space="0"/>
             </w:tcBorders>
             <w:tcMar>
               <w:top w:w="60" w:type="dxa"/>
@@ -2989,12 +3046,12 @@
         </w:tc>
         <w:tc>
           <w:tcPr>
-            <w:tcW w:w="1000" w:type="dxa"/>
-            <w:tcBorders>
-              <w:top w:val="single" w:sz="4" w:space="0" w:color="808080"/>
-              <w:left w:val="single" w:sz="4" w:space="0" w:color="808080"/>
-              <w:bottom w:val="single" w:sz="4" w:space="0" w:color="808080"/>
-              <w:right w:val="single" w:sz="4" w:space="0" w:color="808080"/>
+            <w:tcW w:w="806" w:type="dxa"/>
+            <w:tcBorders>
+              <w:top w:val="single" w:color="808080" w:themeColor="background1" w:themeShade="80" w:sz="4" w:space="0"/>
+              <w:left w:val="single" w:color="808080" w:themeColor="background1" w:themeShade="80" w:sz="4" w:space="0"/>
+              <w:bottom w:val="single" w:color="808080" w:themeColor="background1" w:themeShade="80" w:sz="4" w:space="0"/>
+              <w:right w:val="single" w:color="808080" w:themeColor="background1" w:themeShade="80" w:sz="4" w:space="0"/>
             </w:tcBorders>
             <w:tcMar>
               <w:top w:w="60" w:type="dxa"/>
@@ -3008,12 +3065,12 @@
         </w:tc>
         <w:tc>
           <w:tcPr>
-            <w:tcW w:w="1000" w:type="dxa"/>
-            <w:tcBorders>
-              <w:top w:val="single" w:sz="4" w:space="0" w:color="808080"/>
-              <w:left w:val="single" w:sz="4" w:space="0" w:color="808080"/>
-              <w:bottom w:val="single" w:sz="4" w:space="0" w:color="808080"/>
-              <w:right w:val="single" w:sz="4" w:space="0" w:color="808080"/>
+            <w:tcW w:w="1140" w:type="dxa"/>
+            <w:tcBorders>
+              <w:top w:val="single" w:color="808080" w:themeColor="background1" w:themeShade="80" w:sz="4" w:space="0"/>
+              <w:left w:val="single" w:color="808080" w:themeColor="background1" w:themeShade="80" w:sz="4" w:space="0"/>
+              <w:bottom w:val="single" w:color="808080" w:themeColor="background1" w:themeShade="80" w:sz="4" w:space="0"/>
+              <w:right w:val="single" w:color="808080" w:themeColor="background1" w:themeShade="80" w:sz="4" w:space="0"/>
             </w:tcBorders>
             <w:tcMar>
               <w:top w:w="60" w:type="dxa"/>
@@ -3027,12 +3084,12 @@
         </w:tc>
         <w:tc>
           <w:tcPr>
-            <w:tcW w:w="1266" w:type="dxa"/>
-            <w:tcBorders>
-              <w:top w:val="single" w:sz="4" w:space="0" w:color="808080"/>
-              <w:left w:val="single" w:sz="4" w:space="0" w:color="808080"/>
-              <w:bottom w:val="single" w:sz="4" w:space="0" w:color="808080"/>
-              <w:right w:val="single" w:sz="4" w:space="0" w:color="808080"/>
+            <w:tcW w:w="1095" w:type="dxa"/>
+            <w:tcBorders>
+              <w:top w:val="single" w:color="808080" w:themeColor="background1" w:themeShade="80" w:sz="4"/>
+              <w:left w:val="single" w:color="808080" w:themeColor="background1" w:themeShade="80" w:sz="4"/>
+              <w:bottom w:val="single" w:color="808080" w:themeColor="background1" w:themeShade="80" w:sz="4"/>
+              <w:right w:val="single" w:color="808080" w:themeColor="background1" w:themeShade="80" w:sz="4"/>
             </w:tcBorders>
             <w:tcMar>
               <w:top w:w="60" w:type="dxa"/>
@@ -3046,12 +3103,12 @@
         </w:tc>
         <w:tc>
           <w:tcPr>
-            <w:tcW w:w="1150" w:type="dxa"/>
-            <w:tcBorders>
-              <w:top w:val="single" w:sz="4" w:space="0" w:color="808080"/>
-              <w:left w:val="single" w:sz="4" w:space="0" w:color="808080"/>
-              <w:bottom w:val="single" w:sz="4" w:space="0" w:color="808080"/>
-              <w:right w:val="single" w:sz="4" w:space="0" w:color="808080"/>
+            <w:tcW w:w="1110" w:type="dxa"/>
+            <w:tcBorders>
+              <w:top w:val="single" w:color="808080" w:themeColor="background1" w:themeShade="80" w:sz="4" w:space="0"/>
+              <w:left w:val="single" w:color="808080" w:themeColor="background1" w:themeShade="80" w:sz="4" w:space="0"/>
+              <w:bottom w:val="single" w:color="808080" w:themeColor="background1" w:themeShade="80" w:sz="4" w:space="0"/>
+              <w:right w:val="single" w:color="808080" w:themeColor="background1" w:themeShade="80" w:sz="4" w:space="0"/>
             </w:tcBorders>
             <w:tcMar>
               <w:top w:w="60" w:type="dxa"/>
@@ -3065,12 +3122,12 @@
         </w:tc>
         <w:tc>
           <w:tcPr>
-            <w:tcW w:w="1850" w:type="dxa"/>
-            <w:tcBorders>
-              <w:top w:val="single" w:sz="4" w:space="0" w:color="808080"/>
-              <w:left w:val="single" w:sz="4" w:space="0" w:color="808080"/>
-              <w:bottom w:val="single" w:sz="4" w:space="0" w:color="808080"/>
-              <w:right w:val="single" w:sz="4" w:space="0" w:color="808080"/>
+            <w:tcW w:w="1380" w:type="dxa"/>
+            <w:tcBorders>
+              <w:top w:val="single" w:color="808080" w:themeColor="background1" w:themeShade="80" w:sz="4" w:space="0"/>
+              <w:left w:val="single" w:color="808080" w:themeColor="background1" w:themeShade="80" w:sz="4" w:space="0"/>
+              <w:bottom w:val="single" w:color="808080" w:themeColor="background1" w:themeShade="80" w:sz="4" w:space="0"/>
+              <w:right w:val="single" w:color="808080" w:themeColor="background1" w:themeShade="80" w:sz="4" w:space="0"/>
             </w:tcBorders>
             <w:tcMar>
               <w:top w:w="60" w:type="dxa"/>
@@ -3090,14 +3147,17 @@
             <w:bottom w:w="0" w:type="dxa"/>
           </w:tblCellMar>
         </w:tblPrEx>
-        <w:tc>
-          <w:tcPr>
-            <w:tcW w:w="500" w:type="dxa"/>
-            <w:tcBorders>
-              <w:top w:val="single" w:sz="4" w:space="0" w:color="808080"/>
-              <w:left w:val="single" w:sz="4" w:space="0" w:color="808080"/>
-              <w:bottom w:val="single" w:sz="4" w:space="0" w:color="808080"/>
-              <w:right w:val="single" w:sz="4" w:space="0" w:color="808080"/>
+        <w:trPr>
+          <w:trHeight w:val="300"/>
+        </w:trPr>
+        <w:tc>
+          <w:tcPr>
+            <w:tcW w:w="456" w:type="dxa"/>
+            <w:tcBorders>
+              <w:top w:val="single" w:color="808080" w:themeColor="background1" w:themeShade="80" w:sz="4" w:space="0"/>
+              <w:left w:val="single" w:color="808080" w:themeColor="background1" w:themeShade="80" w:sz="4" w:space="0"/>
+              <w:bottom w:val="single" w:color="808080" w:themeColor="background1" w:themeShade="80" w:sz="4" w:space="0"/>
+              <w:right w:val="single" w:color="808080" w:themeColor="background1" w:themeShade="80" w:sz="4" w:space="0"/>
             </w:tcBorders>
             <w:tcMar>
               <w:top w:w="60" w:type="dxa"/>
@@ -3122,12 +3182,12 @@
         </w:tc>
         <w:tc>
           <w:tcPr>
-            <w:tcW w:w="1300" w:type="dxa"/>
-            <w:tcBorders>
-              <w:top w:val="single" w:sz="4" w:space="0" w:color="808080"/>
-              <w:left w:val="single" w:sz="4" w:space="0" w:color="808080"/>
-              <w:bottom w:val="single" w:sz="4" w:space="0" w:color="808080"/>
-              <w:right w:val="single" w:sz="4" w:space="0" w:color="808080"/>
+            <w:tcW w:w="1187" w:type="dxa"/>
+            <w:tcBorders>
+              <w:top w:val="single" w:color="808080" w:themeColor="background1" w:themeShade="80" w:sz="4" w:space="0"/>
+              <w:left w:val="single" w:color="808080" w:themeColor="background1" w:themeShade="80" w:sz="4" w:space="0"/>
+              <w:bottom w:val="single" w:color="808080" w:themeColor="background1" w:themeShade="80" w:sz="4" w:space="0"/>
+              <w:right w:val="single" w:color="808080" w:themeColor="background1" w:themeShade="80" w:sz="4" w:space="0"/>
             </w:tcBorders>
             <w:tcMar>
               <w:top w:w="60" w:type="dxa"/>
@@ -3141,12 +3201,12 @@
         </w:tc>
         <w:tc>
           <w:tcPr>
-            <w:tcW w:w="1400" w:type="dxa"/>
-            <w:tcBorders>
-              <w:top w:val="single" w:sz="4" w:space="0" w:color="808080"/>
-              <w:left w:val="single" w:sz="4" w:space="0" w:color="808080"/>
-              <w:bottom w:val="single" w:sz="4" w:space="0" w:color="808080"/>
-              <w:right w:val="single" w:sz="4" w:space="0" w:color="808080"/>
+            <w:tcW w:w="1278" w:type="dxa"/>
+            <w:tcBorders>
+              <w:top w:val="single" w:color="808080" w:themeColor="background1" w:themeShade="80" w:sz="4" w:space="0"/>
+              <w:left w:val="single" w:color="808080" w:themeColor="background1" w:themeShade="80" w:sz="4" w:space="0"/>
+              <w:bottom w:val="single" w:color="808080" w:themeColor="background1" w:themeShade="80" w:sz="4" w:space="0"/>
+              <w:right w:val="single" w:color="808080" w:themeColor="background1" w:themeShade="80" w:sz="4" w:space="0"/>
             </w:tcBorders>
             <w:tcMar>
               <w:top w:w="60" w:type="dxa"/>
@@ -3160,12 +3220,12 @@
         </w:tc>
         <w:tc>
           <w:tcPr>
-            <w:tcW w:w="1000" w:type="dxa"/>
-            <w:tcBorders>
-              <w:top w:val="single" w:sz="4" w:space="0" w:color="808080"/>
-              <w:left w:val="single" w:sz="4" w:space="0" w:color="808080"/>
-              <w:bottom w:val="single" w:sz="4" w:space="0" w:color="808080"/>
-              <w:right w:val="single" w:sz="4" w:space="0" w:color="808080"/>
+            <w:tcW w:w="1020" w:type="dxa"/>
+            <w:tcBorders>
+              <w:top w:val="single" w:color="808080" w:themeColor="background1" w:themeShade="80" w:sz="4" w:space="0"/>
+              <w:left w:val="single" w:color="808080" w:themeColor="background1" w:themeShade="80" w:sz="4" w:space="0"/>
+              <w:bottom w:val="single" w:color="808080" w:themeColor="background1" w:themeShade="80" w:sz="4" w:space="0"/>
+              <w:right w:val="single" w:color="808080" w:themeColor="background1" w:themeShade="80" w:sz="4" w:space="0"/>
             </w:tcBorders>
             <w:tcMar>
               <w:top w:w="60" w:type="dxa"/>
@@ -3179,12 +3239,12 @@
         </w:tc>
         <w:tc>
           <w:tcPr>
-            <w:tcW w:w="1000" w:type="dxa"/>
-            <w:tcBorders>
-              <w:top w:val="single" w:sz="4" w:space="0" w:color="808080"/>
-              <w:left w:val="single" w:sz="4" w:space="0" w:color="808080"/>
-              <w:bottom w:val="single" w:sz="4" w:space="0" w:color="808080"/>
-              <w:right w:val="single" w:sz="4" w:space="0" w:color="808080"/>
+            <w:tcW w:w="806" w:type="dxa"/>
+            <w:tcBorders>
+              <w:top w:val="single" w:color="808080" w:themeColor="background1" w:themeShade="80" w:sz="4" w:space="0"/>
+              <w:left w:val="single" w:color="808080" w:themeColor="background1" w:themeShade="80" w:sz="4" w:space="0"/>
+              <w:bottom w:val="single" w:color="808080" w:themeColor="background1" w:themeShade="80" w:sz="4" w:space="0"/>
+              <w:right w:val="single" w:color="808080" w:themeColor="background1" w:themeShade="80" w:sz="4" w:space="0"/>
             </w:tcBorders>
             <w:tcMar>
               <w:top w:w="60" w:type="dxa"/>
@@ -3198,12 +3258,12 @@
         </w:tc>
         <w:tc>
           <w:tcPr>
-            <w:tcW w:w="1000" w:type="dxa"/>
-            <w:tcBorders>
-              <w:top w:val="single" w:sz="4" w:space="0" w:color="808080"/>
-              <w:left w:val="single" w:sz="4" w:space="0" w:color="808080"/>
-              <w:bottom w:val="single" w:sz="4" w:space="0" w:color="808080"/>
-              <w:right w:val="single" w:sz="4" w:space="0" w:color="808080"/>
+            <w:tcW w:w="1140" w:type="dxa"/>
+            <w:tcBorders>
+              <w:top w:val="single" w:color="808080" w:themeColor="background1" w:themeShade="80" w:sz="4" w:space="0"/>
+              <w:left w:val="single" w:color="808080" w:themeColor="background1" w:themeShade="80" w:sz="4" w:space="0"/>
+              <w:bottom w:val="single" w:color="808080" w:themeColor="background1" w:themeShade="80" w:sz="4" w:space="0"/>
+              <w:right w:val="single" w:color="808080" w:themeColor="background1" w:themeShade="80" w:sz="4" w:space="0"/>
             </w:tcBorders>
             <w:tcMar>
               <w:top w:w="60" w:type="dxa"/>
@@ -3217,12 +3277,12 @@
         </w:tc>
         <w:tc>
           <w:tcPr>
-            <w:tcW w:w="1266" w:type="dxa"/>
-            <w:tcBorders>
-              <w:top w:val="single" w:sz="4" w:space="0" w:color="808080"/>
-              <w:left w:val="single" w:sz="4" w:space="0" w:color="808080"/>
-              <w:bottom w:val="single" w:sz="4" w:space="0" w:color="808080"/>
-              <w:right w:val="single" w:sz="4" w:space="0" w:color="808080"/>
+            <w:tcW w:w="1095" w:type="dxa"/>
+            <w:tcBorders>
+              <w:top w:val="single" w:color="808080" w:themeColor="background1" w:themeShade="80" w:sz="4"/>
+              <w:left w:val="single" w:color="808080" w:themeColor="background1" w:themeShade="80" w:sz="4"/>
+              <w:bottom w:val="single" w:color="808080" w:themeColor="background1" w:themeShade="80" w:sz="4"/>
+              <w:right w:val="single" w:color="808080" w:themeColor="background1" w:themeShade="80" w:sz="4"/>
             </w:tcBorders>
             <w:tcMar>
               <w:top w:w="60" w:type="dxa"/>
@@ -3236,12 +3296,12 @@
         </w:tc>
         <w:tc>
           <w:tcPr>
-            <w:tcW w:w="1150" w:type="dxa"/>
-            <w:tcBorders>
-              <w:top w:val="single" w:sz="4" w:space="0" w:color="808080"/>
-              <w:left w:val="single" w:sz="4" w:space="0" w:color="808080"/>
-              <w:bottom w:val="single" w:sz="4" w:space="0" w:color="808080"/>
-              <w:right w:val="single" w:sz="4" w:space="0" w:color="808080"/>
+            <w:tcW w:w="1110" w:type="dxa"/>
+            <w:tcBorders>
+              <w:top w:val="single" w:color="808080" w:themeColor="background1" w:themeShade="80" w:sz="4" w:space="0"/>
+              <w:left w:val="single" w:color="808080" w:themeColor="background1" w:themeShade="80" w:sz="4" w:space="0"/>
+              <w:bottom w:val="single" w:color="808080" w:themeColor="background1" w:themeShade="80" w:sz="4" w:space="0"/>
+              <w:right w:val="single" w:color="808080" w:themeColor="background1" w:themeShade="80" w:sz="4" w:space="0"/>
             </w:tcBorders>
             <w:tcMar>
               <w:top w:w="60" w:type="dxa"/>
@@ -3255,12 +3315,12 @@
         </w:tc>
         <w:tc>
           <w:tcPr>
-            <w:tcW w:w="1850" w:type="dxa"/>
-            <w:tcBorders>
-              <w:top w:val="single" w:sz="4" w:space="0" w:color="808080"/>
-              <w:left w:val="single" w:sz="4" w:space="0" w:color="808080"/>
-              <w:bottom w:val="single" w:sz="4" w:space="0" w:color="808080"/>
-              <w:right w:val="single" w:sz="4" w:space="0" w:color="808080"/>
+            <w:tcW w:w="1380" w:type="dxa"/>
+            <w:tcBorders>
+              <w:top w:val="single" w:color="808080" w:themeColor="background1" w:themeShade="80" w:sz="4" w:space="0"/>
+              <w:left w:val="single" w:color="808080" w:themeColor="background1" w:themeShade="80" w:sz="4" w:space="0"/>
+              <w:bottom w:val="single" w:color="808080" w:themeColor="background1" w:themeShade="80" w:sz="4" w:space="0"/>
+              <w:right w:val="single" w:color="808080" w:themeColor="background1" w:themeShade="80" w:sz="4" w:space="0"/>
             </w:tcBorders>
             <w:tcMar>
               <w:top w:w="60" w:type="dxa"/>
@@ -3280,14 +3340,17 @@
             <w:bottom w:w="0" w:type="dxa"/>
           </w:tblCellMar>
         </w:tblPrEx>
-        <w:tc>
-          <w:tcPr>
-            <w:tcW w:w="500" w:type="dxa"/>
-            <w:tcBorders>
-              <w:top w:val="single" w:sz="4" w:space="0" w:color="808080"/>
-              <w:left w:val="single" w:sz="4" w:space="0" w:color="808080"/>
-              <w:bottom w:val="single" w:sz="4" w:space="0" w:color="808080"/>
-              <w:right w:val="single" w:sz="4" w:space="0" w:color="808080"/>
+        <w:trPr>
+          <w:trHeight w:val="300"/>
+        </w:trPr>
+        <w:tc>
+          <w:tcPr>
+            <w:tcW w:w="456" w:type="dxa"/>
+            <w:tcBorders>
+              <w:top w:val="single" w:color="808080" w:themeColor="background1" w:themeShade="80" w:sz="4" w:space="0"/>
+              <w:left w:val="single" w:color="808080" w:themeColor="background1" w:themeShade="80" w:sz="4" w:space="0"/>
+              <w:bottom w:val="single" w:color="808080" w:themeColor="background1" w:themeShade="80" w:sz="4" w:space="0"/>
+              <w:right w:val="single" w:color="808080" w:themeColor="background1" w:themeShade="80" w:sz="4" w:space="0"/>
             </w:tcBorders>
             <w:tcMar>
               <w:top w:w="60" w:type="dxa"/>
@@ -3312,12 +3375,12 @@
         </w:tc>
         <w:tc>
           <w:tcPr>
-            <w:tcW w:w="1300" w:type="dxa"/>
-            <w:tcBorders>
-              <w:top w:val="single" w:sz="4" w:space="0" w:color="808080"/>
-              <w:left w:val="single" w:sz="4" w:space="0" w:color="808080"/>
-              <w:bottom w:val="single" w:sz="4" w:space="0" w:color="808080"/>
-              <w:right w:val="single" w:sz="4" w:space="0" w:color="808080"/>
+            <w:tcW w:w="1187" w:type="dxa"/>
+            <w:tcBorders>
+              <w:top w:val="single" w:color="808080" w:themeColor="background1" w:themeShade="80" w:sz="4" w:space="0"/>
+              <w:left w:val="single" w:color="808080" w:themeColor="background1" w:themeShade="80" w:sz="4" w:space="0"/>
+              <w:bottom w:val="single" w:color="808080" w:themeColor="background1" w:themeShade="80" w:sz="4" w:space="0"/>
+              <w:right w:val="single" w:color="808080" w:themeColor="background1" w:themeShade="80" w:sz="4" w:space="0"/>
             </w:tcBorders>
             <w:tcMar>
               <w:top w:w="60" w:type="dxa"/>
@@ -3331,12 +3394,12 @@
         </w:tc>
         <w:tc>
           <w:tcPr>
-            <w:tcW w:w="1400" w:type="dxa"/>
-            <w:tcBorders>
-              <w:top w:val="single" w:sz="4" w:space="0" w:color="808080"/>
-              <w:left w:val="single" w:sz="4" w:space="0" w:color="808080"/>
-              <w:bottom w:val="single" w:sz="4" w:space="0" w:color="808080"/>
-              <w:right w:val="single" w:sz="4" w:space="0" w:color="808080"/>
+            <w:tcW w:w="1278" w:type="dxa"/>
+            <w:tcBorders>
+              <w:top w:val="single" w:color="808080" w:themeColor="background1" w:themeShade="80" w:sz="4" w:space="0"/>
+              <w:left w:val="single" w:color="808080" w:themeColor="background1" w:themeShade="80" w:sz="4" w:space="0"/>
+              <w:bottom w:val="single" w:color="808080" w:themeColor="background1" w:themeShade="80" w:sz="4" w:space="0"/>
+              <w:right w:val="single" w:color="808080" w:themeColor="background1" w:themeShade="80" w:sz="4" w:space="0"/>
             </w:tcBorders>
             <w:tcMar>
               <w:top w:w="60" w:type="dxa"/>
@@ -3350,12 +3413,12 @@
         </w:tc>
         <w:tc>
           <w:tcPr>
-            <w:tcW w:w="1000" w:type="dxa"/>
-            <w:tcBorders>
-              <w:top w:val="single" w:sz="4" w:space="0" w:color="808080"/>
-              <w:left w:val="single" w:sz="4" w:space="0" w:color="808080"/>
-              <w:bottom w:val="single" w:sz="4" w:space="0" w:color="808080"/>
-              <w:right w:val="single" w:sz="4" w:space="0" w:color="808080"/>
+            <w:tcW w:w="1020" w:type="dxa"/>
+            <w:tcBorders>
+              <w:top w:val="single" w:color="808080" w:themeColor="background1" w:themeShade="80" w:sz="4" w:space="0"/>
+              <w:left w:val="single" w:color="808080" w:themeColor="background1" w:themeShade="80" w:sz="4" w:space="0"/>
+              <w:bottom w:val="single" w:color="808080" w:themeColor="background1" w:themeShade="80" w:sz="4" w:space="0"/>
+              <w:right w:val="single" w:color="808080" w:themeColor="background1" w:themeShade="80" w:sz="4" w:space="0"/>
             </w:tcBorders>
             <w:tcMar>
               <w:top w:w="60" w:type="dxa"/>
@@ -3369,12 +3432,12 @@
         </w:tc>
         <w:tc>
           <w:tcPr>
-            <w:tcW w:w="1000" w:type="dxa"/>
-            <w:tcBorders>
-              <w:top w:val="single" w:sz="4" w:space="0" w:color="808080"/>
-              <w:left w:val="single" w:sz="4" w:space="0" w:color="808080"/>
-              <w:bottom w:val="single" w:sz="4" w:space="0" w:color="808080"/>
-              <w:right w:val="single" w:sz="4" w:space="0" w:color="808080"/>
+            <w:tcW w:w="806" w:type="dxa"/>
+            <w:tcBorders>
+              <w:top w:val="single" w:color="808080" w:themeColor="background1" w:themeShade="80" w:sz="4" w:space="0"/>
+              <w:left w:val="single" w:color="808080" w:themeColor="background1" w:themeShade="80" w:sz="4" w:space="0"/>
+              <w:bottom w:val="single" w:color="808080" w:themeColor="background1" w:themeShade="80" w:sz="4" w:space="0"/>
+              <w:right w:val="single" w:color="808080" w:themeColor="background1" w:themeShade="80" w:sz="4" w:space="0"/>
             </w:tcBorders>
             <w:tcMar>
               <w:top w:w="60" w:type="dxa"/>
@@ -3388,12 +3451,12 @@
         </w:tc>
         <w:tc>
           <w:tcPr>
-            <w:tcW w:w="1000" w:type="dxa"/>
-            <w:tcBorders>
-              <w:top w:val="single" w:sz="4" w:space="0" w:color="808080"/>
-              <w:left w:val="single" w:sz="4" w:space="0" w:color="808080"/>
-              <w:bottom w:val="single" w:sz="4" w:space="0" w:color="808080"/>
-              <w:right w:val="single" w:sz="4" w:space="0" w:color="808080"/>
+            <w:tcW w:w="1140" w:type="dxa"/>
+            <w:tcBorders>
+              <w:top w:val="single" w:color="808080" w:themeColor="background1" w:themeShade="80" w:sz="4" w:space="0"/>
+              <w:left w:val="single" w:color="808080" w:themeColor="background1" w:themeShade="80" w:sz="4" w:space="0"/>
+              <w:bottom w:val="single" w:color="808080" w:themeColor="background1" w:themeShade="80" w:sz="4" w:space="0"/>
+              <w:right w:val="single" w:color="808080" w:themeColor="background1" w:themeShade="80" w:sz="4" w:space="0"/>
             </w:tcBorders>
             <w:tcMar>
               <w:top w:w="60" w:type="dxa"/>
@@ -3407,12 +3470,12 @@
         </w:tc>
         <w:tc>
           <w:tcPr>
-            <w:tcW w:w="1266" w:type="dxa"/>
-            <w:tcBorders>
-              <w:top w:val="single" w:sz="4" w:space="0" w:color="808080"/>
-              <w:left w:val="single" w:sz="4" w:space="0" w:color="808080"/>
-              <w:bottom w:val="single" w:sz="4" w:space="0" w:color="808080"/>
-              <w:right w:val="single" w:sz="4" w:space="0" w:color="808080"/>
+            <w:tcW w:w="1095" w:type="dxa"/>
+            <w:tcBorders>
+              <w:top w:val="single" w:color="808080" w:themeColor="background1" w:themeShade="80" w:sz="4"/>
+              <w:left w:val="single" w:color="808080" w:themeColor="background1" w:themeShade="80" w:sz="4"/>
+              <w:bottom w:val="single" w:color="808080" w:themeColor="background1" w:themeShade="80" w:sz="4"/>
+              <w:right w:val="single" w:color="808080" w:themeColor="background1" w:themeShade="80" w:sz="4"/>
             </w:tcBorders>
             <w:tcMar>
               <w:top w:w="60" w:type="dxa"/>
@@ -3426,12 +3489,12 @@
         </w:tc>
         <w:tc>
           <w:tcPr>
-            <w:tcW w:w="1150" w:type="dxa"/>
-            <w:tcBorders>
-              <w:top w:val="single" w:sz="4" w:space="0" w:color="808080"/>
-              <w:left w:val="single" w:sz="4" w:space="0" w:color="808080"/>
-              <w:bottom w:val="single" w:sz="4" w:space="0" w:color="808080"/>
-              <w:right w:val="single" w:sz="4" w:space="0" w:color="808080"/>
+            <w:tcW w:w="1110" w:type="dxa"/>
+            <w:tcBorders>
+              <w:top w:val="single" w:color="808080" w:themeColor="background1" w:themeShade="80" w:sz="4" w:space="0"/>
+              <w:left w:val="single" w:color="808080" w:themeColor="background1" w:themeShade="80" w:sz="4" w:space="0"/>
+              <w:bottom w:val="single" w:color="808080" w:themeColor="background1" w:themeShade="80" w:sz="4" w:space="0"/>
+              <w:right w:val="single" w:color="808080" w:themeColor="background1" w:themeShade="80" w:sz="4" w:space="0"/>
             </w:tcBorders>
             <w:tcMar>
               <w:top w:w="60" w:type="dxa"/>
@@ -3445,12 +3508,12 @@
         </w:tc>
         <w:tc>
           <w:tcPr>
-            <w:tcW w:w="1850" w:type="dxa"/>
-            <w:tcBorders>
-              <w:top w:val="single" w:sz="4" w:space="0" w:color="808080"/>
-              <w:left w:val="single" w:sz="4" w:space="0" w:color="808080"/>
-              <w:bottom w:val="single" w:sz="4" w:space="0" w:color="808080"/>
-              <w:right w:val="single" w:sz="4" w:space="0" w:color="808080"/>
+            <w:tcW w:w="1380" w:type="dxa"/>
+            <w:tcBorders>
+              <w:top w:val="single" w:color="808080" w:themeColor="background1" w:themeShade="80" w:sz="4" w:space="0"/>
+              <w:left w:val="single" w:color="808080" w:themeColor="background1" w:themeShade="80" w:sz="4" w:space="0"/>
+              <w:bottom w:val="single" w:color="808080" w:themeColor="background1" w:themeShade="80" w:sz="4" w:space="0"/>
+              <w:right w:val="single" w:color="808080" w:themeColor="background1" w:themeShade="80" w:sz="4" w:space="0"/>
             </w:tcBorders>
             <w:tcMar>
               <w:top w:w="60" w:type="dxa"/>
@@ -3470,14 +3533,17 @@
             <w:bottom w:w="0" w:type="dxa"/>
           </w:tblCellMar>
         </w:tblPrEx>
-        <w:tc>
-          <w:tcPr>
-            <w:tcW w:w="500" w:type="dxa"/>
-            <w:tcBorders>
-              <w:top w:val="single" w:sz="4" w:space="0" w:color="808080"/>
-              <w:left w:val="single" w:sz="4" w:space="0" w:color="808080"/>
-              <w:bottom w:val="single" w:sz="4" w:space="0" w:color="808080"/>
-              <w:right w:val="single" w:sz="4" w:space="0" w:color="808080"/>
+        <w:trPr>
+          <w:trHeight w:val="300"/>
+        </w:trPr>
+        <w:tc>
+          <w:tcPr>
+            <w:tcW w:w="456" w:type="dxa"/>
+            <w:tcBorders>
+              <w:top w:val="single" w:color="808080" w:themeColor="background1" w:themeShade="80" w:sz="4" w:space="0"/>
+              <w:left w:val="single" w:color="808080" w:themeColor="background1" w:themeShade="80" w:sz="4" w:space="0"/>
+              <w:bottom w:val="single" w:color="808080" w:themeColor="background1" w:themeShade="80" w:sz="4" w:space="0"/>
+              <w:right w:val="single" w:color="808080" w:themeColor="background1" w:themeShade="80" w:sz="4" w:space="0"/>
             </w:tcBorders>
             <w:tcMar>
               <w:top w:w="60" w:type="dxa"/>
@@ -3502,12 +3568,12 @@
         </w:tc>
         <w:tc>
           <w:tcPr>
-            <w:tcW w:w="1300" w:type="dxa"/>
-            <w:tcBorders>
-              <w:top w:val="single" w:sz="4" w:space="0" w:color="808080"/>
-              <w:left w:val="single" w:sz="4" w:space="0" w:color="808080"/>
-              <w:bottom w:val="single" w:sz="4" w:space="0" w:color="808080"/>
-              <w:right w:val="single" w:sz="4" w:space="0" w:color="808080"/>
+            <w:tcW w:w="1187" w:type="dxa"/>
+            <w:tcBorders>
+              <w:top w:val="single" w:color="808080" w:themeColor="background1" w:themeShade="80" w:sz="4" w:space="0"/>
+              <w:left w:val="single" w:color="808080" w:themeColor="background1" w:themeShade="80" w:sz="4" w:space="0"/>
+              <w:bottom w:val="single" w:color="808080" w:themeColor="background1" w:themeShade="80" w:sz="4" w:space="0"/>
+              <w:right w:val="single" w:color="808080" w:themeColor="background1" w:themeShade="80" w:sz="4" w:space="0"/>
             </w:tcBorders>
             <w:tcMar>
               <w:top w:w="60" w:type="dxa"/>
@@ -3521,12 +3587,12 @@
         </w:tc>
         <w:tc>
           <w:tcPr>
-            <w:tcW w:w="1400" w:type="dxa"/>
-            <w:tcBorders>
-              <w:top w:val="single" w:sz="4" w:space="0" w:color="808080"/>
-              <w:left w:val="single" w:sz="4" w:space="0" w:color="808080"/>
-              <w:bottom w:val="single" w:sz="4" w:space="0" w:color="808080"/>
-              <w:right w:val="single" w:sz="4" w:space="0" w:color="808080"/>
+            <w:tcW w:w="1278" w:type="dxa"/>
+            <w:tcBorders>
+              <w:top w:val="single" w:color="808080" w:themeColor="background1" w:themeShade="80" w:sz="4" w:space="0"/>
+              <w:left w:val="single" w:color="808080" w:themeColor="background1" w:themeShade="80" w:sz="4" w:space="0"/>
+              <w:bottom w:val="single" w:color="808080" w:themeColor="background1" w:themeShade="80" w:sz="4" w:space="0"/>
+              <w:right w:val="single" w:color="808080" w:themeColor="background1" w:themeShade="80" w:sz="4" w:space="0"/>
             </w:tcBorders>
             <w:tcMar>
               <w:top w:w="60" w:type="dxa"/>
@@ -3540,12 +3606,12 @@
         </w:tc>
         <w:tc>
           <w:tcPr>
-            <w:tcW w:w="1000" w:type="dxa"/>
-            <w:tcBorders>
-              <w:top w:val="single" w:sz="4" w:space="0" w:color="808080"/>
-              <w:left w:val="single" w:sz="4" w:space="0" w:color="808080"/>
-              <w:bottom w:val="single" w:sz="4" w:space="0" w:color="808080"/>
-              <w:right w:val="single" w:sz="4" w:space="0" w:color="808080"/>
+            <w:tcW w:w="1020" w:type="dxa"/>
+            <w:tcBorders>
+              <w:top w:val="single" w:color="808080" w:themeColor="background1" w:themeShade="80" w:sz="4" w:space="0"/>
+              <w:left w:val="single" w:color="808080" w:themeColor="background1" w:themeShade="80" w:sz="4" w:space="0"/>
+              <w:bottom w:val="single" w:color="808080" w:themeColor="background1" w:themeShade="80" w:sz="4" w:space="0"/>
+              <w:right w:val="single" w:color="808080" w:themeColor="background1" w:themeShade="80" w:sz="4" w:space="0"/>
             </w:tcBorders>
             <w:tcMar>
               <w:top w:w="60" w:type="dxa"/>
@@ -3559,12 +3625,12 @@
         </w:tc>
         <w:tc>
           <w:tcPr>
-            <w:tcW w:w="1000" w:type="dxa"/>
-            <w:tcBorders>
-              <w:top w:val="single" w:sz="4" w:space="0" w:color="808080"/>
-              <w:left w:val="single" w:sz="4" w:space="0" w:color="808080"/>
-              <w:bottom w:val="single" w:sz="4" w:space="0" w:color="808080"/>
-              <w:right w:val="single" w:sz="4" w:space="0" w:color="808080"/>
+            <w:tcW w:w="806" w:type="dxa"/>
+            <w:tcBorders>
+              <w:top w:val="single" w:color="808080" w:themeColor="background1" w:themeShade="80" w:sz="4" w:space="0"/>
+              <w:left w:val="single" w:color="808080" w:themeColor="background1" w:themeShade="80" w:sz="4" w:space="0"/>
+              <w:bottom w:val="single" w:color="808080" w:themeColor="background1" w:themeShade="80" w:sz="4" w:space="0"/>
+              <w:right w:val="single" w:color="808080" w:themeColor="background1" w:themeShade="80" w:sz="4" w:space="0"/>
             </w:tcBorders>
             <w:tcMar>
               <w:top w:w="60" w:type="dxa"/>
@@ -3578,12 +3644,12 @@
         </w:tc>
         <w:tc>
           <w:tcPr>
-            <w:tcW w:w="1000" w:type="dxa"/>
-            <w:tcBorders>
-              <w:top w:val="single" w:sz="4" w:space="0" w:color="808080"/>
-              <w:left w:val="single" w:sz="4" w:space="0" w:color="808080"/>
-              <w:bottom w:val="single" w:sz="4" w:space="0" w:color="808080"/>
-              <w:right w:val="single" w:sz="4" w:space="0" w:color="808080"/>
+            <w:tcW w:w="1140" w:type="dxa"/>
+            <w:tcBorders>
+              <w:top w:val="single" w:color="808080" w:themeColor="background1" w:themeShade="80" w:sz="4" w:space="0"/>
+              <w:left w:val="single" w:color="808080" w:themeColor="background1" w:themeShade="80" w:sz="4" w:space="0"/>
+              <w:bottom w:val="single" w:color="808080" w:themeColor="background1" w:themeShade="80" w:sz="4" w:space="0"/>
+              <w:right w:val="single" w:color="808080" w:themeColor="background1" w:themeShade="80" w:sz="4" w:space="0"/>
             </w:tcBorders>
             <w:tcMar>
               <w:top w:w="60" w:type="dxa"/>
@@ -3597,12 +3663,12 @@
         </w:tc>
         <w:tc>
           <w:tcPr>
-            <w:tcW w:w="1266" w:type="dxa"/>
-            <w:tcBorders>
-              <w:top w:val="single" w:sz="4" w:space="0" w:color="808080"/>
-              <w:left w:val="single" w:sz="4" w:space="0" w:color="808080"/>
-              <w:bottom w:val="single" w:sz="4" w:space="0" w:color="808080"/>
-              <w:right w:val="single" w:sz="4" w:space="0" w:color="808080"/>
+            <w:tcW w:w="1095" w:type="dxa"/>
+            <w:tcBorders>
+              <w:top w:val="single" w:color="808080" w:themeColor="background1" w:themeShade="80" w:sz="4"/>
+              <w:left w:val="single" w:color="808080" w:themeColor="background1" w:themeShade="80" w:sz="4"/>
+              <w:bottom w:val="single" w:color="808080" w:themeColor="background1" w:themeShade="80" w:sz="4"/>
+              <w:right w:val="single" w:color="808080" w:themeColor="background1" w:themeShade="80" w:sz="4"/>
             </w:tcBorders>
             <w:tcMar>
               <w:top w:w="60" w:type="dxa"/>
@@ -3616,12 +3682,12 @@
         </w:tc>
         <w:tc>
           <w:tcPr>
-            <w:tcW w:w="1150" w:type="dxa"/>
-            <w:tcBorders>
-              <w:top w:val="single" w:sz="4" w:space="0" w:color="808080"/>
-              <w:left w:val="single" w:sz="4" w:space="0" w:color="808080"/>
-              <w:bottom w:val="single" w:sz="4" w:space="0" w:color="808080"/>
-              <w:right w:val="single" w:sz="4" w:space="0" w:color="808080"/>
+            <w:tcW w:w="1110" w:type="dxa"/>
+            <w:tcBorders>
+              <w:top w:val="single" w:color="808080" w:themeColor="background1" w:themeShade="80" w:sz="4" w:space="0"/>
+              <w:left w:val="single" w:color="808080" w:themeColor="background1" w:themeShade="80" w:sz="4" w:space="0"/>
+              <w:bottom w:val="single" w:color="808080" w:themeColor="background1" w:themeShade="80" w:sz="4" w:space="0"/>
+              <w:right w:val="single" w:color="808080" w:themeColor="background1" w:themeShade="80" w:sz="4" w:space="0"/>
             </w:tcBorders>
             <w:tcMar>
               <w:top w:w="60" w:type="dxa"/>
@@ -3635,12 +3701,12 @@
         </w:tc>
         <w:tc>
           <w:tcPr>
-            <w:tcW w:w="1850" w:type="dxa"/>
-            <w:tcBorders>
-              <w:top w:val="single" w:sz="4" w:space="0" w:color="808080"/>
-              <w:left w:val="single" w:sz="4" w:space="0" w:color="808080"/>
-              <w:bottom w:val="single" w:sz="4" w:space="0" w:color="808080"/>
-              <w:right w:val="single" w:sz="4" w:space="0" w:color="808080"/>
+            <w:tcW w:w="1380" w:type="dxa"/>
+            <w:tcBorders>
+              <w:top w:val="single" w:color="808080" w:themeColor="background1" w:themeShade="80" w:sz="4" w:space="0"/>
+              <w:left w:val="single" w:color="808080" w:themeColor="background1" w:themeShade="80" w:sz="4" w:space="0"/>
+              <w:bottom w:val="single" w:color="808080" w:themeColor="background1" w:themeShade="80" w:sz="4" w:space="0"/>
+              <w:right w:val="single" w:color="808080" w:themeColor="background1" w:themeShade="80" w:sz="4" w:space="0"/>
             </w:tcBorders>
             <w:tcMar>
               <w:top w:w="60" w:type="dxa"/>
@@ -3660,45 +3726,47 @@
             <w:bottom w:w="0" w:type="dxa"/>
           </w:tblCellMar>
         </w:tblPrEx>
-        <w:tc>
-          <w:tcPr>
-            <w:tcW w:w="500" w:type="dxa"/>
-            <w:tcBorders>
-              <w:top w:val="single" w:sz="4" w:space="0" w:color="808080"/>
-              <w:left w:val="single" w:sz="4" w:space="0" w:color="808080"/>
-              <w:bottom w:val="single" w:sz="4" w:space="0" w:color="808080"/>
-              <w:right w:val="single" w:sz="4" w:space="0" w:color="808080"/>
-            </w:tcBorders>
-            <w:tcMar>
-              <w:top w:w="60" w:type="dxa"/>
-              <w:left w:w="80" w:type="dxa"/>
-              <w:bottom w:w="60" w:type="dxa"/>
-              <w:right w:w="80" w:type="dxa"/>
-            </w:tcMar>
-            <w:vAlign w:val="center"/>
-          </w:tcPr>
-          <w:p>
-            <w:pPr>
-              <w:jc w:val="center"/>
-            </w:pPr>
-            <w:r>
-              <w:rPr>
-                <w:sz w:val="18"/>
-                <w:szCs w:val="18"/>
-              </w:rPr>
-              <w:lastRenderedPageBreak/>
+        <w:trPr>
+          <w:trHeight w:val="300"/>
+        </w:trPr>
+        <w:tc>
+          <w:tcPr>
+            <w:tcW w:w="456" w:type="dxa"/>
+            <w:tcBorders>
+              <w:top w:val="single" w:color="808080" w:themeColor="background1" w:themeShade="80" w:sz="4" w:space="0"/>
+              <w:left w:val="single" w:color="808080" w:themeColor="background1" w:themeShade="80" w:sz="4" w:space="0"/>
+              <w:bottom w:val="single" w:color="808080" w:themeColor="background1" w:themeShade="80" w:sz="4" w:space="0"/>
+              <w:right w:val="single" w:color="808080" w:themeColor="background1" w:themeShade="80" w:sz="4" w:space="0"/>
+            </w:tcBorders>
+            <w:tcMar>
+              <w:top w:w="60" w:type="dxa"/>
+              <w:left w:w="80" w:type="dxa"/>
+              <w:bottom w:w="60" w:type="dxa"/>
+              <w:right w:w="80" w:type="dxa"/>
+            </w:tcMar>
+            <w:vAlign w:val="center"/>
+          </w:tcPr>
+          <w:p>
+            <w:pPr>
+              <w:jc w:val="center"/>
+            </w:pPr>
+            <w:r>
+              <w:rPr>
+                <w:sz w:val="18"/>
+                <w:szCs w:val="18"/>
+              </w:rPr>
               <w:t>5</w:t>
             </w:r>
           </w:p>
         </w:tc>
         <w:tc>
           <w:tcPr>
-            <w:tcW w:w="1300" w:type="dxa"/>
-            <w:tcBorders>
-              <w:top w:val="single" w:sz="4" w:space="0" w:color="808080"/>
-              <w:left w:val="single" w:sz="4" w:space="0" w:color="808080"/>
-              <w:bottom w:val="single" w:sz="4" w:space="0" w:color="808080"/>
-              <w:right w:val="single" w:sz="4" w:space="0" w:color="808080"/>
+            <w:tcW w:w="1187" w:type="dxa"/>
+            <w:tcBorders>
+              <w:top w:val="single" w:color="808080" w:themeColor="background1" w:themeShade="80" w:sz="4" w:space="0"/>
+              <w:left w:val="single" w:color="808080" w:themeColor="background1" w:themeShade="80" w:sz="4" w:space="0"/>
+              <w:bottom w:val="single" w:color="808080" w:themeColor="background1" w:themeShade="80" w:sz="4" w:space="0"/>
+              <w:right w:val="single" w:color="808080" w:themeColor="background1" w:themeShade="80" w:sz="4" w:space="0"/>
             </w:tcBorders>
             <w:tcMar>
               <w:top w:w="60" w:type="dxa"/>
@@ -3712,12 +3780,12 @@
         </w:tc>
         <w:tc>
           <w:tcPr>
-            <w:tcW w:w="1400" w:type="dxa"/>
-            <w:tcBorders>
-              <w:top w:val="single" w:sz="4" w:space="0" w:color="808080"/>
-              <w:left w:val="single" w:sz="4" w:space="0" w:color="808080"/>
-              <w:bottom w:val="single" w:sz="4" w:space="0" w:color="808080"/>
-              <w:right w:val="single" w:sz="4" w:space="0" w:color="808080"/>
+            <w:tcW w:w="1278" w:type="dxa"/>
+            <w:tcBorders>
+              <w:top w:val="single" w:color="808080" w:themeColor="background1" w:themeShade="80" w:sz="4" w:space="0"/>
+              <w:left w:val="single" w:color="808080" w:themeColor="background1" w:themeShade="80" w:sz="4" w:space="0"/>
+              <w:bottom w:val="single" w:color="808080" w:themeColor="background1" w:themeShade="80" w:sz="4" w:space="0"/>
+              <w:right w:val="single" w:color="808080" w:themeColor="background1" w:themeShade="80" w:sz="4" w:space="0"/>
             </w:tcBorders>
             <w:tcMar>
               <w:top w:w="60" w:type="dxa"/>
@@ -3731,12 +3799,12 @@
         </w:tc>
         <w:tc>
           <w:tcPr>
-            <w:tcW w:w="1000" w:type="dxa"/>
-            <w:tcBorders>
-              <w:top w:val="single" w:sz="4" w:space="0" w:color="808080"/>
-              <w:left w:val="single" w:sz="4" w:space="0" w:color="808080"/>
-              <w:bottom w:val="single" w:sz="4" w:space="0" w:color="808080"/>
-              <w:right w:val="single" w:sz="4" w:space="0" w:color="808080"/>
+            <w:tcW w:w="1020" w:type="dxa"/>
+            <w:tcBorders>
+              <w:top w:val="single" w:color="808080" w:themeColor="background1" w:themeShade="80" w:sz="4" w:space="0"/>
+              <w:left w:val="single" w:color="808080" w:themeColor="background1" w:themeShade="80" w:sz="4" w:space="0"/>
+              <w:bottom w:val="single" w:color="808080" w:themeColor="background1" w:themeShade="80" w:sz="4" w:space="0"/>
+              <w:right w:val="single" w:color="808080" w:themeColor="background1" w:themeShade="80" w:sz="4" w:space="0"/>
             </w:tcBorders>
             <w:tcMar>
               <w:top w:w="60" w:type="dxa"/>
@@ -3750,12 +3818,12 @@
         </w:tc>
         <w:tc>
           <w:tcPr>
-            <w:tcW w:w="1000" w:type="dxa"/>
-            <w:tcBorders>
-              <w:top w:val="single" w:sz="4" w:space="0" w:color="808080"/>
-              <w:left w:val="single" w:sz="4" w:space="0" w:color="808080"/>
-              <w:bottom w:val="single" w:sz="4" w:space="0" w:color="808080"/>
-              <w:right w:val="single" w:sz="4" w:space="0" w:color="808080"/>
+            <w:tcW w:w="806" w:type="dxa"/>
+            <w:tcBorders>
+              <w:top w:val="single" w:color="808080" w:themeColor="background1" w:themeShade="80" w:sz="4" w:space="0"/>
+              <w:left w:val="single" w:color="808080" w:themeColor="background1" w:themeShade="80" w:sz="4" w:space="0"/>
+              <w:bottom w:val="single" w:color="808080" w:themeColor="background1" w:themeShade="80" w:sz="4" w:space="0"/>
+              <w:right w:val="single" w:color="808080" w:themeColor="background1" w:themeShade="80" w:sz="4" w:space="0"/>
             </w:tcBorders>
             <w:tcMar>
               <w:top w:w="60" w:type="dxa"/>
@@ -3769,12 +3837,12 @@
         </w:tc>
         <w:tc>
           <w:tcPr>
-            <w:tcW w:w="1000" w:type="dxa"/>
-            <w:tcBorders>
-              <w:top w:val="single" w:sz="4" w:space="0" w:color="808080"/>
-              <w:left w:val="single" w:sz="4" w:space="0" w:color="808080"/>
-              <w:bottom w:val="single" w:sz="4" w:space="0" w:color="808080"/>
-              <w:right w:val="single" w:sz="4" w:space="0" w:color="808080"/>
+            <w:tcW w:w="1140" w:type="dxa"/>
+            <w:tcBorders>
+              <w:top w:val="single" w:color="808080" w:themeColor="background1" w:themeShade="80" w:sz="4" w:space="0"/>
+              <w:left w:val="single" w:color="808080" w:themeColor="background1" w:themeShade="80" w:sz="4" w:space="0"/>
+              <w:bottom w:val="single" w:color="808080" w:themeColor="background1" w:themeShade="80" w:sz="4" w:space="0"/>
+              <w:right w:val="single" w:color="808080" w:themeColor="background1" w:themeShade="80" w:sz="4" w:space="0"/>
             </w:tcBorders>
             <w:tcMar>
               <w:top w:w="60" w:type="dxa"/>
@@ -3788,12 +3856,12 @@
         </w:tc>
         <w:tc>
           <w:tcPr>
-            <w:tcW w:w="1266" w:type="dxa"/>
-            <w:tcBorders>
-              <w:top w:val="single" w:sz="4" w:space="0" w:color="808080"/>
-              <w:left w:val="single" w:sz="4" w:space="0" w:color="808080"/>
-              <w:bottom w:val="single" w:sz="4" w:space="0" w:color="808080"/>
-              <w:right w:val="single" w:sz="4" w:space="0" w:color="808080"/>
+            <w:tcW w:w="1095" w:type="dxa"/>
+            <w:tcBorders>
+              <w:top w:val="single" w:color="808080" w:themeColor="background1" w:themeShade="80" w:sz="4"/>
+              <w:left w:val="single" w:color="808080" w:themeColor="background1" w:themeShade="80" w:sz="4"/>
+              <w:bottom w:val="single" w:color="808080" w:themeColor="background1" w:themeShade="80" w:sz="4"/>
+              <w:right w:val="single" w:color="808080" w:themeColor="background1" w:themeShade="80" w:sz="4"/>
             </w:tcBorders>
             <w:tcMar>
               <w:top w:w="60" w:type="dxa"/>
@@ -3807,12 +3875,12 @@
         </w:tc>
         <w:tc>
           <w:tcPr>
-            <w:tcW w:w="1150" w:type="dxa"/>
-            <w:tcBorders>
-              <w:top w:val="single" w:sz="4" w:space="0" w:color="808080"/>
-              <w:left w:val="single" w:sz="4" w:space="0" w:color="808080"/>
-              <w:bottom w:val="single" w:sz="4" w:space="0" w:color="808080"/>
-              <w:right w:val="single" w:sz="4" w:space="0" w:color="808080"/>
+            <w:tcW w:w="1110" w:type="dxa"/>
+            <w:tcBorders>
+              <w:top w:val="single" w:color="808080" w:themeColor="background1" w:themeShade="80" w:sz="4" w:space="0"/>
+              <w:left w:val="single" w:color="808080" w:themeColor="background1" w:themeShade="80" w:sz="4" w:space="0"/>
+              <w:bottom w:val="single" w:color="808080" w:themeColor="background1" w:themeShade="80" w:sz="4" w:space="0"/>
+              <w:right w:val="single" w:color="808080" w:themeColor="background1" w:themeShade="80" w:sz="4" w:space="0"/>
             </w:tcBorders>
             <w:tcMar>
               <w:top w:w="60" w:type="dxa"/>
@@ -3826,12 +3894,12 @@
         </w:tc>
         <w:tc>
           <w:tcPr>
-            <w:tcW w:w="1850" w:type="dxa"/>
-            <w:tcBorders>
-              <w:top w:val="single" w:sz="4" w:space="0" w:color="808080"/>
-              <w:left w:val="single" w:sz="4" w:space="0" w:color="808080"/>
-              <w:bottom w:val="single" w:sz="4" w:space="0" w:color="808080"/>
-              <w:right w:val="single" w:sz="4" w:space="0" w:color="808080"/>
+            <w:tcW w:w="1380" w:type="dxa"/>
+            <w:tcBorders>
+              <w:top w:val="single" w:color="808080" w:themeColor="background1" w:themeShade="80" w:sz="4" w:space="0"/>
+              <w:left w:val="single" w:color="808080" w:themeColor="background1" w:themeShade="80" w:sz="4" w:space="0"/>
+              <w:bottom w:val="single" w:color="808080" w:themeColor="background1" w:themeShade="80" w:sz="4" w:space="0"/>
+              <w:right w:val="single" w:color="808080" w:themeColor="background1" w:themeShade="80" w:sz="4" w:space="0"/>
             </w:tcBorders>
             <w:tcMar>
               <w:top w:w="60" w:type="dxa"/>
@@ -3896,7 +3964,7 @@
       </w:r>
     </w:p>
     <w:sectPr>
-      <w:pgSz w:w="11906" w:h="16838"/>
+      <w:pgSz w:w="11906" w:h="16838" w:orient="portrait"/>
       <w:pgMar w:top="720" w:right="720" w:bottom="720" w:left="720" w:header="708" w:footer="708" w:gutter="0"/>
       <w:cols w:space="720"/>
       <w:docGrid w:linePitch="360"/>
@@ -4003,11 +4071,11 @@
 </file>
 
 <file path=word/styles.xml><?xml version="1.0" encoding="utf-8"?>
-<w:styles xmlns:mc="http://schemas.openxmlformats.org/markup-compatibility/2006" xmlns:r="http://schemas.openxmlformats.org/officeDocument/2006/relationships" xmlns:w="http://schemas.openxmlformats.org/wordprocessingml/2006/main" xmlns:w14="http://schemas.microsoft.com/office/word/2010/wordml" xmlns:w15="http://schemas.microsoft.com/office/word/2012/wordml" xmlns:w16cex="http://schemas.microsoft.com/office/word/2018/wordml/cex" xmlns:w16cid="http://schemas.microsoft.com/office/word/2016/wordml/cid" xmlns:w16="http://schemas.microsoft.com/office/word/2018/wordml" xmlns:w16sdtdh="http://schemas.microsoft.com/office/word/2020/wordml/sdtdatahash" xmlns:w16sdtfl="http://schemas.microsoft.com/office/word/2024/wordml/sdtformatlock" xmlns:w16se="http://schemas.microsoft.com/office/word/2015/wordml/symex" xmlns:w16du="http://schemas.microsoft.com/office/word/2023/wordml/word16du" mc:Ignorable="w14 w15 w16se w16cid w16 w16cex w16sdtdh w16sdtfl w16du">
+<w:styles xmlns:wp14="http://schemas.microsoft.com/office/word/2010/wordprocessingDrawing" xmlns:mc="http://schemas.openxmlformats.org/markup-compatibility/2006" xmlns:r="http://schemas.openxmlformats.org/officeDocument/2006/relationships" xmlns:w="http://schemas.openxmlformats.org/wordprocessingml/2006/main" xmlns:w14="http://schemas.microsoft.com/office/word/2010/wordml" xmlns:w15="http://schemas.microsoft.com/office/word/2012/wordml" xmlns:w16cex="http://schemas.microsoft.com/office/word/2018/wordml/cex" xmlns:w16cid="http://schemas.microsoft.com/office/word/2016/wordml/cid" xmlns:w16="http://schemas.microsoft.com/office/word/2018/wordml" xmlns:w16sdtdh="http://schemas.microsoft.com/office/word/2020/wordml/sdtdatahash" xmlns:w16sdtfl="http://schemas.microsoft.com/office/word/2024/wordml/sdtformatlock" xmlns:w16se="http://schemas.microsoft.com/office/word/2015/wordml/symex" xmlns:w16du="http://schemas.microsoft.com/office/word/2023/wordml/word16du" mc:Ignorable="w14 w15 w16se w16cid w16 w16cex w16sdtdh w16sdtfl w16du wp14">
   <w:docDefaults>
     <w:rPrDefault>
       <w:rPr>
-        <w:rFonts w:ascii="Calibri" w:eastAsia="Calibri" w:hAnsi="Calibri" w:cs="Calibri"/>
+        <w:rFonts w:ascii="Calibri" w:hAnsi="Calibri" w:eastAsia="Calibri" w:cs="Calibri"/>
         <w:lang w:val="en-IN" w:eastAsia="en-GB" w:bidi="ar-SA"/>
       </w:rPr>
     </w:rPrDefault>
@@ -4020,14 +4088,14 @@
   <w:latentStyles w:defLockedState="0" w:defUIPriority="99" w:defSemiHidden="0" w:defUnhideWhenUsed="0" w:defQFormat="0" w:count="376">
     <w:lsdException w:name="Normal" w:uiPriority="0" w:qFormat="1"/>
     <w:lsdException w:name="heading 1" w:uiPriority="9" w:qFormat="1"/>
-    <w:lsdException w:name="heading 2" w:semiHidden="1" w:uiPriority="9" w:unhideWhenUsed="1" w:qFormat="1"/>
-    <w:lsdException w:name="heading 3" w:semiHidden="1" w:uiPriority="9" w:unhideWhenUsed="1" w:qFormat="1"/>
-    <w:lsdException w:name="heading 4" w:semiHidden="1" w:uiPriority="9" w:unhideWhenUsed="1" w:qFormat="1"/>
-    <w:lsdException w:name="heading 5" w:semiHidden="1" w:uiPriority="9" w:unhideWhenUsed="1" w:qFormat="1"/>
-    <w:lsdException w:name="heading 6" w:semiHidden="1" w:uiPriority="9" w:unhideWhenUsed="1" w:qFormat="1"/>
-    <w:lsdException w:name="heading 7" w:semiHidden="1" w:uiPriority="9" w:unhideWhenUsed="1" w:qFormat="1"/>
-    <w:lsdException w:name="heading 8" w:semiHidden="1" w:uiPriority="9" w:unhideWhenUsed="1" w:qFormat="1"/>
-    <w:lsdException w:name="heading 9" w:semiHidden="1" w:uiPriority="9" w:unhideWhenUsed="1" w:qFormat="1"/>
+    <w:lsdException w:name="heading 2" w:uiPriority="9" w:semiHidden="1" w:unhideWhenUsed="1" w:qFormat="1"/>
+    <w:lsdException w:name="heading 3" w:uiPriority="9" w:semiHidden="1" w:unhideWhenUsed="1" w:qFormat="1"/>
+    <w:lsdException w:name="heading 4" w:uiPriority="9" w:semiHidden="1" w:unhideWhenUsed="1" w:qFormat="1"/>
+    <w:lsdException w:name="heading 5" w:uiPriority="9" w:semiHidden="1" w:unhideWhenUsed="1" w:qFormat="1"/>
+    <w:lsdException w:name="heading 6" w:uiPriority="9" w:semiHidden="1" w:unhideWhenUsed="1" w:qFormat="1"/>
+    <w:lsdException w:name="heading 7" w:uiPriority="9" w:semiHidden="1" w:unhideWhenUsed="1" w:qFormat="1"/>
+    <w:lsdException w:name="heading 8" w:uiPriority="9" w:semiHidden="1" w:unhideWhenUsed="1" w:qFormat="1"/>
+    <w:lsdException w:name="heading 9" w:uiPriority="9" w:semiHidden="1" w:unhideWhenUsed="1" w:qFormat="1"/>
     <w:lsdException w:name="index 1" w:semiHidden="1" w:unhideWhenUsed="1"/>
     <w:lsdException w:name="index 2" w:semiHidden="1" w:unhideWhenUsed="1"/>
     <w:lsdException w:name="index 3" w:semiHidden="1" w:unhideWhenUsed="1"/>
@@ -4037,22 +4105,22 @@
     <w:lsdException w:name="index 7" w:semiHidden="1" w:unhideWhenUsed="1"/>
     <w:lsdException w:name="index 8" w:semiHidden="1" w:unhideWhenUsed="1"/>
     <w:lsdException w:name="index 9" w:semiHidden="1" w:unhideWhenUsed="1"/>
-    <w:lsdException w:name="toc 1" w:semiHidden="1" w:uiPriority="39" w:unhideWhenUsed="1"/>
-    <w:lsdException w:name="toc 2" w:semiHidden="1" w:uiPriority="39" w:unhideWhenUsed="1"/>
-    <w:lsdException w:name="toc 3" w:semiHidden="1" w:uiPriority="39" w:unhideWhenUsed="1"/>
-    <w:lsdException w:name="toc 4" w:semiHidden="1" w:uiPriority="39" w:unhideWhenUsed="1"/>
-    <w:lsdException w:name="toc 5" w:semiHidden="1" w:uiPriority="39" w:unhideWhenUsed="1"/>
-    <w:lsdException w:name="toc 6" w:semiHidden="1" w:uiPriority="39" w:unhideWhenUsed="1"/>
-    <w:lsdException w:name="toc 7" w:semiHidden="1" w:uiPriority="39" w:unhideWhenUsed="1"/>
-    <w:lsdException w:name="toc 8" w:semiHidden="1" w:uiPriority="39" w:unhideWhenUsed="1"/>
-    <w:lsdException w:name="toc 9" w:semiHidden="1" w:uiPriority="39" w:unhideWhenUsed="1"/>
+    <w:lsdException w:name="toc 1" w:uiPriority="39" w:semiHidden="1" w:unhideWhenUsed="1"/>
+    <w:lsdException w:name="toc 2" w:uiPriority="39" w:semiHidden="1" w:unhideWhenUsed="1"/>
+    <w:lsdException w:name="toc 3" w:uiPriority="39" w:semiHidden="1" w:unhideWhenUsed="1"/>
+    <w:lsdException w:name="toc 4" w:uiPriority="39" w:semiHidden="1" w:unhideWhenUsed="1"/>
+    <w:lsdException w:name="toc 5" w:uiPriority="39" w:semiHidden="1" w:unhideWhenUsed="1"/>
+    <w:lsdException w:name="toc 6" w:uiPriority="39" w:semiHidden="1" w:unhideWhenUsed="1"/>
+    <w:lsdException w:name="toc 7" w:uiPriority="39" w:semiHidden="1" w:unhideWhenUsed="1"/>
+    <w:lsdException w:name="toc 8" w:uiPriority="39" w:semiHidden="1" w:unhideWhenUsed="1"/>
+    <w:lsdException w:name="toc 9" w:uiPriority="39" w:semiHidden="1" w:unhideWhenUsed="1"/>
     <w:lsdException w:name="Normal Indent" w:semiHidden="1" w:unhideWhenUsed="1"/>
     <w:lsdException w:name="footnote text" w:semiHidden="1" w:unhideWhenUsed="1"/>
     <w:lsdException w:name="annotation text" w:semiHidden="1" w:unhideWhenUsed="1"/>
     <w:lsdException w:name="header" w:semiHidden="1" w:unhideWhenUsed="1"/>
     <w:lsdException w:name="footer" w:semiHidden="1" w:unhideWhenUsed="1"/>
     <w:lsdException w:name="index heading" w:semiHidden="1" w:unhideWhenUsed="1"/>
-    <w:lsdException w:name="caption" w:semiHidden="1" w:uiPriority="35" w:unhideWhenUsed="1" w:qFormat="1"/>
+    <w:lsdException w:name="caption" w:uiPriority="35" w:semiHidden="1" w:unhideWhenUsed="1" w:qFormat="1"/>
     <w:lsdException w:name="table of figures" w:semiHidden="1" w:unhideWhenUsed="1"/>
     <w:lsdException w:name="envelope address" w:semiHidden="1" w:unhideWhenUsed="1"/>
     <w:lsdException w:name="envelope return" w:semiHidden="1" w:unhideWhenUsed="1"/>
@@ -4083,7 +4151,7 @@
     <w:lsdException w:name="Title" w:uiPriority="10" w:qFormat="1"/>
     <w:lsdException w:name="Closing" w:semiHidden="1" w:unhideWhenUsed="1"/>
     <w:lsdException w:name="Signature" w:semiHidden="1" w:unhideWhenUsed="1"/>
-    <w:lsdException w:name="Default Paragraph Font" w:semiHidden="1" w:uiPriority="1" w:unhideWhenUsed="1"/>
+    <w:lsdException w:name="Default Paragraph Font" w:uiPriority="1" w:semiHidden="1" w:unhideWhenUsed="1"/>
     <w:lsdException w:name="Body Text" w:semiHidden="1" w:unhideWhenUsed="1"/>
     <w:lsdException w:name="Body Text Indent" w:semiHidden="1" w:unhideWhenUsed="1"/>
     <w:lsdException w:name="List Continue" w:semiHidden="1" w:unhideWhenUsed="1"/>
@@ -4283,8 +4351,8 @@
     <w:lsdException w:name="Subtle Reference" w:uiPriority="31" w:qFormat="1"/>
     <w:lsdException w:name="Intense Reference" w:uiPriority="32" w:qFormat="1"/>
     <w:lsdException w:name="Book Title" w:uiPriority="33" w:qFormat="1"/>
-    <w:lsdException w:name="Bibliography" w:semiHidden="1" w:uiPriority="37" w:unhideWhenUsed="1"/>
-    <w:lsdException w:name="TOC Heading" w:semiHidden="1" w:uiPriority="39" w:unhideWhenUsed="1" w:qFormat="1"/>
+    <w:lsdException w:name="Bibliography" w:uiPriority="37" w:semiHidden="1" w:unhideWhenUsed="1"/>
+    <w:lsdException w:name="TOC Heading" w:uiPriority="39" w:semiHidden="1" w:unhideWhenUsed="1" w:qFormat="1"/>
     <w:lsdException w:name="Plain Table 1" w:uiPriority="41"/>
     <w:lsdException w:name="Plain Table 2" w:uiPriority="42"/>
     <w:lsdException w:name="Plain Table 3" w:uiPriority="43"/>
@@ -4395,7 +4463,7 @@
     <w:lsdException w:name="Unresolved Mention" w:semiHidden="1" w:unhideWhenUsed="1"/>
     <w:lsdException w:name="Smart Link" w:semiHidden="1" w:unhideWhenUsed="1"/>
   </w:latentStyles>
-  <w:style w:type="paragraph" w:default="1" w:styleId="Normal">
+  <w:style w:type="paragraph" w:styleId="Normal" w:default="1">
     <w:name w:val="Normal"/>
     <w:qFormat/>
   </w:style>
@@ -4483,12 +4551,12 @@
       <w:color w:val="1F4D78"/>
     </w:rPr>
   </w:style>
-  <w:style w:type="character" w:default="1" w:styleId="DefaultParagraphFont">
+  <w:style w:type="character" w:styleId="DefaultParagraphFont" w:default="1">
     <w:name w:val="Default Paragraph Font"/>
     <w:uiPriority w:val="1"/>
     <w:unhideWhenUsed/>
   </w:style>
-  <w:style w:type="table" w:default="1" w:styleId="TableNormal">
+  <w:style w:type="table" w:styleId="TableNormal" w:default="1">
     <w:name w:val="Normal Table"/>
     <w:uiPriority w:val="99"/>
     <w:semiHidden/>
@@ -4503,7 +4571,7 @@
       </w:tblCellMar>
     </w:tblPr>
   </w:style>
-  <w:style w:type="numbering" w:default="1" w:styleId="NoList">
+  <w:style w:type="numbering" w:styleId="NoList" w:default="1">
     <w:name w:val="No List"/>
     <w:uiPriority w:val="99"/>
     <w:semiHidden/>
@@ -4518,7 +4586,7 @@
       <w:szCs w:val="56"/>
     </w:rPr>
   </w:style>
-  <w:style w:type="paragraph" w:customStyle="1" w:styleId="Strong1">
+  <w:style w:type="paragraph" w:styleId="Strong1" w:customStyle="1">
     <w:name w:val="Strong1"/>
     <w:qFormat/>
     <w:rPr>
@@ -4558,7 +4626,7 @@
       <w:spacing w:line="240" w:lineRule="auto"/>
     </w:pPr>
   </w:style>
-  <w:style w:type="character" w:customStyle="1" w:styleId="FootnoteTextChar">
+  <w:style w:type="character" w:styleId="FootnoteTextChar" w:customStyle="1">
     <w:name w:val="Footnote Text Char"/>
     <w:link w:val="FootnoteText"/>
     <w:uiPriority w:val="99"/>
@@ -4588,7 +4656,7 @@
       <w:spacing w:line="240" w:lineRule="auto"/>
     </w:pPr>
   </w:style>
-  <w:style w:type="character" w:customStyle="1" w:styleId="EndnoteTextChar">
+  <w:style w:type="character" w:styleId="EndnoteTextChar" w:customStyle="1">
     <w:name w:val="Endnote Text Char"/>
     <w:link w:val="EndnoteText"/>
     <w:uiPriority w:val="99"/>
@@ -4603,7 +4671,7 @@
 </file>
 
 <file path=word/theme/theme1.xml><?xml version="1.0" encoding="utf-8"?>
-<a:theme xmlns:a="http://schemas.openxmlformats.org/drawingml/2006/main" name="Office Theme">
+<a:theme xmlns:a="http://schemas.openxmlformats.org/drawingml/2006/main" xmlns:thm15="http://schemas.microsoft.com/office/thememl/2012/main" name="Office Theme">
   <a:themeElements>
     <a:clrScheme name="Office">
       <a:dk1>
@@ -4895,4 +4963,169 @@
     </a:ext>
   </a:extLst>
 </a:theme>
+</file>
+
+<file path=customXml/item1.xml><?xml version="1.0" encoding="utf-8"?>
+<ct:contentTypeSchema xmlns:ct="http://schemas.microsoft.com/office/2006/metadata/contentType" xmlns:ma="http://schemas.microsoft.com/office/2006/metadata/properties/metaAttributes" ct:_="" ma:_="" ma:contentTypeName="Document" ma:contentTypeID="0x010100E67418F6D82F9446BBBB62ECBA308767" ma:contentTypeVersion="3" ma:contentTypeDescription="Create a new document." ma:contentTypeScope="" ma:versionID="0c24c718502612e215a8f18b882dffef">
+  <xsd:schema xmlns:xsd="http://www.w3.org/2001/XMLSchema" xmlns:xs="http://www.w3.org/2001/XMLSchema" xmlns:p="http://schemas.microsoft.com/office/2006/metadata/properties" xmlns:ns2="4a11293a-5e7a-4a82-94b3-fac653d9ed95" targetNamespace="http://schemas.microsoft.com/office/2006/metadata/properties" ma:root="true" ma:fieldsID="60eaeb1368c1e63cdbe2535782e89c7c" ns2:_="">
+    <xsd:import namespace="4a11293a-5e7a-4a82-94b3-fac653d9ed95"/>
+    <xsd:element name="properties">
+      <xsd:complexType>
+        <xsd:sequence>
+          <xsd:element name="documentManagement">
+            <xsd:complexType>
+              <xsd:all>
+                <xsd:element ref="ns2:MediaServiceMetadata" minOccurs="0"/>
+                <xsd:element ref="ns2:MediaServiceFastMetadata" minOccurs="0"/>
+                <xsd:element ref="ns2:MediaServiceSearchProperties" minOccurs="0"/>
+              </xsd:all>
+            </xsd:complexType>
+          </xsd:element>
+        </xsd:sequence>
+      </xsd:complexType>
+    </xsd:element>
+  </xsd:schema>
+  <xsd:schema xmlns:xsd="http://www.w3.org/2001/XMLSchema" xmlns:xs="http://www.w3.org/2001/XMLSchema" xmlns:dms="http://schemas.microsoft.com/office/2006/documentManagement/types" xmlns:pc="http://schemas.microsoft.com/office/infopath/2007/PartnerControls" targetNamespace="4a11293a-5e7a-4a82-94b3-fac653d9ed95" elementFormDefault="qualified">
+    <xsd:import namespace="http://schemas.microsoft.com/office/2006/documentManagement/types"/>
+    <xsd:import namespace="http://schemas.microsoft.com/office/infopath/2007/PartnerControls"/>
+    <xsd:element name="MediaServiceMetadata" ma:index="8" nillable="true" ma:displayName="MediaServiceMetadata" ma:hidden="true" ma:internalName="MediaServiceMetadata" ma:readOnly="true">
+      <xsd:simpleType>
+        <xsd:restriction base="dms:Note"/>
+      </xsd:simpleType>
+    </xsd:element>
+    <xsd:element name="MediaServiceFastMetadata" ma:index="9" nillable="true" ma:displayName="MediaServiceFastMetadata" ma:hidden="true" ma:internalName="MediaServiceFastMetadata" ma:readOnly="true">
+      <xsd:simpleType>
+        <xsd:restriction base="dms:Note"/>
+      </xsd:simpleType>
+    </xsd:element>
+    <xsd:element name="MediaServiceSearchProperties" ma:index="10" nillable="true" ma:displayName="MediaServiceSearchProperties" ma:hidden="true" ma:internalName="MediaServiceSearchProperties" ma:readOnly="true">
+      <xsd:simpleType>
+        <xsd:restriction base="dms:Note"/>
+      </xsd:simpleType>
+    </xsd:element>
+  </xsd:schema>
+  <xsd:schema xmlns="http://schemas.openxmlformats.org/package/2006/metadata/core-properties" xmlns:xsd="http://www.w3.org/2001/XMLSchema" xmlns:xsi="http://www.w3.org/2001/XMLSchema-instance" xmlns:dc="http://purl.org/dc/elements/1.1/" xmlns:dcterms="http://purl.org/dc/terms/" xmlns:odoc="http://schemas.microsoft.com/internal/obd" targetNamespace="http://schemas.openxmlformats.org/package/2006/metadata/core-properties" elementFormDefault="qualified" attributeFormDefault="unqualified" blockDefault="#all">
+    <xsd:import namespace="http://purl.org/dc/elements/1.1/" schemaLocation="http://dublincore.org/schemas/xmls/qdc/2003/04/02/dc.xsd"/>
+    <xsd:import namespace="http://purl.org/dc/terms/" schemaLocation="http://dublincore.org/schemas/xmls/qdc/2003/04/02/dcterms.xsd"/>
+    <xsd:element name="coreProperties" type="CT_coreProperties"/>
+    <xsd:complexType name="CT_coreProperties">
+      <xsd:all>
+        <xsd:element ref="dc:creator" minOccurs="0" maxOccurs="1"/>
+        <xsd:element ref="dcterms:created" minOccurs="0" maxOccurs="1"/>
+        <xsd:element ref="dc:identifier" minOccurs="0" maxOccurs="1"/>
+        <xsd:element name="contentType" minOccurs="0" maxOccurs="1" type="xsd:string" ma:index="0" ma:displayName="Content Type"/>
+        <xsd:element ref="dc:title" minOccurs="0" maxOccurs="1" ma:index="4" ma:displayName="Title"/>
+        <xsd:element ref="dc:subject" minOccurs="0" maxOccurs="1"/>
+        <xsd:element ref="dc:description" minOccurs="0" maxOccurs="1"/>
+        <xsd:element name="keywords" minOccurs="0" maxOccurs="1" type="xsd:string"/>
+        <xsd:element ref="dc:language" minOccurs="0" maxOccurs="1"/>
+        <xsd:element name="category" minOccurs="0" maxOccurs="1" type="xsd:string"/>
+        <xsd:element name="version" minOccurs="0" maxOccurs="1" type="xsd:string"/>
+        <xsd:element name="revision" minOccurs="0" maxOccurs="1" type="xsd:string">
+          <xsd:annotation>
+            <xsd:documentation>
+                        This value indicates the number of saves or revisions. The application is responsible for updating this value after each revision.
+                    </xsd:documentation>
+          </xsd:annotation>
+        </xsd:element>
+        <xsd:element name="lastModifiedBy" minOccurs="0" maxOccurs="1" type="xsd:string"/>
+        <xsd:element ref="dcterms:modified" minOccurs="0" maxOccurs="1"/>
+        <xsd:element name="contentStatus" minOccurs="0" maxOccurs="1" type="xsd:string"/>
+      </xsd:all>
+    </xsd:complexType>
+  </xsd:schema>
+  <xs:schema xmlns:pc="http://schemas.microsoft.com/office/infopath/2007/PartnerControls" xmlns:xs="http://www.w3.org/2001/XMLSchema" targetNamespace="http://schemas.microsoft.com/office/infopath/2007/PartnerControls" elementFormDefault="qualified" attributeFormDefault="unqualified">
+    <xs:element name="Person">
+      <xs:complexType>
+        <xs:sequence>
+          <xs:element ref="pc:DisplayName" minOccurs="0"/>
+          <xs:element ref="pc:AccountId" minOccurs="0"/>
+          <xs:element ref="pc:AccountType" minOccurs="0"/>
+        </xs:sequence>
+      </xs:complexType>
+    </xs:element>
+    <xs:element name="DisplayName" type="xs:string"/>
+    <xs:element name="AccountId" type="xs:string"/>
+    <xs:element name="AccountType" type="xs:string"/>
+    <xs:element name="BDCAssociatedEntity">
+      <xs:complexType>
+        <xs:sequence>
+          <xs:element ref="pc:BDCEntity" minOccurs="0" maxOccurs="unbounded"/>
+        </xs:sequence>
+        <xs:attribute ref="pc:EntityNamespace"/>
+        <xs:attribute ref="pc:EntityName"/>
+        <xs:attribute ref="pc:SystemInstanceName"/>
+        <xs:attribute ref="pc:AssociationName"/>
+      </xs:complexType>
+    </xs:element>
+    <xs:attribute name="EntityNamespace" type="xs:string"/>
+    <xs:attribute name="EntityName" type="xs:string"/>
+    <xs:attribute name="SystemInstanceName" type="xs:string"/>
+    <xs:attribute name="AssociationName" type="xs:string"/>
+    <xs:element name="BDCEntity">
+      <xs:complexType>
+        <xs:sequence>
+          <xs:element ref="pc:EntityDisplayName" minOccurs="0"/>
+          <xs:element ref="pc:EntityInstanceReference" minOccurs="0"/>
+          <xs:element ref="pc:EntityId1" minOccurs="0"/>
+          <xs:element ref="pc:EntityId2" minOccurs="0"/>
+          <xs:element ref="pc:EntityId3" minOccurs="0"/>
+          <xs:element ref="pc:EntityId4" minOccurs="0"/>
+          <xs:element ref="pc:EntityId5" minOccurs="0"/>
+        </xs:sequence>
+      </xs:complexType>
+    </xs:element>
+    <xs:element name="EntityDisplayName" type="xs:string"/>
+    <xs:element name="EntityInstanceReference" type="xs:string"/>
+    <xs:element name="EntityId1" type="xs:string"/>
+    <xs:element name="EntityId2" type="xs:string"/>
+    <xs:element name="EntityId3" type="xs:string"/>
+    <xs:element name="EntityId4" type="xs:string"/>
+    <xs:element name="EntityId5" type="xs:string"/>
+    <xs:element name="Terms">
+      <xs:complexType>
+        <xs:sequence>
+          <xs:element ref="pc:TermInfo" minOccurs="0" maxOccurs="unbounded"/>
+        </xs:sequence>
+      </xs:complexType>
+    </xs:element>
+    <xs:element name="TermInfo">
+      <xs:complexType>
+        <xs:sequence>
+          <xs:element ref="pc:TermName" minOccurs="0"/>
+          <xs:element ref="pc:TermId" minOccurs="0"/>
+        </xs:sequence>
+      </xs:complexType>
+    </xs:element>
+    <xs:element name="TermName" type="xs:string"/>
+    <xs:element name="TermId" type="xs:string"/>
+  </xs:schema>
+</ct:contentTypeSchema>
+</file>
+
+<file path=customXml/item2.xml><?xml version="1.0" encoding="utf-8"?>
+<?mso-contentType ?>
+<FormTemplates xmlns="http://schemas.microsoft.com/sharepoint/v3/contenttype/forms">
+  <Display>DocumentLibraryForm</Display>
+  <Edit>DocumentLibraryForm</Edit>
+  <New>DocumentLibraryForm</New>
+</FormTemplates>
+</file>
+
+<file path=customXml/item3.xml><?xml version="1.0" encoding="utf-8"?>
+<p:properties xmlns:p="http://schemas.microsoft.com/office/2006/metadata/properties" xmlns:xsi="http://www.w3.org/2001/XMLSchema-instance" xmlns:pc="http://schemas.microsoft.com/office/infopath/2007/PartnerControls">
+  <documentManagement/>
+</p:properties>
+</file>
+
+<file path=customXml/itemProps1.xml><?xml version="1.0" encoding="utf-8"?>
+<ds:datastoreItem xmlns:ds="http://schemas.openxmlformats.org/officeDocument/2006/customXml" ds:itemID="{FF8F691C-9350-41DE-90C7-FF5280D81F93}"/>
+</file>
+
+<file path=customXml/itemProps2.xml><?xml version="1.0" encoding="utf-8"?>
+<ds:datastoreItem xmlns:ds="http://schemas.openxmlformats.org/officeDocument/2006/customXml" ds:itemID="{28851B26-D4B2-4E52-B1E0-CFA6798F09CB}"/>
+</file>
+
+<file path=customXml/itemProps3.xml><?xml version="1.0" encoding="utf-8"?>
+<ds:datastoreItem xmlns:ds="http://schemas.openxmlformats.org/officeDocument/2006/customXml" ds:itemID="{A9B34E80-6370-45D3-AD7F-E3D63E65D44E}"/>
 </file>
</xml_diff>

<commit_message>
feat: update grant templates to include currency units for clarity
</commit_message>
<xml_diff>
--- a/src/assets/files/revised-Annexure-VI_Tied_Grant_DUR_Template.docx
+++ b/src/assets/files/revised-Annexure-VI_Tied_Grant_DUR_Template.docx
@@ -1285,7 +1285,7 @@
             </w:tcMar>
             <w:vAlign w:val="center"/>
           </w:tcPr>
-          <w:p>
+          <w:p xmlns:wp14="http://schemas.microsoft.com/office/word/2010/wordml" wp14:textId="77777777">
             <w:pPr>
               <w:jc w:val="center"/>
             </w:pPr>
@@ -1318,7 +1318,7 @@
             </w:tcMar>
             <w:vAlign w:val="center"/>
           </w:tcPr>
-          <w:p>
+          <w:p xmlns:wp14="http://schemas.microsoft.com/office/word/2010/wordml" wp14:textId="77777777">
             <w:pPr>
               <w:jc w:val="center"/>
             </w:pPr>
@@ -2088,39 +2088,7 @@
           </w:tcPr>
           <w:p>
             <w:pPr>
-              <w:jc w:val="center"/>
-            </w:pPr>
-            <w:r>
-              <w:rPr>
-                <w:b/>
-                <w:bCs/>
-                <w:sz w:val="18"/>
-                <w:szCs w:val="18"/>
-              </w:rPr>
-              <w:t>Total amount &amp; % of tied grant utilised on SWM [   ]</w:t>
-            </w:r>
-          </w:p>
-        </w:tc>
-        <w:tc>
-          <w:tcPr>
-            <w:tcW w:w="1900" w:type="dxa"/>
-            <w:tcBorders>
-              <w:top w:val="single" w:color="808080" w:themeColor="background1" w:themeShade="80" w:sz="4" w:space="0"/>
-              <w:left w:val="single" w:color="808080" w:themeColor="background1" w:themeShade="80" w:sz="4" w:space="0"/>
-              <w:bottom w:val="single" w:color="808080" w:themeColor="background1" w:themeShade="80" w:sz="4" w:space="0"/>
-              <w:right w:val="single" w:color="808080" w:themeColor="background1" w:themeShade="80" w:sz="4" w:space="0"/>
-            </w:tcBorders>
-            <w:shd w:val="clear" w:color="auto" w:fill="DDEBF7"/>
-            <w:tcMar>
-              <w:top w:w="60" w:type="dxa"/>
-              <w:left w:w="80" w:type="dxa"/>
-              <w:bottom w:w="60" w:type="dxa"/>
-              <w:right w:w="80" w:type="dxa"/>
-            </w:tcMar>
-            <w:vAlign w:val="center"/>
-          </w:tcPr>
-          <w:p>
-            <w:pPr>
+              <w:pStyle w:val="Normal"/>
               <w:jc w:val="center"/>
             </w:pPr>
             <w:r>
@@ -2130,6 +2098,57 @@
                 <w:sz w:val="18"/>
                 <w:szCs w:val="18"/>
               </w:rPr>
+              <w:t>Total amount &amp; % of tied grant utilised on SWM [   ]</w:t>
+            </w:r>
+            <w:r>
+              <w:rPr>
+                <w:b w:val="1"/>
+                <w:bCs w:val="1"/>
+                <w:sz w:val="18"/>
+                <w:szCs w:val="18"/>
+              </w:rPr>
+              <w:t xml:space="preserve"> </w:t>
+            </w:r>
+            <w:r>
+              <w:rPr>
+                <w:b w:val="1"/>
+                <w:bCs w:val="1"/>
+                <w:sz w:val="18"/>
+                <w:szCs w:val="18"/>
+              </w:rPr>
+              <w:t>(Rs. in lakh)</w:t>
+            </w:r>
+          </w:p>
+        </w:tc>
+        <w:tc>
+          <w:tcPr>
+            <w:tcW w:w="1900" w:type="dxa"/>
+            <w:tcBorders>
+              <w:top w:val="single" w:color="808080" w:themeColor="background1" w:themeShade="80" w:sz="4" w:space="0"/>
+              <w:left w:val="single" w:color="808080" w:themeColor="background1" w:themeShade="80" w:sz="4" w:space="0"/>
+              <w:bottom w:val="single" w:color="808080" w:themeColor="background1" w:themeShade="80" w:sz="4" w:space="0"/>
+              <w:right w:val="single" w:color="808080" w:themeColor="background1" w:themeShade="80" w:sz="4" w:space="0"/>
+            </w:tcBorders>
+            <w:shd w:val="clear" w:color="auto" w:fill="DDEBF7"/>
+            <w:tcMar>
+              <w:top w:w="60" w:type="dxa"/>
+              <w:left w:w="80" w:type="dxa"/>
+              <w:bottom w:w="60" w:type="dxa"/>
+              <w:right w:w="80" w:type="dxa"/>
+            </w:tcMar>
+            <w:vAlign w:val="center"/>
+          </w:tcPr>
+          <w:p xmlns:wp14="http://schemas.microsoft.com/office/word/2010/wordml" wp14:textId="77777777">
+            <w:pPr>
+              <w:jc w:val="center"/>
+            </w:pPr>
+            <w:r>
+              <w:rPr>
+                <w:b w:val="1"/>
+                <w:bCs w:val="1"/>
+                <w:sz w:val="18"/>
+                <w:szCs w:val="18"/>
+              </w:rPr>
               <w:t>No. of projects undertaken</w:t>
             </w:r>
           </w:p>
@@ -2152,7 +2171,7 @@
             </w:tcMar>
             <w:vAlign w:val="center"/>
           </w:tcPr>
-          <w:p>
+          <w:p xmlns:wp14="http://schemas.microsoft.com/office/word/2010/wordml" wp14:textId="77777777">
             <w:pPr>
               <w:jc w:val="center"/>
             </w:pPr>
@@ -2786,39 +2805,7 @@
           </w:tcPr>
           <w:p>
             <w:pPr>
-              <w:jc w:val="center"/>
-            </w:pPr>
-            <w:r>
-              <w:rPr>
-                <w:b/>
-                <w:bCs/>
-                <w:sz w:val="18"/>
-                <w:szCs w:val="18"/>
-              </w:rPr>
-              <w:t>Total Project Cost</w:t>
-            </w:r>
-          </w:p>
-        </w:tc>
-        <w:tc>
-          <w:tcPr>
-            <w:tcW w:w="1140" w:type="dxa"/>
-            <w:tcBorders>
-              <w:top w:val="single" w:color="808080" w:themeColor="background1" w:themeShade="80" w:sz="4" w:space="0"/>
-              <w:left w:val="single" w:color="808080" w:themeColor="background1" w:themeShade="80" w:sz="4" w:space="0"/>
-              <w:bottom w:val="single" w:color="808080" w:themeColor="background1" w:themeShade="80" w:sz="4" w:space="0"/>
-              <w:right w:val="single" w:color="808080" w:themeColor="background1" w:themeShade="80" w:sz="4" w:space="0"/>
-            </w:tcBorders>
-            <w:shd w:val="clear" w:color="auto" w:fill="DDEBF7"/>
-            <w:tcMar>
-              <w:top w:w="60" w:type="dxa"/>
-              <w:left w:w="80" w:type="dxa"/>
-              <w:bottom w:w="60" w:type="dxa"/>
-              <w:right w:w="80" w:type="dxa"/>
-            </w:tcMar>
-            <w:vAlign w:val="center"/>
-          </w:tcPr>
-          <w:p>
-            <w:pPr>
+              <w:pStyle w:val="Normal"/>
               <w:jc w:val="center"/>
             </w:pPr>
             <w:r>
@@ -2828,7 +2815,77 @@
                 <w:sz w:val="18"/>
                 <w:szCs w:val="18"/>
               </w:rPr>
+              <w:t>Total Project Cost</w:t>
+            </w:r>
+            <w:r>
+              <w:rPr>
+                <w:b w:val="1"/>
+                <w:bCs w:val="1"/>
+                <w:sz w:val="18"/>
+                <w:szCs w:val="18"/>
+              </w:rPr>
+              <w:t xml:space="preserve"> </w:t>
+            </w:r>
+            <w:r>
+              <w:rPr>
+                <w:b w:val="1"/>
+                <w:bCs w:val="1"/>
+                <w:sz w:val="18"/>
+                <w:szCs w:val="18"/>
+              </w:rPr>
+              <w:t>(Rs. in lakh)</w:t>
+            </w:r>
+          </w:p>
+        </w:tc>
+        <w:tc>
+          <w:tcPr>
+            <w:tcW w:w="1140" w:type="dxa"/>
+            <w:tcBorders>
+              <w:top w:val="single" w:color="808080" w:themeColor="background1" w:themeShade="80" w:sz="4" w:space="0"/>
+              <w:left w:val="single" w:color="808080" w:themeColor="background1" w:themeShade="80" w:sz="4" w:space="0"/>
+              <w:bottom w:val="single" w:color="808080" w:themeColor="background1" w:themeShade="80" w:sz="4" w:space="0"/>
+              <w:right w:val="single" w:color="808080" w:themeColor="background1" w:themeShade="80" w:sz="4" w:space="0"/>
+            </w:tcBorders>
+            <w:shd w:val="clear" w:color="auto" w:fill="DDEBF7"/>
+            <w:tcMar>
+              <w:top w:w="60" w:type="dxa"/>
+              <w:left w:w="80" w:type="dxa"/>
+              <w:bottom w:w="60" w:type="dxa"/>
+              <w:right w:w="80" w:type="dxa"/>
+            </w:tcMar>
+            <w:vAlign w:val="center"/>
+          </w:tcPr>
+          <w:p xmlns:wp14="http://schemas.microsoft.com/office/word/2010/wordml" wp14:textId="5BFE778E">
+            <w:pPr>
+              <w:pStyle w:val="Normal"/>
+              <w:jc w:val="center"/>
+            </w:pPr>
+            <w:r>
+              <w:rPr>
+                <w:b w:val="1"/>
+                <w:bCs w:val="1"/>
+                <w:sz w:val="18"/>
+                <w:szCs w:val="18"/>
+              </w:rPr>
               <w:t>Expenditure incurred out of total FC Grant</w:t>
+            </w:r>
+            <w:r>
+              <w:rPr>
+                <w:b w:val="1"/>
+                <w:bCs w:val="1"/>
+                <w:sz w:val="18"/>
+                <w:szCs w:val="18"/>
+              </w:rPr>
+              <w:t xml:space="preserve"> </w:t>
+            </w:r>
+            <w:r>
+              <w:rPr>
+                <w:b w:val="1"/>
+                <w:bCs w:val="1"/>
+                <w:sz w:val="18"/>
+                <w:szCs w:val="18"/>
+              </w:rPr>
+              <w:t>(Rs. in lakh)</w:t>
             </w:r>
           </w:p>
         </w:tc>
@@ -2850,8 +2907,9 @@
             </w:tcMar>
             <w:vAlign w:val="center"/>
           </w:tcPr>
-          <w:p>
-            <w:pPr>
+          <w:p xmlns:wp14="http://schemas.microsoft.com/office/word/2010/wordml" wp14:textId="5CA22D41">
+            <w:pPr>
+              <w:pStyle w:val="Normal"/>
               <w:jc w:val="center"/>
             </w:pPr>
             <w:r>
@@ -3080,7 +3138,7 @@
             </w:tcMar>
             <w:vAlign w:val="center"/>
           </w:tcPr>
-          <w:p/>
+          <w:p xmlns:wp14="http://schemas.microsoft.com/office/word/2010/wordml" wp14:textId="77777777"/>
         </w:tc>
         <w:tc>
           <w:tcPr>
@@ -3099,7 +3157,7 @@
             </w:tcMar>
             <w:vAlign w:val="center"/>
           </w:tcPr>
-          <w:p/>
+          <w:p xmlns:wp14="http://schemas.microsoft.com/office/word/2010/wordml" wp14:textId="77777777"/>
         </w:tc>
         <w:tc>
           <w:tcPr>
@@ -3273,7 +3331,7 @@
             </w:tcMar>
             <w:vAlign w:val="center"/>
           </w:tcPr>
-          <w:p/>
+          <w:p xmlns:wp14="http://schemas.microsoft.com/office/word/2010/wordml" wp14:textId="77777777"/>
         </w:tc>
         <w:tc>
           <w:tcPr>
@@ -3292,7 +3350,7 @@
             </w:tcMar>
             <w:vAlign w:val="center"/>
           </w:tcPr>
-          <w:p/>
+          <w:p xmlns:wp14="http://schemas.microsoft.com/office/word/2010/wordml" wp14:textId="77777777"/>
         </w:tc>
         <w:tc>
           <w:tcPr>
@@ -3466,7 +3524,7 @@
             </w:tcMar>
             <w:vAlign w:val="center"/>
           </w:tcPr>
-          <w:p/>
+          <w:p xmlns:wp14="http://schemas.microsoft.com/office/word/2010/wordml" wp14:textId="77777777"/>
         </w:tc>
         <w:tc>
           <w:tcPr>
@@ -3485,7 +3543,7 @@
             </w:tcMar>
             <w:vAlign w:val="center"/>
           </w:tcPr>
-          <w:p/>
+          <w:p xmlns:wp14="http://schemas.microsoft.com/office/word/2010/wordml" wp14:textId="77777777"/>
         </w:tc>
         <w:tc>
           <w:tcPr>
@@ -3659,7 +3717,7 @@
             </w:tcMar>
             <w:vAlign w:val="center"/>
           </w:tcPr>
-          <w:p/>
+          <w:p xmlns:wp14="http://schemas.microsoft.com/office/word/2010/wordml" wp14:textId="77777777"/>
         </w:tc>
         <w:tc>
           <w:tcPr>
@@ -3678,7 +3736,7 @@
             </w:tcMar>
             <w:vAlign w:val="center"/>
           </w:tcPr>
-          <w:p/>
+          <w:p xmlns:wp14="http://schemas.microsoft.com/office/word/2010/wordml" wp14:textId="77777777"/>
         </w:tc>
         <w:tc>
           <w:tcPr>
@@ -3852,7 +3910,7 @@
             </w:tcMar>
             <w:vAlign w:val="center"/>
           </w:tcPr>
-          <w:p/>
+          <w:p xmlns:wp14="http://schemas.microsoft.com/office/word/2010/wordml" wp14:textId="77777777"/>
         </w:tc>
         <w:tc>
           <w:tcPr>
@@ -3871,7 +3929,7 @@
             </w:tcMar>
             <w:vAlign w:val="center"/>
           </w:tcPr>
-          <w:p/>
+          <w:p xmlns:wp14="http://schemas.microsoft.com/office/word/2010/wordml" wp14:textId="77777777"/>
         </w:tc>
         <w:tc>
           <w:tcPr>

</xml_diff>

<commit_message>
fix: enhance manual review history to support form type filtering and improve document labeling
</commit_message>
<xml_diff>
--- a/src/assets/files/revised-Annexure-VI_Tied_Grant_DUR_Template.docx
+++ b/src/assets/files/revised-Annexure-VI_Tied_Grant_DUR_Template.docx
@@ -5,39 +5,53 @@
     <w:p>
       <w:pPr>
         <w:spacing w:after="240"/>
-        <w:rPr>
-          <w:color w:val="000000" w:themeColor="text1"/>
-        </w:rPr>
       </w:pPr>
       <w:r>
         <w:rPr>
-          <w:b/>
-          <w:bCs/>
-          <w:color w:val="000000" w:themeColor="text1"/>
+          <w:b w:val="1"/>
+          <w:bCs w:val="1"/>
+          <w:color w:val="000000" w:themeColor="text1" w:themeTint="FF" w:themeShade="FF"/>
           <w:sz w:val="24"/>
           <w:szCs w:val="24"/>
         </w:rPr>
         <w:t>16th Finance Commission - FY 2026-27</w:t>
       </w:r>
       <w:r>
-        <w:rPr>
-          <w:b/>
-          <w:bCs/>
-          <w:color w:val="000000" w:themeColor="text1"/>
-          <w:sz w:val="24"/>
-          <w:szCs w:val="24"/>
-        </w:rPr>
         <w:br/>
       </w:r>
       <w:r>
         <w:rPr>
-          <w:b/>
-          <w:bCs/>
-          <w:color w:val="000000" w:themeColor="text1"/>
+          <w:b w:val="1"/>
+          <w:bCs w:val="1"/>
+          <w:color w:val="000000" w:themeColor="text1" w:themeTint="FF" w:themeShade="FF"/>
           <w:sz w:val="24"/>
           <w:szCs w:val="24"/>
         </w:rPr>
-        <w:t>DUR for tied grants received in FY 2025-26 - the final year of the 15th Finance Commission award period</w:t>
+        <w:t>DUR for tied grants in FY 2025-26 - the final year of the 15th Finance Commission award period</w:t>
+      </w:r>
+    </w:p>
+    <w:p>
+      <w:pPr>
+        <w:spacing w:before="210" w:beforeAutospacing="off" w:after="210" w:afterAutospacing="off"/>
+        <w:rPr>
+          <w:rFonts w:ascii="Calibri" w:hAnsi="Calibri" w:eastAsia="Calibri" w:cs="Calibri" w:asciiTheme="minorAscii" w:hAnsiTheme="minorAscii" w:eastAsiaTheme="minorAscii" w:cstheme="minorAscii"/>
+          <w:noProof w:val="0"/>
+          <w:color w:val="ED7D31" w:themeColor="accent2" w:themeTint="FF" w:themeShade="FF"/>
+          <w:sz w:val="21"/>
+          <w:szCs w:val="21"/>
+          <w:lang w:val="en-IN"/>
+        </w:rPr>
+      </w:pPr>
+      <w:r>
+        <w:rPr>
+          <w:rFonts w:ascii="Calibri" w:hAnsi="Calibri" w:eastAsia="Calibri" w:cs="Calibri" w:asciiTheme="minorAscii" w:hAnsiTheme="minorAscii" w:eastAsiaTheme="minorAscii" w:cstheme="minorAscii"/>
+          <w:noProof w:val="0"/>
+          <w:color w:val="ED7D31" w:themeColor="accent2" w:themeTint="FF" w:themeShade="FF"/>
+          <w:sz w:val="21"/>
+          <w:szCs w:val="21"/>
+          <w:lang w:val="en-IN"/>
+        </w:rPr>
+        <w:t>Note: The expenditure incurred during FY 2025–26 must be entered. In case a ULB did not receive any grants during FY 2025–26, the expenditure incurred from the unutilized grants of previous years must be reported.</w:t>
       </w:r>
     </w:p>
     <w:tbl>
@@ -93,7 +107,7 @@
           <w:tcPr>
             <w:tcW w:w="8266" w:type="dxa"/>
             <w:tcBorders>
-              <w:bottom w:val="single" w:color="000000" w:sz="4" w:space="0"/>
+              <w:bottom w:val="single" w:color="000000" w:themeColor="text1" w:sz="4" w:space="0"/>
             </w:tcBorders>
             <w:tcMar>
               <w:top w:w="40" w:type="dxa"/>
@@ -164,7 +178,7 @@
           <w:tcPr>
             <w:tcW w:w="8266" w:type="dxa"/>
             <w:tcBorders>
-              <w:bottom w:val="single" w:color="000000" w:sz="4" w:space="0"/>
+              <w:bottom w:val="single" w:color="000000" w:themeColor="text1" w:sz="4" w:space="0"/>
             </w:tcBorders>
             <w:tcMar>
               <w:top w:w="40" w:type="dxa"/>

</xml_diff>